<commit_message>
docs: actualizar evidencia de QA de roles
</commit_message>
<xml_diff>
--- a/docs/qa-roles/QA-Roles-1-Destacamento.docx
+++ b/docs/qa-roles/QA-Roles-1-Destacamento.docx
@@ -1,6 +1,6 @@
 
 <file path=word/document.xml><?xml version="1.0" encoding="utf-8"?>
-<w:document xmlns:wpc="http://schemas.microsoft.com/office/word/2010/wordprocessingCanvas" xmlns:cx="http://schemas.microsoft.com/office/drawing/2014/chartex" xmlns:cx1="http://schemas.microsoft.com/office/drawing/2015/9/8/chartex" xmlns:cx2="http://schemas.microsoft.com/office/drawing/2015/10/21/chartex" xmlns:cx3="http://schemas.microsoft.com/office/drawing/2016/5/9/chartex" xmlns:cx4="http://schemas.microsoft.com/office/drawing/2016/5/10/chartex" xmlns:cx5="http://schemas.microsoft.com/office/drawing/2016/5/11/chartex" xmlns:cx6="http://schemas.microsoft.com/office/drawing/2016/5/12/chartex" xmlns:cx7="http://schemas.microsoft.com/office/drawing/2016/5/13/chartex" xmlns:cx8="http://schemas.microsoft.com/office/drawing/2016/5/14/chartex" xmlns:mc="http://schemas.openxmlformats.org/markup-compatibility/2006" xmlns:aink="http://schemas.microsoft.com/office/drawing/2016/ink" xmlns:am3d="http://schemas.microsoft.com/office/drawing/2017/model3d" xmlns:o="urn:schemas-microsoft-com:office:office" xmlns:r="http://schemas.openxmlformats.org/officeDocument/2006/relationships" xmlns:m="http://schemas.openxmlformats.org/officeDocument/2006/math" xmlns:v="urn:schemas-microsoft-com:vml" xmlns:wp14="http://schemas.microsoft.com/office/word/2010/wordprocessingDrawing" xmlns:wp="http://schemas.openxmlformats.org/drawingml/2006/wordprocessingDrawing" xmlns:w10="urn:schemas-microsoft-com:office:word" xmlns:w="http://schemas.openxmlformats.org/wordprocessingml/2006/main" xmlns:w14="http://schemas.microsoft.com/office/word/2010/wordml" xmlns:w15="http://schemas.microsoft.com/office/word/2012/wordml" xmlns:w16cex="http://schemas.microsoft.com/office/word/2018/wordml/cex" xmlns:w16cid="http://schemas.microsoft.com/office/word/2016/wordml/cid" xmlns:w16="http://schemas.microsoft.com/office/word/2018/wordml" xmlns:w16sdtdh="http://schemas.microsoft.com/office/word/2020/wordml/sdtdatahash" xmlns:w16se="http://schemas.microsoft.com/office/word/2015/wordml/symex" xmlns:wpg="http://schemas.microsoft.com/office/word/2010/wordprocessingGroup" xmlns:wpi="http://schemas.microsoft.com/office/word/2010/wordprocessingInk" xmlns:wne="http://schemas.microsoft.com/office/word/2006/wordml" xmlns:wps="http://schemas.microsoft.com/office/word/2010/wordprocessingShape" mc:Ignorable="w14 w15 w16se w16cid w16 w16cex w16sdtdh wp14">
+<w:document xmlns:wpc="http://schemas.microsoft.com/office/word/2010/wordprocessingCanvas" xmlns:cx="http://schemas.microsoft.com/office/drawing/2014/chartex" xmlns:cx1="http://schemas.microsoft.com/office/drawing/2015/9/8/chartex" xmlns:cx2="http://schemas.microsoft.com/office/drawing/2015/10/21/chartex" xmlns:cx3="http://schemas.microsoft.com/office/drawing/2016/5/9/chartex" xmlns:cx4="http://schemas.microsoft.com/office/drawing/2016/5/10/chartex" xmlns:cx5="http://schemas.microsoft.com/office/drawing/2016/5/11/chartex" xmlns:cx6="http://schemas.microsoft.com/office/drawing/2016/5/12/chartex" xmlns:cx7="http://schemas.microsoft.com/office/drawing/2016/5/13/chartex" xmlns:cx8="http://schemas.microsoft.com/office/drawing/2016/5/14/chartex" xmlns:mc="http://schemas.openxmlformats.org/markup-compatibility/2006" xmlns:aink="http://schemas.microsoft.com/office/drawing/2016/ink" xmlns:am3d="http://schemas.microsoft.com/office/drawing/2017/model3d" xmlns:o="urn:schemas-microsoft-com:office:office" xmlns:oel="http://schemas.microsoft.com/office/2019/extlst" xmlns:r="http://schemas.openxmlformats.org/officeDocument/2006/relationships" xmlns:m="http://schemas.openxmlformats.org/officeDocument/2006/math" xmlns:v="urn:schemas-microsoft-com:vml" xmlns:wp14="http://schemas.microsoft.com/office/word/2010/wordprocessingDrawing" xmlns:wp="http://schemas.openxmlformats.org/drawingml/2006/wordprocessingDrawing" xmlns:w10="urn:schemas-microsoft-com:office:word" xmlns:w="http://schemas.openxmlformats.org/wordprocessingml/2006/main" xmlns:w14="http://schemas.microsoft.com/office/word/2010/wordml" xmlns:w15="http://schemas.microsoft.com/office/word/2012/wordml" xmlns:w16cex="http://schemas.microsoft.com/office/word/2018/wordml/cex" xmlns:w16cid="http://schemas.microsoft.com/office/word/2016/wordml/cid" xmlns:w16="http://schemas.microsoft.com/office/word/2018/wordml" xmlns:w16sdtdh="http://schemas.microsoft.com/office/word/2020/wordml/sdtdatahash" xmlns:w16se="http://schemas.microsoft.com/office/word/2015/wordml/symex" xmlns:wpg="http://schemas.microsoft.com/office/word/2010/wordprocessingGroup" xmlns:wpi="http://schemas.microsoft.com/office/word/2010/wordprocessingInk" xmlns:wne="http://schemas.microsoft.com/office/word/2006/wordml" xmlns:wps="http://schemas.microsoft.com/office/word/2010/wordprocessingShape" mc:Ignorable="w14 w15 w16se w16cid w16 w16cex w16sdtdh wp14">
   <w:body>
     <w:p>
       <w:pPr>
@@ -215,10 +215,7 @@
         <w:t>alcance</w:t>
       </w:r>
       <w:r>
-        <w:t xml:space="preserve"> (que dato</w:t>
-      </w:r>
-      <w:r>
-        <w:t>s ve) y luego cada capacidad (que puede hacer).</w:t>
+        <w:t xml:space="preserve"> (que datos ve) y luego cada capacidad (que puede hacer).</w:t>
       </w:r>
     </w:p>
     <w:p>
@@ -294,10 +291,7 @@
         <w:spacing w:after="60"/>
       </w:pPr>
       <w:r>
-        <w:t>El "Coordinador" real de cada destacamento (ti</w:t>
-      </w:r>
-      <w:r>
-        <w:t xml:space="preserve">tular y asistente) se determina por la </w:t>
+        <w:t xml:space="preserve">El "Coordinador" real de cada destacamento (titular y asistente) se determina por la </w:t>
       </w:r>
       <w:r>
         <w:rPr>
@@ -336,10 +330,7 @@
         <w:spacing w:after="60"/>
       </w:pPr>
       <w:r>
-        <w:t xml:space="preserve">El Coordinador Titular y el Asistente </w:t>
-      </w:r>
-      <w:r>
-        <w:t xml:space="preserve">son </w:t>
+        <w:t xml:space="preserve">El Coordinador Titular y el Asistente son </w:t>
       </w:r>
       <w:proofErr w:type="spellStart"/>
       <w:r>
@@ -448,12 +439,6 @@
         <w:gridCol w:w="979"/>
       </w:tblGrid>
       <w:tr>
-        <w:tblPrEx>
-          <w:tblCellMar>
-            <w:top w:w="0" w:type="dxa"/>
-            <w:bottom w:w="0" w:type="dxa"/>
-          </w:tblCellMar>
-        </w:tblPrEx>
         <w:trPr>
           <w:tblHeader/>
         </w:trPr>
@@ -764,12 +749,6 @@
         </w:tc>
       </w:tr>
       <w:tr>
-        <w:tblPrEx>
-          <w:tblCellMar>
-            <w:top w:w="0" w:type="dxa"/>
-            <w:bottom w:w="0" w:type="dxa"/>
-          </w:tblCellMar>
-        </w:tblPrEx>
         <w:tc>
           <w:tcPr>
             <w:tcW w:w="2400" w:type="dxa"/>
@@ -998,12 +977,6 @@
         </w:tc>
       </w:tr>
       <w:tr>
-        <w:tblPrEx>
-          <w:tblCellMar>
-            <w:top w:w="0" w:type="dxa"/>
-            <w:bottom w:w="0" w:type="dxa"/>
-          </w:tblCellMar>
-        </w:tblPrEx>
         <w:tc>
           <w:tcPr>
             <w:tcW w:w="2400" w:type="dxa"/>
@@ -1209,12 +1182,6 @@
         </w:tc>
       </w:tr>
       <w:tr>
-        <w:tblPrEx>
-          <w:tblCellMar>
-            <w:top w:w="0" w:type="dxa"/>
-            <w:bottom w:w="0" w:type="dxa"/>
-          </w:tblCellMar>
-        </w:tblPrEx>
         <w:tc>
           <w:tcPr>
             <w:tcW w:w="2400" w:type="dxa"/>
@@ -1413,12 +1380,6 @@
         </w:tc>
       </w:tr>
       <w:tr>
-        <w:tblPrEx>
-          <w:tblCellMar>
-            <w:top w:w="0" w:type="dxa"/>
-            <w:bottom w:w="0" w:type="dxa"/>
-          </w:tblCellMar>
-        </w:tblPrEx>
         <w:tc>
           <w:tcPr>
             <w:tcW w:w="2400" w:type="dxa"/>
@@ -1621,12 +1582,6 @@
         </w:tc>
       </w:tr>
       <w:tr>
-        <w:tblPrEx>
-          <w:tblCellMar>
-            <w:top w:w="0" w:type="dxa"/>
-            <w:bottom w:w="0" w:type="dxa"/>
-          </w:tblCellMar>
-        </w:tblPrEx>
         <w:tc>
           <w:tcPr>
             <w:tcW w:w="2400" w:type="dxa"/>
@@ -1822,12 +1777,6 @@
         </w:tc>
       </w:tr>
       <w:tr>
-        <w:tblPrEx>
-          <w:tblCellMar>
-            <w:top w:w="0" w:type="dxa"/>
-            <w:bottom w:w="0" w:type="dxa"/>
-          </w:tblCellMar>
-        </w:tblPrEx>
         <w:tc>
           <w:tcPr>
             <w:tcW w:w="2400" w:type="dxa"/>
@@ -2029,12 +1978,6 @@
         </w:tc>
       </w:tr>
       <w:tr>
-        <w:tblPrEx>
-          <w:tblCellMar>
-            <w:top w:w="0" w:type="dxa"/>
-            <w:bottom w:w="0" w:type="dxa"/>
-          </w:tblCellMar>
-        </w:tblPrEx>
         <w:tc>
           <w:tcPr>
             <w:tcW w:w="2400" w:type="dxa"/>
@@ -2251,12 +2194,6 @@
         </w:tc>
       </w:tr>
       <w:tr>
-        <w:tblPrEx>
-          <w:tblCellMar>
-            <w:top w:w="0" w:type="dxa"/>
-            <w:bottom w:w="0" w:type="dxa"/>
-          </w:tblCellMar>
-        </w:tblPrEx>
         <w:tc>
           <w:tcPr>
             <w:tcW w:w="2400" w:type="dxa"/>
@@ -2450,12 +2387,6 @@
         </w:tc>
       </w:tr>
       <w:tr>
-        <w:tblPrEx>
-          <w:tblCellMar>
-            <w:top w:w="0" w:type="dxa"/>
-            <w:bottom w:w="0" w:type="dxa"/>
-          </w:tblCellMar>
-        </w:tblPrEx>
         <w:tc>
           <w:tcPr>
             <w:tcW w:w="2400" w:type="dxa"/>
@@ -2644,12 +2575,6 @@
         </w:tc>
       </w:tr>
       <w:tr>
-        <w:tblPrEx>
-          <w:tblCellMar>
-            <w:top w:w="0" w:type="dxa"/>
-            <w:bottom w:w="0" w:type="dxa"/>
-          </w:tblCellMar>
-        </w:tblPrEx>
         <w:tc>
           <w:tcPr>
             <w:tcW w:w="2400" w:type="dxa"/>
@@ -2860,12 +2785,6 @@
         </w:tc>
       </w:tr>
       <w:tr>
-        <w:tblPrEx>
-          <w:tblCellMar>
-            <w:top w:w="0" w:type="dxa"/>
-            <w:bottom w:w="0" w:type="dxa"/>
-          </w:tblCellMar>
-        </w:tblPrEx>
         <w:tc>
           <w:tcPr>
             <w:tcW w:w="2400" w:type="dxa"/>
@@ -3058,12 +2977,6 @@
         </w:tc>
       </w:tr>
       <w:tr>
-        <w:tblPrEx>
-          <w:tblCellMar>
-            <w:top w:w="0" w:type="dxa"/>
-            <w:bottom w:w="0" w:type="dxa"/>
-          </w:tblCellMar>
-        </w:tblPrEx>
         <w:tc>
           <w:tcPr>
             <w:tcW w:w="2400" w:type="dxa"/>
@@ -3260,12 +3173,6 @@
         </w:tc>
       </w:tr>
       <w:tr>
-        <w:tblPrEx>
-          <w:tblCellMar>
-            <w:top w:w="0" w:type="dxa"/>
-            <w:bottom w:w="0" w:type="dxa"/>
-          </w:tblCellMar>
-        </w:tblPrEx>
         <w:tc>
           <w:tcPr>
             <w:tcW w:w="2400" w:type="dxa"/>
@@ -3459,12 +3366,6 @@
         </w:tc>
       </w:tr>
       <w:tr>
-        <w:tblPrEx>
-          <w:tblCellMar>
-            <w:top w:w="0" w:type="dxa"/>
-            <w:bottom w:w="0" w:type="dxa"/>
-          </w:tblCellMar>
-        </w:tblPrEx>
         <w:tc>
           <w:tcPr>
             <w:tcW w:w="2400" w:type="dxa"/>
@@ -3664,12 +3565,6 @@
         </w:tc>
       </w:tr>
       <w:tr>
-        <w:tblPrEx>
-          <w:tblCellMar>
-            <w:top w:w="0" w:type="dxa"/>
-            <w:bottom w:w="0" w:type="dxa"/>
-          </w:tblCellMar>
-        </w:tblPrEx>
         <w:tc>
           <w:tcPr>
             <w:tcW w:w="2400" w:type="dxa"/>
@@ -3857,12 +3752,6 @@
         </w:tc>
       </w:tr>
       <w:tr>
-        <w:tblPrEx>
-          <w:tblCellMar>
-            <w:top w:w="0" w:type="dxa"/>
-            <w:bottom w:w="0" w:type="dxa"/>
-          </w:tblCellMar>
-        </w:tblPrEx>
         <w:tc>
           <w:tcPr>
             <w:tcW w:w="2400" w:type="dxa"/>
@@ -4065,12 +3954,6 @@
         </w:tc>
       </w:tr>
       <w:tr>
-        <w:tblPrEx>
-          <w:tblCellMar>
-            <w:top w:w="0" w:type="dxa"/>
-            <w:bottom w:w="0" w:type="dxa"/>
-          </w:tblCellMar>
-        </w:tblPrEx>
         <w:tc>
           <w:tcPr>
             <w:tcW w:w="2400" w:type="dxa"/>
@@ -4154,13 +4037,25 @@
           <w:p>
             <w:pPr>
               <w:jc w:val="center"/>
-            </w:pPr>
-            <w:r>
-              <w:rPr>
-                <w:sz w:val="18"/>
-                <w:szCs w:val="18"/>
-              </w:rPr>
-              <w:t>SI</w:t>
+              <w:rPr>
+                <w:lang w:val="es-ES"/>
+              </w:rPr>
+            </w:pPr>
+            <w:r>
+              <w:rPr>
+                <w:sz w:val="18"/>
+                <w:szCs w:val="18"/>
+                <w:highlight w:val="yellow"/>
+              </w:rPr>
+              <w:t>SI</w:t>
+            </w:r>
+            <w:r>
+              <w:rPr>
+                <w:sz w:val="18"/>
+                <w:szCs w:val="18"/>
+                <w:highlight w:val="yellow"/>
+              </w:rPr>
+              <w:t xml:space="preserve"> (solo ver)</w:t>
             </w:r>
           </w:p>
         </w:tc>
@@ -4258,12 +4153,6 @@
         </w:tc>
       </w:tr>
       <w:tr>
-        <w:tblPrEx>
-          <w:tblCellMar>
-            <w:top w:w="0" w:type="dxa"/>
-            <w:bottom w:w="0" w:type="dxa"/>
-          </w:tblCellMar>
-        </w:tblPrEx>
         <w:tc>
           <w:tcPr>
             <w:tcW w:w="2400" w:type="dxa"/>
@@ -4457,12 +4346,6 @@
         </w:tc>
       </w:tr>
       <w:tr>
-        <w:tblPrEx>
-          <w:tblCellMar>
-            <w:top w:w="0" w:type="dxa"/>
-            <w:bottom w:w="0" w:type="dxa"/>
-          </w:tblCellMar>
-        </w:tblPrEx>
         <w:tc>
           <w:tcPr>
             <w:tcW w:w="2400" w:type="dxa"/>
@@ -4584,6 +4467,7 @@
               <w:rPr>
                 <w:sz w:val="18"/>
                 <w:szCs w:val="18"/>
+                <w:highlight w:val="yellow"/>
               </w:rPr>
               <w:t>SI</w:t>
             </w:r>
@@ -4684,12 +4568,6 @@
         </w:tc>
       </w:tr>
       <w:tr>
-        <w:tblPrEx>
-          <w:tblCellMar>
-            <w:top w:w="0" w:type="dxa"/>
-            <w:bottom w:w="0" w:type="dxa"/>
-          </w:tblCellMar>
-        </w:tblPrEx>
         <w:tc>
           <w:tcPr>
             <w:tcW w:w="2400" w:type="dxa"/>
@@ -4789,6 +4667,7 @@
               <w:rPr>
                 <w:sz w:val="18"/>
                 <w:szCs w:val="18"/>
+                <w:highlight w:val="yellow"/>
               </w:rPr>
               <w:t>SI</w:t>
             </w:r>
@@ -4892,12 +4771,6 @@
         </w:tc>
       </w:tr>
       <w:tr>
-        <w:tblPrEx>
-          <w:tblCellMar>
-            <w:top w:w="0" w:type="dxa"/>
-            <w:bottom w:w="0" w:type="dxa"/>
-          </w:tblCellMar>
-        </w:tblPrEx>
         <w:tc>
           <w:tcPr>
             <w:tcW w:w="2400" w:type="dxa"/>
@@ -5083,12 +4956,6 @@
         </w:tc>
       </w:tr>
       <w:tr>
-        <w:tblPrEx>
-          <w:tblCellMar>
-            <w:top w:w="0" w:type="dxa"/>
-            <w:bottom w:w="0" w:type="dxa"/>
-          </w:tblCellMar>
-        </w:tblPrEx>
         <w:tc>
           <w:tcPr>
             <w:tcW w:w="2400" w:type="dxa"/>
@@ -5282,12 +5149,6 @@
         </w:tc>
       </w:tr>
       <w:tr>
-        <w:tblPrEx>
-          <w:tblCellMar>
-            <w:top w:w="0" w:type="dxa"/>
-            <w:bottom w:w="0" w:type="dxa"/>
-          </w:tblCellMar>
-        </w:tblPrEx>
         <w:tc>
           <w:tcPr>
             <w:tcW w:w="2400" w:type="dxa"/>
@@ -5473,12 +5334,6 @@
         </w:tc>
       </w:tr>
       <w:tr>
-        <w:tblPrEx>
-          <w:tblCellMar>
-            <w:top w:w="0" w:type="dxa"/>
-            <w:bottom w:w="0" w:type="dxa"/>
-          </w:tblCellMar>
-        </w:tblPrEx>
         <w:tc>
           <w:tcPr>
             <w:tcW w:w="2400" w:type="dxa"/>
@@ -5672,12 +5527,6 @@
         </w:tc>
       </w:tr>
       <w:tr>
-        <w:tblPrEx>
-          <w:tblCellMar>
-            <w:top w:w="0" w:type="dxa"/>
-            <w:bottom w:w="0" w:type="dxa"/>
-          </w:tblCellMar>
-        </w:tblPrEx>
         <w:tc>
           <w:tcPr>
             <w:tcW w:w="2400" w:type="dxa"/>
@@ -5865,12 +5714,6 @@
         </w:tc>
       </w:tr>
       <w:tr>
-        <w:tblPrEx>
-          <w:tblCellMar>
-            <w:top w:w="0" w:type="dxa"/>
-            <w:bottom w:w="0" w:type="dxa"/>
-          </w:tblCellMar>
-        </w:tblPrEx>
         <w:tc>
           <w:tcPr>
             <w:tcW w:w="2400" w:type="dxa"/>
@@ -5963,6 +5806,7 @@
               <w:rPr>
                 <w:sz w:val="18"/>
                 <w:szCs w:val="18"/>
+                <w:highlight w:val="yellow"/>
               </w:rPr>
               <w:t>SI</w:t>
             </w:r>
@@ -6146,17 +5990,7 @@
           <w:sz w:val="30"/>
           <w:szCs w:val="30"/>
         </w:rPr>
-        <w:t>2. Alcance (qu</w:t>
-      </w:r>
-      <w:r>
-        <w:rPr>
-          <w:b/>
-          <w:bCs/>
-          <w:color w:val="1F4E79"/>
-          <w:sz w:val="30"/>
-          <w:szCs w:val="30"/>
-        </w:rPr>
-        <w:t>e datos ve cada quien)</w:t>
+        <w:t>2. Alcance (que datos ve cada quien)</w:t>
       </w:r>
     </w:p>
     <w:p>
@@ -6367,12 +6201,6 @@
         <w:gridCol w:w="1600"/>
       </w:tblGrid>
       <w:tr>
-        <w:tblPrEx>
-          <w:tblCellMar>
-            <w:top w:w="0" w:type="dxa"/>
-            <w:bottom w:w="0" w:type="dxa"/>
-          </w:tblCellMar>
-        </w:tblPrEx>
         <w:trPr>
           <w:tblHeader/>
         </w:trPr>
@@ -6456,12 +6284,6 @@
         </w:tc>
       </w:tr>
       <w:tr>
-        <w:tblPrEx>
-          <w:tblCellMar>
-            <w:top w:w="0" w:type="dxa"/>
-            <w:bottom w:w="0" w:type="dxa"/>
-          </w:tblCellMar>
-        </w:tblPrEx>
         <w:tc>
           <w:tcPr>
             <w:tcW w:w="4200" w:type="dxa"/>
@@ -6554,12 +6376,6 @@
         </w:tc>
       </w:tr>
       <w:tr>
-        <w:tblPrEx>
-          <w:tblCellMar>
-            <w:top w:w="0" w:type="dxa"/>
-            <w:bottom w:w="0" w:type="dxa"/>
-          </w:tblCellMar>
-        </w:tblPrEx>
         <w:tc>
           <w:tcPr>
             <w:tcW w:w="4200" w:type="dxa"/>
@@ -6635,12 +6451,6 @@
         </w:tc>
       </w:tr>
       <w:tr>
-        <w:tblPrEx>
-          <w:tblCellMar>
-            <w:top w:w="0" w:type="dxa"/>
-            <w:bottom w:w="0" w:type="dxa"/>
-          </w:tblCellMar>
-        </w:tblPrEx>
         <w:tc>
           <w:tcPr>
             <w:tcW w:w="4200" w:type="dxa"/>
@@ -6713,12 +6523,6 @@
         </w:tc>
       </w:tr>
       <w:tr>
-        <w:tblPrEx>
-          <w:tblCellMar>
-            <w:top w:w="0" w:type="dxa"/>
-            <w:bottom w:w="0" w:type="dxa"/>
-          </w:tblCellMar>
-        </w:tblPrEx>
         <w:tc>
           <w:tcPr>
             <w:tcW w:w="4200" w:type="dxa"/>
@@ -6794,12 +6598,6 @@
         </w:tc>
       </w:tr>
       <w:tr>
-        <w:tblPrEx>
-          <w:tblCellMar>
-            <w:top w:w="0" w:type="dxa"/>
-            <w:bottom w:w="0" w:type="dxa"/>
-          </w:tblCellMar>
-        </w:tblPrEx>
         <w:tc>
           <w:tcPr>
             <w:tcW w:w="4200" w:type="dxa"/>
@@ -6872,12 +6670,6 @@
         </w:tc>
       </w:tr>
       <w:tr>
-        <w:tblPrEx>
-          <w:tblCellMar>
-            <w:top w:w="0" w:type="dxa"/>
-            <w:bottom w:w="0" w:type="dxa"/>
-          </w:tblCellMar>
-        </w:tblPrEx>
         <w:tc>
           <w:tcPr>
             <w:tcW w:w="4200" w:type="dxa"/>
@@ -6973,12 +6765,6 @@
         </w:tc>
       </w:tr>
       <w:tr>
-        <w:tblPrEx>
-          <w:tblCellMar>
-            <w:top w:w="0" w:type="dxa"/>
-            <w:bottom w:w="0" w:type="dxa"/>
-          </w:tblCellMar>
-        </w:tblPrEx>
         <w:tc>
           <w:tcPr>
             <w:tcW w:w="4200" w:type="dxa"/>
@@ -7180,14 +6966,7 @@
           <w:b/>
           <w:bCs/>
         </w:rPr>
-        <w:t xml:space="preserve"> Asis</w:t>
-      </w:r>
-      <w:r>
-        <w:rPr>
-          <w:b/>
-          <w:bCs/>
-        </w:rPr>
-        <w:t xml:space="preserve">tente (al actuar): </w:t>
+        <w:t xml:space="preserve"> Asistente (al actuar): </w:t>
       </w:r>
       <w:proofErr w:type="spellStart"/>
       <w:r>
@@ -7280,17 +7059,7 @@
           <w:sz w:val="30"/>
           <w:szCs w:val="30"/>
         </w:rPr>
-        <w:t>Check</w:t>
-      </w:r>
-      <w:r>
-        <w:rPr>
-          <w:b/>
-          <w:bCs/>
-          <w:color w:val="1F4E79"/>
-          <w:sz w:val="30"/>
-          <w:szCs w:val="30"/>
-        </w:rPr>
-        <w:t>list</w:t>
+        <w:t>Checklist</w:t>
       </w:r>
       <w:proofErr w:type="spellEnd"/>
       <w:r>
@@ -7329,14 +7098,7 @@
           <w:sz w:val="24"/>
           <w:szCs w:val="24"/>
         </w:rPr>
-        <w:t>☐</w:t>
-      </w:r>
-      <w:r>
-        <w:rPr>
-          <w:sz w:val="24"/>
-          <w:szCs w:val="24"/>
-        </w:rPr>
-        <w:t xml:space="preserve">  </w:t>
+        <w:t xml:space="preserve">☐  </w:t>
       </w:r>
       <w:r>
         <w:t>Esta</w:t>
@@ -7356,14 +7118,7 @@
           <w:sz w:val="24"/>
           <w:szCs w:val="24"/>
         </w:rPr>
-        <w:t>☐</w:t>
-      </w:r>
-      <w:r>
-        <w:rPr>
-          <w:sz w:val="24"/>
-          <w:szCs w:val="24"/>
-        </w:rPr>
-        <w:t xml:space="preserve">  </w:t>
+        <w:t xml:space="preserve">☐  </w:t>
       </w:r>
       <w:r>
         <w:t>Edita</w:t>
@@ -7391,14 +7146,7 @@
           <w:sz w:val="24"/>
           <w:szCs w:val="24"/>
         </w:rPr>
-        <w:t>☐</w:t>
-      </w:r>
-      <w:r>
-        <w:rPr>
-          <w:sz w:val="24"/>
-          <w:szCs w:val="24"/>
-        </w:rPr>
-        <w:t xml:space="preserve">  </w:t>
+        <w:t xml:space="preserve">☐  </w:t>
       </w:r>
       <w:r>
         <w:t>Ve</w:t>
@@ -7418,24 +7166,14 @@
           <w:sz w:val="24"/>
           <w:szCs w:val="24"/>
         </w:rPr>
-        <w:t>☐</w:t>
-      </w:r>
-      <w:r>
-        <w:rPr>
-          <w:sz w:val="24"/>
-          <w:szCs w:val="24"/>
-        </w:rPr>
-        <w:t xml:space="preserve">  </w:t>
+        <w:t xml:space="preserve">☐  </w:t>
       </w:r>
       <w:r>
         <w:t>Dispensa</w:t>
       </w:r>
       <w:proofErr w:type="gramEnd"/>
       <w:r>
-        <w:t xml:space="preserve"> Medica</w:t>
-      </w:r>
-      <w:r>
-        <w:t xml:space="preserve"> COMPLETA: edita, sube y elimina documentos, autoriza acceso de menores.</w:t>
+        <w:t xml:space="preserve"> Medica COMPLETA: edita, sube y elimina documentos, autoriza acceso de menores.</w:t>
       </w:r>
     </w:p>
     <w:p>
@@ -7448,14 +7186,7 @@
           <w:sz w:val="24"/>
           <w:szCs w:val="24"/>
         </w:rPr>
-        <w:t>☐</w:t>
-      </w:r>
-      <w:r>
-        <w:rPr>
-          <w:sz w:val="24"/>
-          <w:szCs w:val="24"/>
-        </w:rPr>
-        <w:t xml:space="preserve">  </w:t>
+        <w:t xml:space="preserve">☐  </w:t>
       </w:r>
       <w:r>
         <w:t>Elimina</w:t>
@@ -7475,14 +7206,7 @@
           <w:sz w:val="24"/>
           <w:szCs w:val="24"/>
         </w:rPr>
-        <w:t>☐</w:t>
-      </w:r>
-      <w:r>
-        <w:rPr>
-          <w:sz w:val="24"/>
-          <w:szCs w:val="24"/>
-        </w:rPr>
-        <w:t xml:space="preserve">  </w:t>
+        <w:t xml:space="preserve">☐  </w:t>
       </w:r>
       <w:r>
         <w:t>Resuelve</w:t>
@@ -7502,24 +7226,14 @@
           <w:sz w:val="24"/>
           <w:szCs w:val="24"/>
         </w:rPr>
-        <w:t>☐</w:t>
-      </w:r>
-      <w:r>
-        <w:rPr>
-          <w:sz w:val="24"/>
-          <w:szCs w:val="24"/>
-        </w:rPr>
-        <w:t xml:space="preserve">  </w:t>
+        <w:t xml:space="preserve">☐  </w:t>
       </w:r>
       <w:r>
         <w:t>Un</w:t>
       </w:r>
       <w:proofErr w:type="gramEnd"/>
       <w:r>
-        <w:t xml:space="preserve"> cambio directo suyo notifica al asistent</w:t>
-      </w:r>
-      <w:r>
-        <w:t xml:space="preserve">e, no a </w:t>
+        <w:t xml:space="preserve"> cambio directo suyo notifica al asistente, no a </w:t>
       </w:r>
       <w:proofErr w:type="spellStart"/>
       <w:r>
@@ -7540,14 +7254,7 @@
           <w:sz w:val="24"/>
           <w:szCs w:val="24"/>
         </w:rPr>
-        <w:t>☐</w:t>
-      </w:r>
-      <w:r>
-        <w:rPr>
-          <w:sz w:val="24"/>
-          <w:szCs w:val="24"/>
-        </w:rPr>
-        <w:t xml:space="preserve">  </w:t>
+        <w:t xml:space="preserve">☐  </w:t>
       </w:r>
       <w:r>
         <w:t>NO</w:t>
@@ -7567,14 +7274,7 @@
           <w:sz w:val="24"/>
           <w:szCs w:val="24"/>
         </w:rPr>
-        <w:t>☐</w:t>
-      </w:r>
-      <w:r>
-        <w:rPr>
-          <w:sz w:val="24"/>
-          <w:szCs w:val="24"/>
-        </w:rPr>
-        <w:t xml:space="preserve">  </w:t>
+        <w:t xml:space="preserve">☐  </w:t>
       </w:r>
       <w:r>
         <w:t>Solo</w:t>
@@ -7609,14 +7309,7 @@
           <w:sz w:val="24"/>
           <w:szCs w:val="24"/>
         </w:rPr>
-        <w:t>☐</w:t>
-      </w:r>
-      <w:r>
-        <w:rPr>
-          <w:sz w:val="24"/>
-          <w:szCs w:val="24"/>
-        </w:rPr>
-        <w:t xml:space="preserve">  </w:t>
+        <w:t xml:space="preserve">☐  </w:t>
       </w:r>
       <w:proofErr w:type="spellStart"/>
       <w:r>
@@ -7638,14 +7331,7 @@
           <w:sz w:val="24"/>
           <w:szCs w:val="24"/>
         </w:rPr>
-        <w:t>☐</w:t>
-      </w:r>
-      <w:r>
-        <w:rPr>
-          <w:sz w:val="24"/>
-          <w:szCs w:val="24"/>
-        </w:rPr>
-        <w:t xml:space="preserve">  </w:t>
+        <w:t xml:space="preserve">☐  </w:t>
       </w:r>
       <w:r>
         <w:t>Sus</w:t>
@@ -7665,14 +7351,7 @@
           <w:sz w:val="24"/>
           <w:szCs w:val="24"/>
         </w:rPr>
-        <w:t>☐</w:t>
-      </w:r>
-      <w:r>
-        <w:rPr>
-          <w:sz w:val="24"/>
-          <w:szCs w:val="24"/>
-        </w:rPr>
-        <w:t xml:space="preserve">  </w:t>
+        <w:t xml:space="preserve">☐  </w:t>
       </w:r>
       <w:r>
         <w:t>Se</w:t>
@@ -7715,24 +7394,14 @@
           <w:sz w:val="24"/>
           <w:szCs w:val="24"/>
         </w:rPr>
-        <w:t>☐</w:t>
-      </w:r>
-      <w:r>
-        <w:rPr>
-          <w:sz w:val="24"/>
-          <w:szCs w:val="24"/>
-        </w:rPr>
-        <w:t xml:space="preserve">  </w:t>
+        <w:t xml:space="preserve">☐  </w:t>
       </w:r>
       <w:r>
         <w:t>Puede</w:t>
       </w:r>
       <w:proofErr w:type="gramEnd"/>
       <w:r>
-        <w:t xml:space="preserve"> crear y editar miembros, pero sus ediciones van a APROBAC</w:t>
-      </w:r>
-      <w:r>
-        <w:t>ION.</w:t>
+        <w:t xml:space="preserve"> crear y editar miembros, pero sus ediciones van a APROBACION.</w:t>
       </w:r>
     </w:p>
     <w:p>
@@ -7745,14 +7414,7 @@
           <w:sz w:val="24"/>
           <w:szCs w:val="24"/>
         </w:rPr>
-        <w:t>☐</w:t>
-      </w:r>
-      <w:r>
-        <w:rPr>
-          <w:sz w:val="24"/>
-          <w:szCs w:val="24"/>
-        </w:rPr>
-        <w:t xml:space="preserve">  </w:t>
+        <w:t xml:space="preserve">☐  </w:t>
       </w:r>
       <w:r>
         <w:t>Ve</w:t>
@@ -7780,14 +7442,7 @@
           <w:sz w:val="24"/>
           <w:szCs w:val="24"/>
         </w:rPr>
-        <w:t>☐</w:t>
-      </w:r>
-      <w:r>
-        <w:rPr>
-          <w:sz w:val="24"/>
-          <w:szCs w:val="24"/>
-        </w:rPr>
-        <w:t xml:space="preserve">  </w:t>
+        <w:t xml:space="preserve">☐  </w:t>
       </w:r>
       <w:r>
         <w:t>Salud</w:t>
@@ -7807,14 +7462,7 @@
           <w:sz w:val="24"/>
           <w:szCs w:val="24"/>
         </w:rPr>
-        <w:t>☐</w:t>
-      </w:r>
-      <w:r>
-        <w:rPr>
-          <w:sz w:val="24"/>
-          <w:szCs w:val="24"/>
-        </w:rPr>
-        <w:t xml:space="preserve">  </w:t>
+        <w:t xml:space="preserve">☐  </w:t>
       </w:r>
       <w:r>
         <w:t>Documentos</w:t>
@@ -7834,14 +7482,7 @@
           <w:sz w:val="24"/>
           <w:szCs w:val="24"/>
         </w:rPr>
-        <w:t>☐</w:t>
-      </w:r>
-      <w:r>
-        <w:rPr>
-          <w:sz w:val="24"/>
-          <w:szCs w:val="24"/>
-        </w:rPr>
-        <w:t xml:space="preserve">  </w:t>
+        <w:t xml:space="preserve">☐  </w:t>
       </w:r>
       <w:proofErr w:type="spellStart"/>
       <w:r>
@@ -7850,10 +7491,7 @@
       <w:proofErr w:type="spellEnd"/>
       <w:proofErr w:type="gramEnd"/>
       <w:r>
-        <w:t xml:space="preserve"> correos, ve regiones y reportes secciona</w:t>
-      </w:r>
-      <w:r>
-        <w:t>les.</w:t>
+        <w:t xml:space="preserve"> correos, ve regiones y reportes seccionales.</w:t>
       </w:r>
     </w:p>
     <w:p>
@@ -7881,14 +7519,7 @@
           <w:sz w:val="24"/>
           <w:szCs w:val="24"/>
         </w:rPr>
-        <w:t>☐</w:t>
-      </w:r>
-      <w:r>
-        <w:rPr>
-          <w:sz w:val="24"/>
-          <w:szCs w:val="24"/>
-        </w:rPr>
-        <w:t xml:space="preserve">  </w:t>
+        <w:t xml:space="preserve">☐  </w:t>
       </w:r>
       <w:r>
         <w:t>NO</w:t>
@@ -7916,14 +7547,7 @@
           <w:sz w:val="24"/>
           <w:szCs w:val="24"/>
         </w:rPr>
-        <w:t>☐</w:t>
-      </w:r>
-      <w:r>
-        <w:rPr>
-          <w:sz w:val="24"/>
-          <w:szCs w:val="24"/>
-        </w:rPr>
-        <w:t xml:space="preserve">  </w:t>
+        <w:t xml:space="preserve">☐  </w:t>
       </w:r>
       <w:r>
         <w:t>Edita</w:t>
@@ -7951,14 +7575,7 @@
           <w:sz w:val="24"/>
           <w:szCs w:val="24"/>
         </w:rPr>
-        <w:t>☐</w:t>
-      </w:r>
-      <w:r>
-        <w:rPr>
-          <w:sz w:val="24"/>
-          <w:szCs w:val="24"/>
-        </w:rPr>
-        <w:t xml:space="preserve">  </w:t>
+        <w:t xml:space="preserve">☐  </w:t>
       </w:r>
       <w:r>
         <w:t>NO</w:t>
@@ -7994,14 +7611,7 @@
           <w:sz w:val="24"/>
           <w:szCs w:val="24"/>
         </w:rPr>
-        <w:t>☐</w:t>
-      </w:r>
-      <w:r>
-        <w:rPr>
-          <w:sz w:val="24"/>
-          <w:szCs w:val="24"/>
-        </w:rPr>
-        <w:t xml:space="preserve">  </w:t>
+        <w:t xml:space="preserve">☐  </w:t>
       </w:r>
       <w:r>
         <w:t>Ve</w:t>
@@ -8012,10 +7622,7 @@
       </w:r>
       <w:proofErr w:type="spellStart"/>
       <w:r>
-        <w:t>r</w:t>
-      </w:r>
-      <w:r>
-        <w:t>egion</w:t>
+        <w:t>region</w:t>
       </w:r>
       <w:proofErr w:type="spellEnd"/>
       <w:r>
@@ -8066,14 +7673,7 @@
           <w:sz w:val="24"/>
           <w:szCs w:val="24"/>
         </w:rPr>
-        <w:t>☐</w:t>
-      </w:r>
-      <w:r>
-        <w:rPr>
-          <w:sz w:val="24"/>
-          <w:szCs w:val="24"/>
-        </w:rPr>
-        <w:t xml:space="preserve">  </w:t>
+        <w:t xml:space="preserve">☐  </w:t>
       </w:r>
       <w:r>
         <w:t>Crea</w:t>
@@ -8093,14 +7693,7 @@
           <w:sz w:val="24"/>
           <w:szCs w:val="24"/>
         </w:rPr>
-        <w:t>☐</w:t>
-      </w:r>
-      <w:r>
-        <w:rPr>
-          <w:sz w:val="24"/>
-          <w:szCs w:val="24"/>
-        </w:rPr>
-        <w:t xml:space="preserve">  </w:t>
+        <w:t xml:space="preserve">☐  </w:t>
       </w:r>
       <w:r>
         <w:t>NO</w:t>
@@ -8120,14 +7713,7 @@
           <w:sz w:val="24"/>
           <w:szCs w:val="24"/>
         </w:rPr>
-        <w:t>☐</w:t>
-      </w:r>
-      <w:r>
-        <w:rPr>
-          <w:sz w:val="24"/>
-          <w:szCs w:val="24"/>
-        </w:rPr>
-        <w:t xml:space="preserve">  </w:t>
+        <w:t xml:space="preserve">☐  </w:t>
       </w:r>
       <w:r>
         <w:t>Salud</w:t>
@@ -8147,24 +7733,14 @@
           <w:sz w:val="24"/>
           <w:szCs w:val="24"/>
         </w:rPr>
-        <w:t>☐</w:t>
-      </w:r>
-      <w:r>
-        <w:rPr>
-          <w:sz w:val="24"/>
-          <w:szCs w:val="24"/>
-        </w:rPr>
-        <w:t xml:space="preserve">  </w:t>
+        <w:t xml:space="preserve">☐  </w:t>
       </w:r>
       <w:r>
         <w:t>Verificar</w:t>
       </w:r>
       <w:proofErr w:type="gramEnd"/>
       <w:r>
-        <w:t xml:space="preserve"> comportamiento con menores (ver discr</w:t>
-      </w:r>
-      <w:r>
-        <w:t>epancia).</w:t>
+        <w:t xml:space="preserve"> comportamiento con menores (ver discrepancia).</w:t>
       </w:r>
     </w:p>
     <w:p>
@@ -8212,14 +7788,7 @@
           <w:sz w:val="24"/>
           <w:szCs w:val="24"/>
         </w:rPr>
-        <w:t>☐</w:t>
-      </w:r>
-      <w:r>
-        <w:rPr>
-          <w:sz w:val="24"/>
-          <w:szCs w:val="24"/>
-        </w:rPr>
-        <w:t xml:space="preserve">  </w:t>
+        <w:t xml:space="preserve">☐  </w:t>
       </w:r>
       <w:r>
         <w:t>Crea</w:t>
@@ -8239,14 +7808,7 @@
           <w:sz w:val="24"/>
           <w:szCs w:val="24"/>
         </w:rPr>
-        <w:t>☐</w:t>
-      </w:r>
-      <w:r>
-        <w:rPr>
-          <w:sz w:val="24"/>
-          <w:szCs w:val="24"/>
-        </w:rPr>
-        <w:t xml:space="preserve">  </w:t>
+        <w:t xml:space="preserve">☐  </w:t>
       </w:r>
       <w:r>
         <w:t>Al</w:t>
@@ -8275,14 +7837,7 @@
           <w:szCs w:val="24"/>
         </w:rPr>
         <w:lastRenderedPageBreak/>
-        <w:t>☐</w:t>
-      </w:r>
-      <w:r>
-        <w:rPr>
-          <w:sz w:val="24"/>
-          <w:szCs w:val="24"/>
-        </w:rPr>
-        <w:t xml:space="preserve">  </w:t>
+        <w:t xml:space="preserve">☐  </w:t>
       </w:r>
       <w:r>
         <w:t>Ve</w:t>
@@ -8318,24 +7873,14 @@
           <w:sz w:val="24"/>
           <w:szCs w:val="24"/>
         </w:rPr>
-        <w:t>☐</w:t>
-      </w:r>
-      <w:r>
-        <w:rPr>
-          <w:sz w:val="24"/>
-          <w:szCs w:val="24"/>
-        </w:rPr>
-        <w:t xml:space="preserve">  </w:t>
+        <w:t xml:space="preserve">☐  </w:t>
       </w:r>
       <w:r>
         <w:t>NO</w:t>
       </w:r>
       <w:proofErr w:type="gramEnd"/>
       <w:r>
-        <w:t xml:space="preserve"> ve datos sensibles en texto </w:t>
-      </w:r>
-      <w:r>
-        <w:t>plano.</w:t>
+        <w:t xml:space="preserve"> ve datos sensibles en texto plano.</w:t>
       </w:r>
     </w:p>
     <w:p>
@@ -8383,14 +7928,7 @@
           <w:sz w:val="24"/>
           <w:szCs w:val="24"/>
         </w:rPr>
-        <w:t>☐</w:t>
-      </w:r>
-      <w:r>
-        <w:rPr>
-          <w:sz w:val="24"/>
-          <w:szCs w:val="24"/>
-        </w:rPr>
-        <w:t xml:space="preserve">  </w:t>
+        <w:t xml:space="preserve">☐  </w:t>
       </w:r>
       <w:proofErr w:type="spellStart"/>
       <w:r>
@@ -8497,12 +8035,6 @@
         <w:gridCol w:w="9360"/>
       </w:tblGrid>
       <w:tr>
-        <w:tblPrEx>
-          <w:tblCellMar>
-            <w:top w:w="0" w:type="dxa"/>
-            <w:bottom w:w="0" w:type="dxa"/>
-          </w:tblCellMar>
-        </w:tblPrEx>
         <w:tc>
           <w:tcPr>
             <w:tcW w:w="9360" w:type="dxa"/>
@@ -8551,12 +8083,6 @@
         </w:tc>
       </w:tr>
       <w:tr>
-        <w:tblPrEx>
-          <w:tblCellMar>
-            <w:top w:w="0" w:type="dxa"/>
-            <w:bottom w:w="0" w:type="dxa"/>
-          </w:tblCellMar>
-        </w:tblPrEx>
         <w:tc>
           <w:tcPr>
             <w:tcW w:w="9360" w:type="dxa"/>
@@ -8578,21 +8104,7 @@
                 <w:sz w:val="18"/>
                 <w:szCs w:val="18"/>
               </w:rPr>
-              <w:t>⚠</w:t>
-            </w:r>
-            <w:r>
-              <w:rPr>
-                <w:sz w:val="18"/>
-                <w:szCs w:val="18"/>
-              </w:rPr>
-              <w:t xml:space="preserve">  </w:t>
-            </w:r>
-            <w:r>
-              <w:rPr>
-                <w:sz w:val="18"/>
-                <w:szCs w:val="18"/>
-              </w:rPr>
-              <w:t>El</w:t>
+              <w:t>⚠  El</w:t>
             </w:r>
             <w:proofErr w:type="gramEnd"/>
             <w:r>
@@ -8677,14 +8189,7 @@
                 <w:sz w:val="18"/>
                 <w:szCs w:val="18"/>
               </w:rPr>
-              <w:t>⚠</w:t>
-            </w:r>
-            <w:r>
-              <w:rPr>
-                <w:sz w:val="18"/>
-                <w:szCs w:val="18"/>
-              </w:rPr>
-              <w:t xml:space="preserve">  En</w:t>
+              <w:t>⚠  En</w:t>
             </w:r>
             <w:proofErr w:type="gramEnd"/>
             <w:r>
@@ -8724,14 +8229,7 @@
                 <w:sz w:val="18"/>
                 <w:szCs w:val="18"/>
               </w:rPr>
-              <w:t xml:space="preserve"> fichas de menores. Definir el comportamiento cor</w:t>
-            </w:r>
-            <w:r>
-              <w:rPr>
-                <w:sz w:val="18"/>
-                <w:szCs w:val="18"/>
-              </w:rPr>
-              <w:t>recto y probar en vivo.</w:t>
+              <w:t xml:space="preserve"> fichas de menores. Definir el comportamiento correcto y probar en vivo.</w:t>
             </w:r>
           </w:p>
         </w:tc>
@@ -8763,12 +8261,6 @@
         <w:gridCol w:w="9360"/>
       </w:tblGrid>
       <w:tr>
-        <w:tblPrEx>
-          <w:tblCellMar>
-            <w:top w:w="0" w:type="dxa"/>
-            <w:bottom w:w="0" w:type="dxa"/>
-          </w:tblCellMar>
-        </w:tblPrEx>
         <w:tc>
           <w:tcPr>
             <w:tcW w:w="9360" w:type="dxa"/>
@@ -8795,12 +8287,6 @@
         </w:tc>
       </w:tr>
       <w:tr>
-        <w:tblPrEx>
-          <w:tblCellMar>
-            <w:top w:w="0" w:type="dxa"/>
-            <w:bottom w:w="0" w:type="dxa"/>
-          </w:tblCellMar>
-        </w:tblPrEx>
         <w:tc>
           <w:tcPr>
             <w:tcW w:w="9360" w:type="dxa"/>
@@ -8822,14 +8308,7 @@
                 <w:sz w:val="18"/>
                 <w:szCs w:val="18"/>
               </w:rPr>
-              <w:t>⚠</w:t>
-            </w:r>
-            <w:r>
-              <w:rPr>
-                <w:sz w:val="18"/>
-                <w:szCs w:val="18"/>
-              </w:rPr>
-              <w:t xml:space="preserve">  El</w:t>
+              <w:t>⚠  El</w:t>
             </w:r>
             <w:proofErr w:type="gramEnd"/>
             <w:r>
@@ -8898,21 +8377,7 @@
                 <w:sz w:val="18"/>
                 <w:szCs w:val="18"/>
               </w:rPr>
-              <w:t>⚠</w:t>
-            </w:r>
-            <w:r>
-              <w:rPr>
-                <w:sz w:val="18"/>
-                <w:szCs w:val="18"/>
-              </w:rPr>
-              <w:t xml:space="preserve">  </w:t>
-            </w:r>
-            <w:r>
-              <w:rPr>
-                <w:sz w:val="18"/>
-                <w:szCs w:val="18"/>
-              </w:rPr>
-              <w:t>Pastor</w:t>
+              <w:t>⚠  Pastor</w:t>
             </w:r>
             <w:proofErr w:type="gramEnd"/>
             <w:r>
@@ -9019,7 +8484,7 @@
 </file>
 
 <file path=word/numbering.xml><?xml version="1.0" encoding="utf-8"?>
-<w:numbering xmlns:wpc="http://schemas.microsoft.com/office/word/2010/wordprocessingCanvas" xmlns:cx="http://schemas.microsoft.com/office/drawing/2014/chartex" xmlns:cx1="http://schemas.microsoft.com/office/drawing/2015/9/8/chartex" xmlns:cx2="http://schemas.microsoft.com/office/drawing/2015/10/21/chartex" xmlns:cx3="http://schemas.microsoft.com/office/drawing/2016/5/9/chartex" xmlns:cx4="http://schemas.microsoft.com/office/drawing/2016/5/10/chartex" xmlns:cx5="http://schemas.microsoft.com/office/drawing/2016/5/11/chartex" xmlns:cx6="http://schemas.microsoft.com/office/drawing/2016/5/12/chartex" xmlns:cx7="http://schemas.microsoft.com/office/drawing/2016/5/13/chartex" xmlns:cx8="http://schemas.microsoft.com/office/drawing/2016/5/14/chartex" xmlns:mc="http://schemas.openxmlformats.org/markup-compatibility/2006" xmlns:aink="http://schemas.microsoft.com/office/drawing/2016/ink" xmlns:am3d="http://schemas.microsoft.com/office/drawing/2017/model3d" xmlns:o="urn:schemas-microsoft-com:office:office" xmlns:r="http://schemas.openxmlformats.org/officeDocument/2006/relationships" xmlns:m="http://schemas.openxmlformats.org/officeDocument/2006/math" xmlns:v="urn:schemas-microsoft-com:vml" xmlns:wp14="http://schemas.microsoft.com/office/word/2010/wordprocessingDrawing" xmlns:wp="http://schemas.openxmlformats.org/drawingml/2006/wordprocessingDrawing" xmlns:w10="urn:schemas-microsoft-com:office:word" xmlns:w="http://schemas.openxmlformats.org/wordprocessingml/2006/main" xmlns:w14="http://schemas.microsoft.com/office/word/2010/wordml" xmlns:w15="http://schemas.microsoft.com/office/word/2012/wordml" xmlns:w16cex="http://schemas.microsoft.com/office/word/2018/wordml/cex" xmlns:w16cid="http://schemas.microsoft.com/office/word/2016/wordml/cid" xmlns:w16="http://schemas.microsoft.com/office/word/2018/wordml" xmlns:w16sdtdh="http://schemas.microsoft.com/office/word/2020/wordml/sdtdatahash" xmlns:w16se="http://schemas.microsoft.com/office/word/2015/wordml/symex" xmlns:wpg="http://schemas.microsoft.com/office/word/2010/wordprocessingGroup" xmlns:wpi="http://schemas.microsoft.com/office/word/2010/wordprocessingInk" xmlns:wne="http://schemas.microsoft.com/office/word/2006/wordml" xmlns:wps="http://schemas.microsoft.com/office/word/2010/wordprocessingShape" mc:Ignorable="w14 w15 w16se w16cid w16 w16cex w16sdtdh wp14">
+<w:numbering xmlns:wpc="http://schemas.microsoft.com/office/word/2010/wordprocessingCanvas" xmlns:cx="http://schemas.microsoft.com/office/drawing/2014/chartex" xmlns:cx1="http://schemas.microsoft.com/office/drawing/2015/9/8/chartex" xmlns:cx2="http://schemas.microsoft.com/office/drawing/2015/10/21/chartex" xmlns:cx3="http://schemas.microsoft.com/office/drawing/2016/5/9/chartex" xmlns:cx4="http://schemas.microsoft.com/office/drawing/2016/5/10/chartex" xmlns:cx5="http://schemas.microsoft.com/office/drawing/2016/5/11/chartex" xmlns:cx6="http://schemas.microsoft.com/office/drawing/2016/5/12/chartex" xmlns:cx7="http://schemas.microsoft.com/office/drawing/2016/5/13/chartex" xmlns:cx8="http://schemas.microsoft.com/office/drawing/2016/5/14/chartex" xmlns:mc="http://schemas.openxmlformats.org/markup-compatibility/2006" xmlns:aink="http://schemas.microsoft.com/office/drawing/2016/ink" xmlns:am3d="http://schemas.microsoft.com/office/drawing/2017/model3d" xmlns:o="urn:schemas-microsoft-com:office:office" xmlns:oel="http://schemas.microsoft.com/office/2019/extlst" xmlns:r="http://schemas.openxmlformats.org/officeDocument/2006/relationships" xmlns:m="http://schemas.openxmlformats.org/officeDocument/2006/math" xmlns:v="urn:schemas-microsoft-com:vml" xmlns:wp14="http://schemas.microsoft.com/office/word/2010/wordprocessingDrawing" xmlns:wp="http://schemas.openxmlformats.org/drawingml/2006/wordprocessingDrawing" xmlns:w10="urn:schemas-microsoft-com:office:word" xmlns:w="http://schemas.openxmlformats.org/wordprocessingml/2006/main" xmlns:w14="http://schemas.microsoft.com/office/word/2010/wordml" xmlns:w15="http://schemas.microsoft.com/office/word/2012/wordml" xmlns:w16cex="http://schemas.microsoft.com/office/word/2018/wordml/cex" xmlns:w16cid="http://schemas.microsoft.com/office/word/2016/wordml/cid" xmlns:w16="http://schemas.microsoft.com/office/word/2018/wordml" xmlns:w16sdtdh="http://schemas.microsoft.com/office/word/2020/wordml/sdtdatahash" xmlns:w16se="http://schemas.microsoft.com/office/word/2015/wordml/symex" xmlns:wpg="http://schemas.microsoft.com/office/word/2010/wordprocessingGroup" xmlns:wpi="http://schemas.microsoft.com/office/word/2010/wordprocessingInk" xmlns:wne="http://schemas.microsoft.com/office/word/2006/wordml" xmlns:wps="http://schemas.microsoft.com/office/word/2010/wordprocessingShape" mc:Ignorable="w14 w15 w16se w16cid w16 w16cex w16sdtdh wp14">
   <w:abstractNum w:abstractNumId="0" w15:restartNumberingAfterBreak="0">
     <w:nsid w:val="42631B89"/>
     <w:multiLevelType w:val="hybridMultilevel"/>
@@ -9106,7 +8571,7 @@
       </w:pPr>
     </w:lvl>
   </w:abstractNum>
-  <w:num w:numId="1">
+  <w:num w:numId="1" w16cid:durableId="172695827">
     <w:abstractNumId w:val="0"/>
     <w:lvlOverride w:ilvl="0">
       <w:startOverride w:val="1"/>

</xml_diff>

<commit_message>
feat(ascenso): aviso de auditoria y solo lectura para cargos de destacamento
Sistema de Ascenso:
- Escudo junto al filtro Estado que despliega, al senalarlo, el aviso de que
  los cambios quedan en el historial del miembro, son visibles para
  administradores y coordinadores del destacamento con fines de auditoria y
  generan una notificacion. Visible para los cargos de nivel destacamento.
- Pastor, Consejo y Capellan pasan a SOLO LECTURA: se les quita ascenso.editar
  del catalogo y canEditAwards los bloquea por rol, porque
  normalizarAccesoUsuario une los permisos del rol con los guardados en el
  documento del usuario y el catalogo por si solo no basta.
- El DatePicker de "Completado en fecha" ignoraba readOnly.

Incluye trabajo previo pendiente: perfil de aprobacion para Pastor, Consejo y
Capellan, y la auditoria de textos de cara al usuario (scripts e informes).

Co-Authored-By: Claude Opus 5 <noreply@anthropic.com>
</commit_message>
<xml_diff>
--- a/docs/qa-roles/QA-Roles-1-Destacamento.docx
+++ b/docs/qa-roles/QA-Roles-1-Destacamento.docx
@@ -1,6 +1,6 @@
 
 <file path=word/document.xml><?xml version="1.0" encoding="utf-8"?>
-<w:document xmlns:wpc="http://schemas.microsoft.com/office/word/2010/wordprocessingCanvas" xmlns:cx="http://schemas.microsoft.com/office/drawing/2014/chartex" xmlns:cx1="http://schemas.microsoft.com/office/drawing/2015/9/8/chartex" xmlns:cx2="http://schemas.microsoft.com/office/drawing/2015/10/21/chartex" xmlns:cx3="http://schemas.microsoft.com/office/drawing/2016/5/9/chartex" xmlns:cx4="http://schemas.microsoft.com/office/drawing/2016/5/10/chartex" xmlns:cx5="http://schemas.microsoft.com/office/drawing/2016/5/11/chartex" xmlns:cx6="http://schemas.microsoft.com/office/drawing/2016/5/12/chartex" xmlns:cx7="http://schemas.microsoft.com/office/drawing/2016/5/13/chartex" xmlns:cx8="http://schemas.microsoft.com/office/drawing/2016/5/14/chartex" xmlns:mc="http://schemas.openxmlformats.org/markup-compatibility/2006" xmlns:aink="http://schemas.microsoft.com/office/drawing/2016/ink" xmlns:am3d="http://schemas.microsoft.com/office/drawing/2017/model3d" xmlns:o="urn:schemas-microsoft-com:office:office" xmlns:r="http://schemas.openxmlformats.org/officeDocument/2006/relationships" xmlns:m="http://schemas.openxmlformats.org/officeDocument/2006/math" xmlns:v="urn:schemas-microsoft-com:vml" xmlns:wp14="http://schemas.microsoft.com/office/word/2010/wordprocessingDrawing" xmlns:wp="http://schemas.openxmlformats.org/drawingml/2006/wordprocessingDrawing" xmlns:w10="urn:schemas-microsoft-com:office:word" xmlns:w="http://schemas.openxmlformats.org/wordprocessingml/2006/main" xmlns:w14="http://schemas.microsoft.com/office/word/2010/wordml" xmlns:w15="http://schemas.microsoft.com/office/word/2012/wordml" xmlns:w16cex="http://schemas.microsoft.com/office/word/2018/wordml/cex" xmlns:w16cid="http://schemas.microsoft.com/office/word/2016/wordml/cid" xmlns:w16="http://schemas.microsoft.com/office/word/2018/wordml" xmlns:w16sdtdh="http://schemas.microsoft.com/office/word/2020/wordml/sdtdatahash" xmlns:w16se="http://schemas.microsoft.com/office/word/2015/wordml/symex" xmlns:wpg="http://schemas.microsoft.com/office/word/2010/wordprocessingGroup" xmlns:wpi="http://schemas.microsoft.com/office/word/2010/wordprocessingInk" xmlns:wne="http://schemas.microsoft.com/office/word/2006/wordml" xmlns:wps="http://schemas.microsoft.com/office/word/2010/wordprocessingShape" mc:Ignorable="w14 w15 w16se w16cid w16 w16cex w16sdtdh wp14">
+<w:document xmlns:wpc="http://schemas.microsoft.com/office/word/2010/wordprocessingCanvas" xmlns:cx="http://schemas.microsoft.com/office/drawing/2014/chartex" xmlns:cx1="http://schemas.microsoft.com/office/drawing/2015/9/8/chartex" xmlns:cx2="http://schemas.microsoft.com/office/drawing/2015/10/21/chartex" xmlns:cx3="http://schemas.microsoft.com/office/drawing/2016/5/9/chartex" xmlns:cx4="http://schemas.microsoft.com/office/drawing/2016/5/10/chartex" xmlns:cx5="http://schemas.microsoft.com/office/drawing/2016/5/11/chartex" xmlns:cx6="http://schemas.microsoft.com/office/drawing/2016/5/12/chartex" xmlns:cx7="http://schemas.microsoft.com/office/drawing/2016/5/13/chartex" xmlns:cx8="http://schemas.microsoft.com/office/drawing/2016/5/14/chartex" xmlns:mc="http://schemas.openxmlformats.org/markup-compatibility/2006" xmlns:aink="http://schemas.microsoft.com/office/drawing/2016/ink" xmlns:am3d="http://schemas.microsoft.com/office/drawing/2017/model3d" xmlns:o="urn:schemas-microsoft-com:office:office" xmlns:oel="http://schemas.microsoft.com/office/2019/extlst" xmlns:r="http://schemas.openxmlformats.org/officeDocument/2006/relationships" xmlns:m="http://schemas.openxmlformats.org/officeDocument/2006/math" xmlns:v="urn:schemas-microsoft-com:vml" xmlns:wp14="http://schemas.microsoft.com/office/word/2010/wordprocessingDrawing" xmlns:wp="http://schemas.openxmlformats.org/drawingml/2006/wordprocessingDrawing" xmlns:w10="urn:schemas-microsoft-com:office:word" xmlns:w="http://schemas.openxmlformats.org/wordprocessingml/2006/main" xmlns:w14="http://schemas.microsoft.com/office/word/2010/wordml" xmlns:w15="http://schemas.microsoft.com/office/word/2012/wordml" xmlns:w16cex="http://schemas.microsoft.com/office/word/2018/wordml/cex" xmlns:w16cid="http://schemas.microsoft.com/office/word/2016/wordml/cid" xmlns:w16="http://schemas.microsoft.com/office/word/2018/wordml" xmlns:w16sdtdh="http://schemas.microsoft.com/office/word/2020/wordml/sdtdatahash" xmlns:w16se="http://schemas.microsoft.com/office/word/2015/wordml/symex" xmlns:wpg="http://schemas.microsoft.com/office/word/2010/wordprocessingGroup" xmlns:wpi="http://schemas.microsoft.com/office/word/2010/wordprocessingInk" xmlns:wne="http://schemas.microsoft.com/office/word/2006/wordml" xmlns:wps="http://schemas.microsoft.com/office/word/2010/wordprocessingShape" mc:Ignorable="w14 w15 w16se w16cid w16 w16cex w16sdtdh wp14">
   <w:body>
     <w:p>
       <w:pPr>
@@ -61,7 +61,25 @@
           <w:sz w:val="18"/>
           <w:szCs w:val="18"/>
         </w:rPr>
-        <w:t xml:space="preserve">Proyecto: Exploradores  ·  Modulo de </w:t>
+        <w:t xml:space="preserve">Proyecto: </w:t>
+      </w:r>
+      <w:proofErr w:type="gramStart"/>
+      <w:r>
+        <w:rPr>
+          <w:color w:val="555555"/>
+          <w:sz w:val="18"/>
+          <w:szCs w:val="18"/>
+        </w:rPr>
+        <w:t>Exploradores  ·</w:t>
+      </w:r>
+      <w:proofErr w:type="gramEnd"/>
+      <w:r>
+        <w:rPr>
+          <w:color w:val="555555"/>
+          <w:sz w:val="18"/>
+          <w:szCs w:val="18"/>
+        </w:rPr>
+        <w:t xml:space="preserve">  Modulo de </w:t>
       </w:r>
       <w:proofErr w:type="spellStart"/>
       <w:r>
@@ -1494,6 +1512,7 @@
               <w:rPr>
                 <w:sz w:val="18"/>
                 <w:szCs w:val="18"/>
+                <w:highlight w:val="yellow"/>
               </w:rPr>
               <w:t>ENMASC</w:t>
             </w:r>
@@ -1518,6 +1537,7 @@
               <w:rPr>
                 <w:sz w:val="18"/>
                 <w:szCs w:val="18"/>
+                <w:highlight w:val="yellow"/>
               </w:rPr>
               <w:t>ENMASC</w:t>
             </w:r>
@@ -1567,6 +1587,7 @@
               <w:rPr>
                 <w:sz w:val="18"/>
                 <w:szCs w:val="18"/>
+                <w:highlight w:val="yellow"/>
               </w:rPr>
               <w:t>ENMASC</w:t>
             </w:r>
@@ -1862,11 +1883,15 @@
           <w:p>
             <w:pPr>
               <w:jc w:val="center"/>
-            </w:pPr>
-            <w:r>
-              <w:rPr>
-                <w:sz w:val="18"/>
-                <w:szCs w:val="18"/>
+              <w:rPr>
+                <w:highlight w:val="yellow"/>
+              </w:rPr>
+            </w:pPr>
+            <w:r>
+              <w:rPr>
+                <w:sz w:val="18"/>
+                <w:szCs w:val="18"/>
+                <w:highlight w:val="yellow"/>
               </w:rPr>
               <w:t>APROB</w:t>
             </w:r>
@@ -1886,11 +1911,15 @@
           <w:p>
             <w:pPr>
               <w:jc w:val="center"/>
-            </w:pPr>
-            <w:r>
-              <w:rPr>
-                <w:sz w:val="18"/>
-                <w:szCs w:val="18"/>
+              <w:rPr>
+                <w:highlight w:val="yellow"/>
+              </w:rPr>
+            </w:pPr>
+            <w:r>
+              <w:rPr>
+                <w:sz w:val="18"/>
+                <w:szCs w:val="18"/>
+                <w:highlight w:val="yellow"/>
               </w:rPr>
               <w:t>APROB</w:t>
             </w:r>
@@ -1910,11 +1939,15 @@
           <w:p>
             <w:pPr>
               <w:jc w:val="center"/>
-            </w:pPr>
-            <w:r>
-              <w:rPr>
-                <w:sz w:val="18"/>
-                <w:szCs w:val="18"/>
+              <w:rPr>
+                <w:highlight w:val="yellow"/>
+              </w:rPr>
+            </w:pPr>
+            <w:r>
+              <w:rPr>
+                <w:sz w:val="18"/>
+                <w:szCs w:val="18"/>
+                <w:highlight w:val="yellow"/>
               </w:rPr>
               <w:t>APROB</w:t>
             </w:r>
@@ -1934,11 +1967,15 @@
           <w:p>
             <w:pPr>
               <w:jc w:val="center"/>
-            </w:pPr>
-            <w:r>
-              <w:rPr>
-                <w:sz w:val="18"/>
-                <w:szCs w:val="18"/>
+              <w:rPr>
+                <w:highlight w:val="yellow"/>
+              </w:rPr>
+            </w:pPr>
+            <w:r>
+              <w:rPr>
+                <w:sz w:val="18"/>
+                <w:szCs w:val="18"/>
+                <w:highlight w:val="yellow"/>
               </w:rPr>
               <w:t>APROB</w:t>
             </w:r>
@@ -1958,11 +1995,15 @@
           <w:p>
             <w:pPr>
               <w:jc w:val="center"/>
-            </w:pPr>
-            <w:r>
-              <w:rPr>
-                <w:sz w:val="18"/>
-                <w:szCs w:val="18"/>
+              <w:rPr>
+                <w:highlight w:val="yellow"/>
+              </w:rPr>
+            </w:pPr>
+            <w:r>
+              <w:rPr>
+                <w:sz w:val="18"/>
+                <w:szCs w:val="18"/>
+                <w:highlight w:val="yellow"/>
               </w:rPr>
               <w:t>APROB</w:t>
             </w:r>
@@ -2127,6 +2168,13 @@
                 <w:sz w:val="18"/>
                 <w:szCs w:val="18"/>
               </w:rPr>
+              <w:t>X|</w:t>
+            </w:r>
+            <w:r>
+              <w:rPr>
+                <w:sz w:val="18"/>
+                <w:szCs w:val="18"/>
+              </w:rPr>
               <w:t>NO</w:t>
             </w:r>
           </w:p>
@@ -2487,11 +2535,306 @@
           <w:p>
             <w:pPr>
               <w:jc w:val="center"/>
+            </w:pPr>
+            <w:r>
+              <w:rPr>
+                <w:sz w:val="18"/>
+                <w:szCs w:val="18"/>
+                <w:highlight w:val="yellow"/>
+              </w:rPr>
+              <w:t>SI</w:t>
+            </w:r>
+          </w:p>
+        </w:tc>
+        <w:tc>
+          <w:tcPr>
+            <w:tcW w:w="890" w:type="dxa"/>
+            <w:tcMar>
+              <w:top w:w="40" w:type="dxa"/>
+              <w:left w:w="80" w:type="dxa"/>
+              <w:bottom w:w="40" w:type="dxa"/>
+              <w:right w:w="80" w:type="dxa"/>
+            </w:tcMar>
+          </w:tcPr>
+          <w:p>
+            <w:pPr>
+              <w:jc w:val="center"/>
+            </w:pPr>
+            <w:r>
+              <w:rPr>
+                <w:sz w:val="18"/>
+                <w:szCs w:val="18"/>
+              </w:rPr>
+              <w:t>SI</w:t>
+            </w:r>
+          </w:p>
+        </w:tc>
+        <w:tc>
+          <w:tcPr>
+            <w:tcW w:w="979" w:type="dxa"/>
+            <w:tcMar>
+              <w:top w:w="40" w:type="dxa"/>
+              <w:left w:w="80" w:type="dxa"/>
+              <w:bottom w:w="40" w:type="dxa"/>
+              <w:right w:w="80" w:type="dxa"/>
+            </w:tcMar>
+          </w:tcPr>
+          <w:p>
+            <w:pPr>
+              <w:jc w:val="center"/>
+            </w:pPr>
+            <w:r>
+              <w:rPr>
+                <w:sz w:val="18"/>
+                <w:szCs w:val="18"/>
+              </w:rPr>
+              <w:t>SI</w:t>
+            </w:r>
+          </w:p>
+        </w:tc>
+        <w:tc>
+          <w:tcPr>
+            <w:tcW w:w="979" w:type="dxa"/>
+            <w:tcMar>
+              <w:top w:w="40" w:type="dxa"/>
+              <w:left w:w="80" w:type="dxa"/>
+              <w:bottom w:w="40" w:type="dxa"/>
+              <w:right w:w="80" w:type="dxa"/>
+            </w:tcMar>
+          </w:tcPr>
+          <w:p>
+            <w:pPr>
+              <w:jc w:val="center"/>
+            </w:pPr>
+            <w:r>
+              <w:rPr>
+                <w:sz w:val="18"/>
+                <w:szCs w:val="18"/>
+              </w:rPr>
+              <w:t>SI</w:t>
+            </w:r>
+          </w:p>
+        </w:tc>
+      </w:tr>
+      <w:tr>
+        <w:tc>
+          <w:tcPr>
+            <w:tcW w:w="2305" w:type="dxa"/>
+            <w:shd w:val="clear" w:color="auto" w:fill="EEF3FA"/>
+            <w:tcMar>
+              <w:top w:w="40" w:type="dxa"/>
+              <w:left w:w="80" w:type="dxa"/>
+              <w:bottom w:w="40" w:type="dxa"/>
+              <w:right w:w="80" w:type="dxa"/>
+            </w:tcMar>
+          </w:tcPr>
+          <w:p>
+            <w:r>
               <w:rPr>
                 <w:b/>
                 <w:bCs/>
-              </w:rPr>
-            </w:pPr>
+                <w:sz w:val="18"/>
+                <w:szCs w:val="18"/>
+              </w:rPr>
+              <w:t>Documentos: subir</w:t>
+            </w:r>
+          </w:p>
+        </w:tc>
+        <w:tc>
+          <w:tcPr>
+            <w:tcW w:w="1240" w:type="dxa"/>
+            <w:shd w:val="clear" w:color="auto" w:fill="EEF3FA"/>
+            <w:tcMar>
+              <w:top w:w="40" w:type="dxa"/>
+              <w:left w:w="80" w:type="dxa"/>
+              <w:bottom w:w="40" w:type="dxa"/>
+              <w:right w:w="80" w:type="dxa"/>
+            </w:tcMar>
+          </w:tcPr>
+          <w:p>
+            <w:pPr>
+              <w:jc w:val="center"/>
+            </w:pPr>
+            <w:r>
+              <w:rPr>
+                <w:sz w:val="18"/>
+                <w:szCs w:val="18"/>
+                <w:highlight w:val="yellow"/>
+              </w:rPr>
+              <w:t>SI</w:t>
+            </w:r>
+          </w:p>
+        </w:tc>
+        <w:tc>
+          <w:tcPr>
+            <w:tcW w:w="1075" w:type="dxa"/>
+            <w:shd w:val="clear" w:color="auto" w:fill="EEF3FA"/>
+            <w:tcMar>
+              <w:top w:w="40" w:type="dxa"/>
+              <w:left w:w="80" w:type="dxa"/>
+              <w:bottom w:w="40" w:type="dxa"/>
+              <w:right w:w="80" w:type="dxa"/>
+            </w:tcMar>
+          </w:tcPr>
+          <w:p>
+            <w:pPr>
+              <w:jc w:val="center"/>
+            </w:pPr>
+            <w:r>
+              <w:rPr>
+                <w:sz w:val="18"/>
+                <w:szCs w:val="18"/>
+                <w:highlight w:val="yellow"/>
+              </w:rPr>
+              <w:t>SI</w:t>
+            </w:r>
+          </w:p>
+        </w:tc>
+        <w:tc>
+          <w:tcPr>
+            <w:tcW w:w="1011" w:type="dxa"/>
+            <w:shd w:val="clear" w:color="auto" w:fill="EEF3FA"/>
+            <w:tcMar>
+              <w:top w:w="40" w:type="dxa"/>
+              <w:left w:w="80" w:type="dxa"/>
+              <w:bottom w:w="40" w:type="dxa"/>
+              <w:right w:w="80" w:type="dxa"/>
+            </w:tcMar>
+          </w:tcPr>
+          <w:p>
+            <w:pPr>
+              <w:jc w:val="center"/>
+            </w:pPr>
+            <w:r>
+              <w:rPr>
+                <w:sz w:val="18"/>
+                <w:szCs w:val="18"/>
+              </w:rPr>
+              <w:t xml:space="preserve">SI </w:t>
+            </w:r>
+            <w:r>
+              <w:rPr>
+                <w:color w:val="FF0000"/>
+                <w:sz w:val="18"/>
+                <w:szCs w:val="18"/>
+              </w:rPr>
+              <w:t>(solicitando acceso)</w:t>
+            </w:r>
+          </w:p>
+        </w:tc>
+        <w:tc>
+          <w:tcPr>
+            <w:tcW w:w="1081" w:type="dxa"/>
+            <w:shd w:val="clear" w:color="auto" w:fill="EEF3FA"/>
+            <w:tcMar>
+              <w:top w:w="40" w:type="dxa"/>
+              <w:left w:w="80" w:type="dxa"/>
+              <w:bottom w:w="40" w:type="dxa"/>
+              <w:right w:w="80" w:type="dxa"/>
+            </w:tcMar>
+          </w:tcPr>
+          <w:p>
+            <w:pPr>
+              <w:jc w:val="center"/>
+            </w:pPr>
+            <w:r>
+              <w:rPr>
+                <w:sz w:val="18"/>
+                <w:szCs w:val="18"/>
+                <w:highlight w:val="yellow"/>
+              </w:rPr>
+              <w:t>NO</w:t>
+            </w:r>
+          </w:p>
+        </w:tc>
+        <w:tc>
+          <w:tcPr>
+            <w:tcW w:w="890" w:type="dxa"/>
+            <w:shd w:val="clear" w:color="auto" w:fill="EEF3FA"/>
+            <w:tcMar>
+              <w:top w:w="40" w:type="dxa"/>
+              <w:left w:w="80" w:type="dxa"/>
+              <w:bottom w:w="40" w:type="dxa"/>
+              <w:right w:w="80" w:type="dxa"/>
+            </w:tcMar>
+          </w:tcPr>
+          <w:p>
+            <w:pPr>
+              <w:jc w:val="center"/>
+            </w:pPr>
+            <w:r>
+              <w:rPr>
+                <w:sz w:val="18"/>
+                <w:szCs w:val="18"/>
+              </w:rPr>
+              <w:t>SI</w:t>
+            </w:r>
+          </w:p>
+        </w:tc>
+        <w:tc>
+          <w:tcPr>
+            <w:tcW w:w="979" w:type="dxa"/>
+            <w:shd w:val="clear" w:color="auto" w:fill="EEF3FA"/>
+            <w:tcMar>
+              <w:top w:w="40" w:type="dxa"/>
+              <w:left w:w="80" w:type="dxa"/>
+              <w:bottom w:w="40" w:type="dxa"/>
+              <w:right w:w="80" w:type="dxa"/>
+            </w:tcMar>
+          </w:tcPr>
+          <w:p>
+            <w:pPr>
+              <w:jc w:val="center"/>
+              <w:rPr>
+                <w:lang w:val="es-DO"/>
+              </w:rPr>
+            </w:pPr>
+            <w:r>
+              <w:rPr>
+                <w:sz w:val="18"/>
+                <w:szCs w:val="18"/>
+              </w:rPr>
+              <w:t>SI</w:t>
+            </w:r>
+          </w:p>
+        </w:tc>
+        <w:tc>
+          <w:tcPr>
+            <w:tcW w:w="979" w:type="dxa"/>
+            <w:shd w:val="clear" w:color="auto" w:fill="EEF3FA"/>
+            <w:tcMar>
+              <w:top w:w="40" w:type="dxa"/>
+              <w:left w:w="80" w:type="dxa"/>
+              <w:bottom w:w="40" w:type="dxa"/>
+              <w:right w:w="80" w:type="dxa"/>
+            </w:tcMar>
+          </w:tcPr>
+          <w:p>
+            <w:pPr>
+              <w:jc w:val="center"/>
+            </w:pPr>
+            <w:r>
+              <w:rPr>
+                <w:sz w:val="18"/>
+                <w:szCs w:val="18"/>
+              </w:rPr>
+              <w:t>SI</w:t>
+            </w:r>
+          </w:p>
+        </w:tc>
+      </w:tr>
+      <w:tr>
+        <w:tc>
+          <w:tcPr>
+            <w:tcW w:w="2305" w:type="dxa"/>
+            <w:tcMar>
+              <w:top w:w="40" w:type="dxa"/>
+              <w:left w:w="80" w:type="dxa"/>
+              <w:bottom w:w="40" w:type="dxa"/>
+              <w:right w:w="80" w:type="dxa"/>
+            </w:tcMar>
+          </w:tcPr>
+          <w:p>
             <w:r>
               <w:rPr>
                 <w:b/>
@@ -2499,76 +2842,175 @@
                 <w:sz w:val="18"/>
                 <w:szCs w:val="18"/>
               </w:rPr>
-              <w:t>SI</w:t>
+              <w:t>Documentos: eliminar</w:t>
+            </w:r>
+          </w:p>
+        </w:tc>
+        <w:tc>
+          <w:tcPr>
+            <w:tcW w:w="1240" w:type="dxa"/>
+            <w:shd w:val="clear" w:color="auto" w:fill="E7F4E4"/>
+            <w:tcMar>
+              <w:top w:w="40" w:type="dxa"/>
+              <w:left w:w="80" w:type="dxa"/>
+              <w:bottom w:w="40" w:type="dxa"/>
+              <w:right w:w="80" w:type="dxa"/>
+            </w:tcMar>
+          </w:tcPr>
+          <w:p>
+            <w:pPr>
+              <w:jc w:val="center"/>
+            </w:pPr>
+            <w:r>
+              <w:rPr>
+                <w:sz w:val="18"/>
+                <w:szCs w:val="18"/>
+              </w:rPr>
+              <w:t>SI</w:t>
+            </w:r>
+          </w:p>
+        </w:tc>
+        <w:tc>
+          <w:tcPr>
+            <w:tcW w:w="1075" w:type="dxa"/>
+            <w:shd w:val="clear" w:color="auto" w:fill="E7F4E4"/>
+            <w:tcMar>
+              <w:top w:w="40" w:type="dxa"/>
+              <w:left w:w="80" w:type="dxa"/>
+              <w:bottom w:w="40" w:type="dxa"/>
+              <w:right w:w="80" w:type="dxa"/>
+            </w:tcMar>
+          </w:tcPr>
+          <w:p>
+            <w:pPr>
+              <w:jc w:val="center"/>
+            </w:pPr>
+            <w:r>
+              <w:rPr>
+                <w:sz w:val="18"/>
+                <w:szCs w:val="18"/>
+              </w:rPr>
+              <w:t>SI</w:t>
+            </w:r>
+          </w:p>
+        </w:tc>
+        <w:tc>
+          <w:tcPr>
+            <w:tcW w:w="1011" w:type="dxa"/>
+            <w:shd w:val="clear" w:color="auto" w:fill="FFF4D6"/>
+            <w:tcMar>
+              <w:top w:w="40" w:type="dxa"/>
+              <w:left w:w="80" w:type="dxa"/>
+              <w:bottom w:w="40" w:type="dxa"/>
+              <w:right w:w="80" w:type="dxa"/>
+            </w:tcMar>
+          </w:tcPr>
+          <w:p>
+            <w:pPr>
+              <w:jc w:val="center"/>
+            </w:pPr>
+            <w:r>
+              <w:rPr>
+                <w:sz w:val="18"/>
+                <w:szCs w:val="18"/>
+              </w:rPr>
+              <w:t>SOLIC</w:t>
+            </w:r>
+          </w:p>
+        </w:tc>
+        <w:tc>
+          <w:tcPr>
+            <w:tcW w:w="1081" w:type="dxa"/>
+            <w:shd w:val="clear" w:color="auto" w:fill="FFF4D6"/>
+            <w:tcMar>
+              <w:top w:w="40" w:type="dxa"/>
+              <w:left w:w="80" w:type="dxa"/>
+              <w:bottom w:w="40" w:type="dxa"/>
+              <w:right w:w="80" w:type="dxa"/>
+            </w:tcMar>
+          </w:tcPr>
+          <w:p>
+            <w:pPr>
+              <w:jc w:val="center"/>
+            </w:pPr>
+            <w:r>
+              <w:rPr>
+                <w:sz w:val="18"/>
+                <w:szCs w:val="18"/>
+              </w:rPr>
+              <w:t>SOLIC</w:t>
             </w:r>
           </w:p>
         </w:tc>
         <w:tc>
           <w:tcPr>
             <w:tcW w:w="890" w:type="dxa"/>
-            <w:tcMar>
-              <w:top w:w="40" w:type="dxa"/>
-              <w:left w:w="80" w:type="dxa"/>
-              <w:bottom w:w="40" w:type="dxa"/>
-              <w:right w:w="80" w:type="dxa"/>
-            </w:tcMar>
-          </w:tcPr>
-          <w:p>
-            <w:pPr>
-              <w:jc w:val="center"/>
-            </w:pPr>
-            <w:r>
-              <w:rPr>
-                <w:sz w:val="18"/>
-                <w:szCs w:val="18"/>
-              </w:rPr>
-              <w:t>SI</w:t>
+            <w:shd w:val="clear" w:color="auto" w:fill="FFF4D6"/>
+            <w:tcMar>
+              <w:top w:w="40" w:type="dxa"/>
+              <w:left w:w="80" w:type="dxa"/>
+              <w:bottom w:w="40" w:type="dxa"/>
+              <w:right w:w="80" w:type="dxa"/>
+            </w:tcMar>
+          </w:tcPr>
+          <w:p>
+            <w:pPr>
+              <w:jc w:val="center"/>
+            </w:pPr>
+            <w:r>
+              <w:rPr>
+                <w:sz w:val="18"/>
+                <w:szCs w:val="18"/>
+              </w:rPr>
+              <w:t>SOLIC</w:t>
             </w:r>
           </w:p>
         </w:tc>
         <w:tc>
           <w:tcPr>
             <w:tcW w:w="979" w:type="dxa"/>
-            <w:tcMar>
-              <w:top w:w="40" w:type="dxa"/>
-              <w:left w:w="80" w:type="dxa"/>
-              <w:bottom w:w="40" w:type="dxa"/>
-              <w:right w:w="80" w:type="dxa"/>
-            </w:tcMar>
-          </w:tcPr>
-          <w:p>
-            <w:pPr>
-              <w:jc w:val="center"/>
-            </w:pPr>
-            <w:r>
-              <w:rPr>
-                <w:sz w:val="18"/>
-                <w:szCs w:val="18"/>
-              </w:rPr>
-              <w:t>SI</w:t>
+            <w:shd w:val="clear" w:color="auto" w:fill="FFF4D6"/>
+            <w:tcMar>
+              <w:top w:w="40" w:type="dxa"/>
+              <w:left w:w="80" w:type="dxa"/>
+              <w:bottom w:w="40" w:type="dxa"/>
+              <w:right w:w="80" w:type="dxa"/>
+            </w:tcMar>
+          </w:tcPr>
+          <w:p>
+            <w:pPr>
+              <w:jc w:val="center"/>
+            </w:pPr>
+            <w:r>
+              <w:rPr>
+                <w:sz w:val="18"/>
+                <w:szCs w:val="18"/>
+              </w:rPr>
+              <w:t>SOLIC</w:t>
             </w:r>
           </w:p>
         </w:tc>
         <w:tc>
           <w:tcPr>
             <w:tcW w:w="979" w:type="dxa"/>
-            <w:tcMar>
-              <w:top w:w="40" w:type="dxa"/>
-              <w:left w:w="80" w:type="dxa"/>
-              <w:bottom w:w="40" w:type="dxa"/>
-              <w:right w:w="80" w:type="dxa"/>
-            </w:tcMar>
-          </w:tcPr>
-          <w:p>
-            <w:pPr>
-              <w:jc w:val="center"/>
-            </w:pPr>
-            <w:r>
-              <w:rPr>
-                <w:sz w:val="18"/>
-                <w:szCs w:val="18"/>
-              </w:rPr>
-              <w:t>SI</w:t>
+            <w:shd w:val="clear" w:color="auto" w:fill="FFF4D6"/>
+            <w:tcMar>
+              <w:top w:w="40" w:type="dxa"/>
+              <w:left w:w="80" w:type="dxa"/>
+              <w:bottom w:w="40" w:type="dxa"/>
+              <w:right w:w="80" w:type="dxa"/>
+            </w:tcMar>
+          </w:tcPr>
+          <w:p>
+            <w:pPr>
+              <w:jc w:val="center"/>
+            </w:pPr>
+            <w:r>
+              <w:rPr>
+                <w:sz w:val="18"/>
+                <w:szCs w:val="18"/>
+              </w:rPr>
+              <w:t>SOLIC</w:t>
             </w:r>
           </w:p>
         </w:tc>
@@ -2593,7 +3035,7 @@
                 <w:sz w:val="18"/>
                 <w:szCs w:val="18"/>
               </w:rPr>
-              <w:t>Documentos: subir</w:t>
+              <w:t>Asistencia (ver/crear/editar)</w:t>
             </w:r>
           </w:p>
         </w:tc>
@@ -2666,16 +3108,9 @@
               <w:rPr>
                 <w:sz w:val="18"/>
                 <w:szCs w:val="18"/>
-              </w:rPr>
-              <w:t xml:space="preserve">SI </w:t>
-            </w:r>
-            <w:r>
-              <w:rPr>
-                <w:color w:val="FF0000"/>
-                <w:sz w:val="18"/>
-                <w:szCs w:val="18"/>
-              </w:rPr>
-              <w:t>(solicitando acceso)</w:t>
+                <w:highlight w:val="yellow"/>
+              </w:rPr>
+              <w:t>SI</w:t>
             </w:r>
           </w:p>
         </w:tc>
@@ -2698,9 +3133,8 @@
               <w:rPr>
                 <w:sz w:val="18"/>
                 <w:szCs w:val="18"/>
-                <w:highlight w:val="yellow"/>
-              </w:rPr>
-              <w:t>NO</w:t>
+              </w:rPr>
+              <w:t>SI</w:t>
             </w:r>
           </w:p>
         </w:tc>
@@ -2796,7 +3230,7 @@
                 <w:sz w:val="18"/>
                 <w:szCs w:val="18"/>
               </w:rPr>
-              <w:t>Documentos: eliminar</w:t>
+              <w:t>Dispensa Medica: ver/editar</w:t>
             </w:r>
           </w:p>
         </w:tc>
@@ -2819,8 +3253,9 @@
               <w:rPr>
                 <w:sz w:val="18"/>
                 <w:szCs w:val="18"/>
-              </w:rPr>
-              <w:t>SI</w:t>
+                <w:highlight w:val="yellow"/>
+              </w:rPr>
+              <w:t>COMPL</w:t>
             </w:r>
           </w:p>
         </w:tc>
@@ -2844,7 +3279,7 @@
                 <w:sz w:val="18"/>
                 <w:szCs w:val="18"/>
               </w:rPr>
-              <w:t>SI</w:t>
+              <w:t>COMPL</w:t>
             </w:r>
           </w:p>
         </w:tc>
@@ -2868,7 +3303,7 @@
                 <w:sz w:val="18"/>
                 <w:szCs w:val="18"/>
               </w:rPr>
-              <w:t>SOLIC</w:t>
+              <w:t>APROB</w:t>
             </w:r>
           </w:p>
         </w:tc>
@@ -2891,8 +3326,9 @@
               <w:rPr>
                 <w:sz w:val="18"/>
                 <w:szCs w:val="18"/>
-              </w:rPr>
-              <w:t>SOLIC</w:t>
+                <w:highlight w:val="yellow"/>
+              </w:rPr>
+              <w:t>NO (solo lectura)</w:t>
             </w:r>
           </w:p>
         </w:tc>
@@ -2916,7 +3352,7 @@
                 <w:sz w:val="18"/>
                 <w:szCs w:val="18"/>
               </w:rPr>
-              <w:t>SOLIC</w:t>
+              <w:t>APROB</w:t>
             </w:r>
           </w:p>
         </w:tc>
@@ -2940,7 +3376,7 @@
                 <w:sz w:val="18"/>
                 <w:szCs w:val="18"/>
               </w:rPr>
-              <w:t>SOLIC</w:t>
+              <w:t>APROB</w:t>
             </w:r>
           </w:p>
         </w:tc>
@@ -2964,7 +3400,7 @@
                 <w:sz w:val="18"/>
                 <w:szCs w:val="18"/>
               </w:rPr>
-              <w:t>SOLIC</w:t>
+              <w:t>APROB</w:t>
             </w:r>
           </w:p>
         </w:tc>
@@ -2989,7 +3425,7 @@
                 <w:sz w:val="18"/>
                 <w:szCs w:val="18"/>
               </w:rPr>
-              <w:t>Asistencia (ver/crear/editar)</w:t>
+              <w:t>Salud: subir documentos</w:t>
             </w:r>
           </w:p>
         </w:tc>
@@ -3057,14 +3493,17 @@
           <w:p>
             <w:pPr>
               <w:jc w:val="center"/>
-            </w:pPr>
-            <w:r>
-              <w:rPr>
-                <w:sz w:val="18"/>
-                <w:szCs w:val="18"/>
-                <w:highlight w:val="yellow"/>
-              </w:rPr>
-              <w:t>SI</w:t>
+              <w:rPr>
+                <w:highlight w:val="yellow"/>
+              </w:rPr>
+            </w:pPr>
+            <w:r>
+              <w:rPr>
+                <w:sz w:val="18"/>
+                <w:szCs w:val="18"/>
+                <w:highlight w:val="yellow"/>
+              </w:rPr>
+              <w:t>NO</w:t>
             </w:r>
           </w:p>
         </w:tc>
@@ -3082,13 +3521,17 @@
           <w:p>
             <w:pPr>
               <w:jc w:val="center"/>
-            </w:pPr>
-            <w:r>
-              <w:rPr>
-                <w:sz w:val="18"/>
-                <w:szCs w:val="18"/>
-              </w:rPr>
-              <w:t>SI</w:t>
+              <w:rPr>
+                <w:highlight w:val="yellow"/>
+              </w:rPr>
+            </w:pPr>
+            <w:r>
+              <w:rPr>
+                <w:sz w:val="18"/>
+                <w:szCs w:val="18"/>
+                <w:highlight w:val="yellow"/>
+              </w:rPr>
+              <w:t>NO</w:t>
             </w:r>
           </w:p>
         </w:tc>
@@ -3184,7 +3627,7 @@
                 <w:sz w:val="18"/>
                 <w:szCs w:val="18"/>
               </w:rPr>
-              <w:t>Dispensa Medica: ver/editar</w:t>
+              <w:t>Salud: eliminar documentos</w:t>
             </w:r>
           </w:p>
         </w:tc>
@@ -3207,9 +3650,8 @@
               <w:rPr>
                 <w:sz w:val="18"/>
                 <w:szCs w:val="18"/>
-                <w:highlight w:val="yellow"/>
-              </w:rPr>
-              <w:t>COMPL</w:t>
+              </w:rPr>
+              <w:t>SI</w:t>
             </w:r>
           </w:p>
         </w:tc>
@@ -3233,128 +3675,126 @@
                 <w:sz w:val="18"/>
                 <w:szCs w:val="18"/>
               </w:rPr>
-              <w:t>COMPL</w:t>
+              <w:t>SI</w:t>
             </w:r>
           </w:p>
         </w:tc>
         <w:tc>
           <w:tcPr>
             <w:tcW w:w="1011" w:type="dxa"/>
-            <w:shd w:val="clear" w:color="auto" w:fill="FFF4D6"/>
-            <w:tcMar>
-              <w:top w:w="40" w:type="dxa"/>
-              <w:left w:w="80" w:type="dxa"/>
-              <w:bottom w:w="40" w:type="dxa"/>
-              <w:right w:w="80" w:type="dxa"/>
-            </w:tcMar>
-          </w:tcPr>
-          <w:p>
-            <w:pPr>
-              <w:jc w:val="center"/>
-            </w:pPr>
-            <w:r>
-              <w:rPr>
-                <w:sz w:val="18"/>
-                <w:szCs w:val="18"/>
-              </w:rPr>
-              <w:t>APROB</w:t>
+            <w:tcMar>
+              <w:top w:w="40" w:type="dxa"/>
+              <w:left w:w="80" w:type="dxa"/>
+              <w:bottom w:w="40" w:type="dxa"/>
+              <w:right w:w="80" w:type="dxa"/>
+            </w:tcMar>
+          </w:tcPr>
+          <w:p>
+            <w:pPr>
+              <w:jc w:val="center"/>
+            </w:pPr>
+            <w:r>
+              <w:rPr>
+                <w:sz w:val="18"/>
+                <w:szCs w:val="18"/>
+              </w:rPr>
+              <w:t>NO</w:t>
             </w:r>
           </w:p>
         </w:tc>
         <w:tc>
           <w:tcPr>
             <w:tcW w:w="1081" w:type="dxa"/>
-            <w:shd w:val="clear" w:color="auto" w:fill="FFF4D6"/>
-            <w:tcMar>
-              <w:top w:w="40" w:type="dxa"/>
-              <w:left w:w="80" w:type="dxa"/>
-              <w:bottom w:w="40" w:type="dxa"/>
-              <w:right w:w="80" w:type="dxa"/>
-            </w:tcMar>
-          </w:tcPr>
-          <w:p>
-            <w:pPr>
-              <w:jc w:val="center"/>
-            </w:pPr>
-            <w:r>
-              <w:rPr>
-                <w:sz w:val="18"/>
-                <w:szCs w:val="18"/>
-                <w:highlight w:val="yellow"/>
-              </w:rPr>
-              <w:t>NO (solo lectura)</w:t>
+            <w:tcMar>
+              <w:top w:w="40" w:type="dxa"/>
+              <w:left w:w="80" w:type="dxa"/>
+              <w:bottom w:w="40" w:type="dxa"/>
+              <w:right w:w="80" w:type="dxa"/>
+            </w:tcMar>
+          </w:tcPr>
+          <w:p>
+            <w:pPr>
+              <w:jc w:val="center"/>
+              <w:rPr>
+                <w:highlight w:val="yellow"/>
+              </w:rPr>
+            </w:pPr>
+            <w:r>
+              <w:rPr>
+                <w:sz w:val="18"/>
+                <w:szCs w:val="18"/>
+                <w:highlight w:val="yellow"/>
+              </w:rPr>
+              <w:t>NO</w:t>
             </w:r>
           </w:p>
         </w:tc>
         <w:tc>
           <w:tcPr>
             <w:tcW w:w="890" w:type="dxa"/>
-            <w:shd w:val="clear" w:color="auto" w:fill="FFF4D6"/>
-            <w:tcMar>
-              <w:top w:w="40" w:type="dxa"/>
-              <w:left w:w="80" w:type="dxa"/>
-              <w:bottom w:w="40" w:type="dxa"/>
-              <w:right w:w="80" w:type="dxa"/>
-            </w:tcMar>
-          </w:tcPr>
-          <w:p>
-            <w:pPr>
-              <w:jc w:val="center"/>
-            </w:pPr>
-            <w:r>
-              <w:rPr>
-                <w:sz w:val="18"/>
-                <w:szCs w:val="18"/>
-              </w:rPr>
-              <w:t>APROB</w:t>
+            <w:tcMar>
+              <w:top w:w="40" w:type="dxa"/>
+              <w:left w:w="80" w:type="dxa"/>
+              <w:bottom w:w="40" w:type="dxa"/>
+              <w:right w:w="80" w:type="dxa"/>
+            </w:tcMar>
+          </w:tcPr>
+          <w:p>
+            <w:pPr>
+              <w:jc w:val="center"/>
+            </w:pPr>
+            <w:r>
+              <w:rPr>
+                <w:sz w:val="18"/>
+                <w:szCs w:val="18"/>
+              </w:rPr>
+              <w:t>NO</w:t>
             </w:r>
           </w:p>
         </w:tc>
         <w:tc>
           <w:tcPr>
             <w:tcW w:w="979" w:type="dxa"/>
-            <w:shd w:val="clear" w:color="auto" w:fill="FFF4D6"/>
-            <w:tcMar>
-              <w:top w:w="40" w:type="dxa"/>
-              <w:left w:w="80" w:type="dxa"/>
-              <w:bottom w:w="40" w:type="dxa"/>
-              <w:right w:w="80" w:type="dxa"/>
-            </w:tcMar>
-          </w:tcPr>
-          <w:p>
-            <w:pPr>
-              <w:jc w:val="center"/>
-            </w:pPr>
-            <w:r>
-              <w:rPr>
-                <w:sz w:val="18"/>
-                <w:szCs w:val="18"/>
-              </w:rPr>
-              <w:t>APROB</w:t>
+            <w:tcMar>
+              <w:top w:w="40" w:type="dxa"/>
+              <w:left w:w="80" w:type="dxa"/>
+              <w:bottom w:w="40" w:type="dxa"/>
+              <w:right w:w="80" w:type="dxa"/>
+            </w:tcMar>
+          </w:tcPr>
+          <w:p>
+            <w:pPr>
+              <w:jc w:val="center"/>
+            </w:pPr>
+            <w:r>
+              <w:rPr>
+                <w:sz w:val="18"/>
+                <w:szCs w:val="18"/>
+              </w:rPr>
+              <w:t>NO</w:t>
             </w:r>
           </w:p>
         </w:tc>
         <w:tc>
           <w:tcPr>
             <w:tcW w:w="979" w:type="dxa"/>
-            <w:shd w:val="clear" w:color="auto" w:fill="FFF4D6"/>
-            <w:tcMar>
-              <w:top w:w="40" w:type="dxa"/>
-              <w:left w:w="80" w:type="dxa"/>
-              <w:bottom w:w="40" w:type="dxa"/>
-              <w:right w:w="80" w:type="dxa"/>
-            </w:tcMar>
-          </w:tcPr>
-          <w:p>
-            <w:pPr>
-              <w:jc w:val="center"/>
-            </w:pPr>
-            <w:r>
-              <w:rPr>
-                <w:sz w:val="18"/>
-                <w:szCs w:val="18"/>
-              </w:rPr>
-              <w:t>APROB</w:t>
+            <w:tcMar>
+              <w:top w:w="40" w:type="dxa"/>
+              <w:left w:w="80" w:type="dxa"/>
+              <w:bottom w:w="40" w:type="dxa"/>
+              <w:right w:w="80" w:type="dxa"/>
+            </w:tcMar>
+          </w:tcPr>
+          <w:p>
+            <w:pPr>
+              <w:jc w:val="center"/>
+            </w:pPr>
+            <w:r>
+              <w:rPr>
+                <w:sz w:val="18"/>
+                <w:szCs w:val="18"/>
+              </w:rPr>
+              <w:t>NO</w:t>
             </w:r>
           </w:p>
         </w:tc>
@@ -3379,7 +3819,392 @@
                 <w:sz w:val="18"/>
                 <w:szCs w:val="18"/>
               </w:rPr>
-              <w:t>Salud: subir documentos</w:t>
+              <w:t>Salud: autorizar accesos menores</w:t>
+            </w:r>
+          </w:p>
+        </w:tc>
+        <w:tc>
+          <w:tcPr>
+            <w:tcW w:w="1240" w:type="dxa"/>
+            <w:shd w:val="clear" w:color="auto" w:fill="E7F4E4"/>
+            <w:tcMar>
+              <w:top w:w="40" w:type="dxa"/>
+              <w:left w:w="80" w:type="dxa"/>
+              <w:bottom w:w="40" w:type="dxa"/>
+              <w:right w:w="80" w:type="dxa"/>
+            </w:tcMar>
+          </w:tcPr>
+          <w:p>
+            <w:pPr>
+              <w:jc w:val="center"/>
+            </w:pPr>
+            <w:r>
+              <w:rPr>
+                <w:sz w:val="18"/>
+                <w:szCs w:val="18"/>
+              </w:rPr>
+              <w:t>SI</w:t>
+            </w:r>
+          </w:p>
+        </w:tc>
+        <w:tc>
+          <w:tcPr>
+            <w:tcW w:w="1075" w:type="dxa"/>
+            <w:shd w:val="clear" w:color="auto" w:fill="E7F4E4"/>
+            <w:tcMar>
+              <w:top w:w="40" w:type="dxa"/>
+              <w:left w:w="80" w:type="dxa"/>
+              <w:bottom w:w="40" w:type="dxa"/>
+              <w:right w:w="80" w:type="dxa"/>
+            </w:tcMar>
+          </w:tcPr>
+          <w:p>
+            <w:pPr>
+              <w:jc w:val="center"/>
+            </w:pPr>
+            <w:r>
+              <w:rPr>
+                <w:sz w:val="18"/>
+                <w:szCs w:val="18"/>
+              </w:rPr>
+              <w:t>SI</w:t>
+            </w:r>
+          </w:p>
+        </w:tc>
+        <w:tc>
+          <w:tcPr>
+            <w:tcW w:w="1011" w:type="dxa"/>
+            <w:shd w:val="clear" w:color="auto" w:fill="EEF3FA"/>
+            <w:tcMar>
+              <w:top w:w="40" w:type="dxa"/>
+              <w:left w:w="80" w:type="dxa"/>
+              <w:bottom w:w="40" w:type="dxa"/>
+              <w:right w:w="80" w:type="dxa"/>
+            </w:tcMar>
+          </w:tcPr>
+          <w:p>
+            <w:pPr>
+              <w:jc w:val="center"/>
+            </w:pPr>
+            <w:r>
+              <w:rPr>
+                <w:sz w:val="18"/>
+                <w:szCs w:val="18"/>
+              </w:rPr>
+              <w:t>NO</w:t>
+            </w:r>
+          </w:p>
+        </w:tc>
+        <w:tc>
+          <w:tcPr>
+            <w:tcW w:w="1081" w:type="dxa"/>
+            <w:shd w:val="clear" w:color="auto" w:fill="EEF3FA"/>
+            <w:tcMar>
+              <w:top w:w="40" w:type="dxa"/>
+              <w:left w:w="80" w:type="dxa"/>
+              <w:bottom w:w="40" w:type="dxa"/>
+              <w:right w:w="80" w:type="dxa"/>
+            </w:tcMar>
+          </w:tcPr>
+          <w:p>
+            <w:pPr>
+              <w:jc w:val="center"/>
+            </w:pPr>
+            <w:r>
+              <w:rPr>
+                <w:sz w:val="18"/>
+                <w:szCs w:val="18"/>
+              </w:rPr>
+              <w:t>NO</w:t>
+            </w:r>
+          </w:p>
+        </w:tc>
+        <w:tc>
+          <w:tcPr>
+            <w:tcW w:w="890" w:type="dxa"/>
+            <w:shd w:val="clear" w:color="auto" w:fill="EEF3FA"/>
+            <w:tcMar>
+              <w:top w:w="40" w:type="dxa"/>
+              <w:left w:w="80" w:type="dxa"/>
+              <w:bottom w:w="40" w:type="dxa"/>
+              <w:right w:w="80" w:type="dxa"/>
+            </w:tcMar>
+          </w:tcPr>
+          <w:p>
+            <w:pPr>
+              <w:jc w:val="center"/>
+            </w:pPr>
+            <w:r>
+              <w:rPr>
+                <w:sz w:val="18"/>
+                <w:szCs w:val="18"/>
+              </w:rPr>
+              <w:t>NO</w:t>
+            </w:r>
+          </w:p>
+        </w:tc>
+        <w:tc>
+          <w:tcPr>
+            <w:tcW w:w="979" w:type="dxa"/>
+            <w:shd w:val="clear" w:color="auto" w:fill="EEF3FA"/>
+            <w:tcMar>
+              <w:top w:w="40" w:type="dxa"/>
+              <w:left w:w="80" w:type="dxa"/>
+              <w:bottom w:w="40" w:type="dxa"/>
+              <w:right w:w="80" w:type="dxa"/>
+            </w:tcMar>
+          </w:tcPr>
+          <w:p>
+            <w:pPr>
+              <w:jc w:val="center"/>
+            </w:pPr>
+            <w:r>
+              <w:rPr>
+                <w:sz w:val="18"/>
+                <w:szCs w:val="18"/>
+              </w:rPr>
+              <w:t>NO</w:t>
+            </w:r>
+          </w:p>
+        </w:tc>
+        <w:tc>
+          <w:tcPr>
+            <w:tcW w:w="979" w:type="dxa"/>
+            <w:shd w:val="clear" w:color="auto" w:fill="EEF3FA"/>
+            <w:tcMar>
+              <w:top w:w="40" w:type="dxa"/>
+              <w:left w:w="80" w:type="dxa"/>
+              <w:bottom w:w="40" w:type="dxa"/>
+              <w:right w:w="80" w:type="dxa"/>
+            </w:tcMar>
+          </w:tcPr>
+          <w:p>
+            <w:pPr>
+              <w:jc w:val="center"/>
+            </w:pPr>
+            <w:r>
+              <w:rPr>
+                <w:sz w:val="18"/>
+                <w:szCs w:val="18"/>
+              </w:rPr>
+              <w:t>NO</w:t>
+            </w:r>
+          </w:p>
+        </w:tc>
+      </w:tr>
+      <w:tr>
+        <w:tc>
+          <w:tcPr>
+            <w:tcW w:w="2305" w:type="dxa"/>
+            <w:tcMar>
+              <w:top w:w="40" w:type="dxa"/>
+              <w:left w:w="80" w:type="dxa"/>
+              <w:bottom w:w="40" w:type="dxa"/>
+              <w:right w:w="80" w:type="dxa"/>
+            </w:tcMar>
+          </w:tcPr>
+          <w:p>
+            <w:r>
+              <w:rPr>
+                <w:b/>
+                <w:bCs/>
+                <w:sz w:val="18"/>
+                <w:szCs w:val="18"/>
+              </w:rPr>
+              <w:t>Sistema de Ascenso: ver/editar</w:t>
+            </w:r>
+          </w:p>
+        </w:tc>
+        <w:tc>
+          <w:tcPr>
+            <w:tcW w:w="1240" w:type="dxa"/>
+            <w:tcMar>
+              <w:top w:w="40" w:type="dxa"/>
+              <w:left w:w="80" w:type="dxa"/>
+              <w:bottom w:w="40" w:type="dxa"/>
+              <w:right w:w="80" w:type="dxa"/>
+            </w:tcMar>
+          </w:tcPr>
+          <w:p>
+            <w:pPr>
+              <w:jc w:val="center"/>
+            </w:pPr>
+            <w:r>
+              <w:rPr>
+                <w:sz w:val="18"/>
+                <w:szCs w:val="18"/>
+                <w:highlight w:val="yellow"/>
+              </w:rPr>
+              <w:t>SI</w:t>
+            </w:r>
+          </w:p>
+        </w:tc>
+        <w:tc>
+          <w:tcPr>
+            <w:tcW w:w="1075" w:type="dxa"/>
+            <w:tcMar>
+              <w:top w:w="40" w:type="dxa"/>
+              <w:left w:w="80" w:type="dxa"/>
+              <w:bottom w:w="40" w:type="dxa"/>
+              <w:right w:w="80" w:type="dxa"/>
+            </w:tcMar>
+          </w:tcPr>
+          <w:p>
+            <w:pPr>
+              <w:jc w:val="center"/>
+            </w:pPr>
+            <w:r>
+              <w:rPr>
+                <w:sz w:val="18"/>
+                <w:szCs w:val="18"/>
+                <w:highlight w:val="yellow"/>
+              </w:rPr>
+              <w:t>SI</w:t>
+            </w:r>
+          </w:p>
+        </w:tc>
+        <w:tc>
+          <w:tcPr>
+            <w:tcW w:w="1011" w:type="dxa"/>
+            <w:tcMar>
+              <w:top w:w="40" w:type="dxa"/>
+              <w:left w:w="80" w:type="dxa"/>
+              <w:bottom w:w="40" w:type="dxa"/>
+              <w:right w:w="80" w:type="dxa"/>
+            </w:tcMar>
+          </w:tcPr>
+          <w:p>
+            <w:pPr>
+              <w:jc w:val="center"/>
+              <w:rPr>
+                <w:lang w:val="es-ES"/>
+              </w:rPr>
+            </w:pPr>
+            <w:r>
+              <w:rPr>
+                <w:sz w:val="18"/>
+                <w:szCs w:val="18"/>
+                <w:highlight w:val="yellow"/>
+              </w:rPr>
+              <w:t>SI (solo ver)</w:t>
+            </w:r>
+          </w:p>
+        </w:tc>
+        <w:tc>
+          <w:tcPr>
+            <w:tcW w:w="1081" w:type="dxa"/>
+            <w:tcMar>
+              <w:top w:w="40" w:type="dxa"/>
+              <w:left w:w="80" w:type="dxa"/>
+              <w:bottom w:w="40" w:type="dxa"/>
+              <w:right w:w="80" w:type="dxa"/>
+            </w:tcMar>
+          </w:tcPr>
+          <w:p>
+            <w:pPr>
+              <w:jc w:val="center"/>
+            </w:pPr>
+            <w:r>
+              <w:rPr>
+                <w:sz w:val="18"/>
+                <w:szCs w:val="18"/>
+                <w:highlight w:val="yellow"/>
+              </w:rPr>
+              <w:t>SI (solo ver)</w:t>
+            </w:r>
+          </w:p>
+        </w:tc>
+        <w:tc>
+          <w:tcPr>
+            <w:tcW w:w="890" w:type="dxa"/>
+            <w:tcMar>
+              <w:top w:w="40" w:type="dxa"/>
+              <w:left w:w="80" w:type="dxa"/>
+              <w:bottom w:w="40" w:type="dxa"/>
+              <w:right w:w="80" w:type="dxa"/>
+            </w:tcMar>
+          </w:tcPr>
+          <w:p>
+            <w:pPr>
+              <w:jc w:val="center"/>
+            </w:pPr>
+            <w:r>
+              <w:rPr>
+                <w:sz w:val="18"/>
+                <w:szCs w:val="18"/>
+              </w:rPr>
+              <w:t>SI</w:t>
+            </w:r>
+          </w:p>
+        </w:tc>
+        <w:tc>
+          <w:tcPr>
+            <w:tcW w:w="979" w:type="dxa"/>
+            <w:tcMar>
+              <w:top w:w="40" w:type="dxa"/>
+              <w:left w:w="80" w:type="dxa"/>
+              <w:bottom w:w="40" w:type="dxa"/>
+              <w:right w:w="80" w:type="dxa"/>
+            </w:tcMar>
+          </w:tcPr>
+          <w:p>
+            <w:pPr>
+              <w:jc w:val="center"/>
+            </w:pPr>
+            <w:r>
+              <w:rPr>
+                <w:sz w:val="18"/>
+                <w:szCs w:val="18"/>
+              </w:rPr>
+              <w:t>SI</w:t>
+            </w:r>
+          </w:p>
+        </w:tc>
+        <w:tc>
+          <w:tcPr>
+            <w:tcW w:w="979" w:type="dxa"/>
+            <w:tcMar>
+              <w:top w:w="40" w:type="dxa"/>
+              <w:left w:w="80" w:type="dxa"/>
+              <w:bottom w:w="40" w:type="dxa"/>
+              <w:right w:w="80" w:type="dxa"/>
+            </w:tcMar>
+          </w:tcPr>
+          <w:p>
+            <w:pPr>
+              <w:jc w:val="center"/>
+            </w:pPr>
+            <w:r>
+              <w:rPr>
+                <w:sz w:val="18"/>
+                <w:szCs w:val="18"/>
+              </w:rPr>
+              <w:t>SI</w:t>
+            </w:r>
+          </w:p>
+        </w:tc>
+      </w:tr>
+      <w:tr>
+        <w:tc>
+          <w:tcPr>
+            <w:tcW w:w="2305" w:type="dxa"/>
+            <w:shd w:val="clear" w:color="auto" w:fill="EEF3FA"/>
+            <w:tcMar>
+              <w:top w:w="40" w:type="dxa"/>
+              <w:left w:w="80" w:type="dxa"/>
+              <w:bottom w:w="40" w:type="dxa"/>
+              <w:right w:w="80" w:type="dxa"/>
+            </w:tcMar>
+          </w:tcPr>
+          <w:p>
+            <w:r>
+              <w:rPr>
+                <w:b/>
+                <w:bCs/>
+                <w:sz w:val="18"/>
+                <w:szCs w:val="18"/>
+              </w:rPr>
+              <w:t>Padres/tutores: ver/editar</w:t>
             </w:r>
           </w:p>
         </w:tc>
@@ -3402,7 +4227,6 @@
               <w:rPr>
                 <w:sz w:val="18"/>
                 <w:szCs w:val="18"/>
-                <w:highlight w:val="yellow"/>
               </w:rPr>
               <w:t>SI</w:t>
             </w:r>
@@ -3427,7 +4251,6 @@
               <w:rPr>
                 <w:sz w:val="18"/>
                 <w:szCs w:val="18"/>
-                <w:highlight w:val="yellow"/>
               </w:rPr>
               <w:t>SI</w:t>
             </w:r>
@@ -3447,17 +4270,13 @@
           <w:p>
             <w:pPr>
               <w:jc w:val="center"/>
-              <w:rPr>
-                <w:highlight w:val="yellow"/>
-              </w:rPr>
-            </w:pPr>
-            <w:r>
-              <w:rPr>
-                <w:sz w:val="18"/>
-                <w:szCs w:val="18"/>
-                <w:highlight w:val="yellow"/>
-              </w:rPr>
-              <w:t>NO</w:t>
+            </w:pPr>
+            <w:r>
+              <w:rPr>
+                <w:sz w:val="18"/>
+                <w:szCs w:val="18"/>
+              </w:rPr>
+              <w:t>SI</w:t>
             </w:r>
           </w:p>
         </w:tc>
@@ -3475,17 +4294,13 @@
           <w:p>
             <w:pPr>
               <w:jc w:val="center"/>
-              <w:rPr>
-                <w:highlight w:val="yellow"/>
-              </w:rPr>
-            </w:pPr>
-            <w:r>
-              <w:rPr>
-                <w:sz w:val="18"/>
-                <w:szCs w:val="18"/>
-                <w:highlight w:val="yellow"/>
-              </w:rPr>
-              <w:t>NO</w:t>
+            </w:pPr>
+            <w:r>
+              <w:rPr>
+                <w:sz w:val="18"/>
+                <w:szCs w:val="18"/>
+              </w:rPr>
+              <w:t>SI</w:t>
             </w:r>
           </w:p>
         </w:tc>
@@ -3581,53 +4396,68 @@
                 <w:sz w:val="18"/>
                 <w:szCs w:val="18"/>
               </w:rPr>
-              <w:t>Salud: eliminar documentos</w:t>
+              <w:t>Ver Regiones (menú)</w:t>
             </w:r>
           </w:p>
         </w:tc>
         <w:tc>
           <w:tcPr>
             <w:tcW w:w="1240" w:type="dxa"/>
-            <w:shd w:val="clear" w:color="auto" w:fill="E7F4E4"/>
-            <w:tcMar>
-              <w:top w:w="40" w:type="dxa"/>
-              <w:left w:w="80" w:type="dxa"/>
-              <w:bottom w:w="40" w:type="dxa"/>
-              <w:right w:w="80" w:type="dxa"/>
-            </w:tcMar>
-          </w:tcPr>
-          <w:p>
-            <w:pPr>
-              <w:jc w:val="center"/>
-            </w:pPr>
-            <w:r>
-              <w:rPr>
-                <w:sz w:val="18"/>
-                <w:szCs w:val="18"/>
-              </w:rPr>
-              <w:t>SI</w:t>
+            <w:tcMar>
+              <w:top w:w="40" w:type="dxa"/>
+              <w:left w:w="80" w:type="dxa"/>
+              <w:bottom w:w="40" w:type="dxa"/>
+              <w:right w:w="80" w:type="dxa"/>
+            </w:tcMar>
+          </w:tcPr>
+          <w:p>
+            <w:pPr>
+              <w:jc w:val="center"/>
+            </w:pPr>
+            <w:r>
+              <w:rPr>
+                <w:sz w:val="18"/>
+                <w:szCs w:val="18"/>
+                <w:highlight w:val="yellow"/>
+              </w:rPr>
+              <w:t>SI</w:t>
+            </w:r>
+            <w:r>
+              <w:rPr>
+                <w:sz w:val="18"/>
+                <w:szCs w:val="18"/>
+              </w:rPr>
+              <w:t xml:space="preserve"> </w:t>
+            </w:r>
+            <w:r>
+              <w:rPr>
+                <w:color w:val="FF0000"/>
+                <w:sz w:val="18"/>
+                <w:szCs w:val="18"/>
+              </w:rPr>
+              <w:t>(líneas jerarquía directiva no se ven hasta que se mueve manualmente)</w:t>
             </w:r>
           </w:p>
         </w:tc>
         <w:tc>
           <w:tcPr>
             <w:tcW w:w="1075" w:type="dxa"/>
-            <w:shd w:val="clear" w:color="auto" w:fill="E7F4E4"/>
-            <w:tcMar>
-              <w:top w:w="40" w:type="dxa"/>
-              <w:left w:w="80" w:type="dxa"/>
-              <w:bottom w:w="40" w:type="dxa"/>
-              <w:right w:w="80" w:type="dxa"/>
-            </w:tcMar>
-          </w:tcPr>
-          <w:p>
-            <w:pPr>
-              <w:jc w:val="center"/>
-            </w:pPr>
-            <w:r>
-              <w:rPr>
-                <w:sz w:val="18"/>
-                <w:szCs w:val="18"/>
+            <w:tcMar>
+              <w:top w:w="40" w:type="dxa"/>
+              <w:left w:w="80" w:type="dxa"/>
+              <w:bottom w:w="40" w:type="dxa"/>
+              <w:right w:w="80" w:type="dxa"/>
+            </w:tcMar>
+          </w:tcPr>
+          <w:p>
+            <w:pPr>
+              <w:jc w:val="center"/>
+            </w:pPr>
+            <w:r>
+              <w:rPr>
+                <w:sz w:val="18"/>
+                <w:szCs w:val="18"/>
+                <w:highlight w:val="yellow"/>
               </w:rPr>
               <w:t>SI</w:t>
             </w:r>
@@ -3651,35 +4481,34 @@
               <w:rPr>
                 <w:sz w:val="18"/>
                 <w:szCs w:val="18"/>
-              </w:rPr>
-              <w:t>NO</w:t>
+                <w:highlight w:val="yellow"/>
+              </w:rPr>
+              <w:t>SI</w:t>
             </w:r>
           </w:p>
         </w:tc>
         <w:tc>
           <w:tcPr>
             <w:tcW w:w="1081" w:type="dxa"/>
-            <w:tcMar>
-              <w:top w:w="40" w:type="dxa"/>
-              <w:left w:w="80" w:type="dxa"/>
-              <w:bottom w:w="40" w:type="dxa"/>
-              <w:right w:w="80" w:type="dxa"/>
-            </w:tcMar>
-          </w:tcPr>
-          <w:p>
-            <w:pPr>
-              <w:jc w:val="center"/>
-              <w:rPr>
-                <w:highlight w:val="yellow"/>
-              </w:rPr>
-            </w:pPr>
-            <w:r>
-              <w:rPr>
-                <w:sz w:val="18"/>
-                <w:szCs w:val="18"/>
-                <w:highlight w:val="yellow"/>
-              </w:rPr>
-              <w:t>NO</w:t>
+            <w:shd w:val="clear" w:color="auto" w:fill="FBE7E7"/>
+            <w:tcMar>
+              <w:top w:w="40" w:type="dxa"/>
+              <w:left w:w="80" w:type="dxa"/>
+              <w:bottom w:w="40" w:type="dxa"/>
+              <w:right w:w="80" w:type="dxa"/>
+            </w:tcMar>
+          </w:tcPr>
+          <w:p>
+            <w:pPr>
+              <w:jc w:val="center"/>
+            </w:pPr>
+            <w:r>
+              <w:rPr>
+                <w:sz w:val="18"/>
+                <w:szCs w:val="18"/>
+                <w:highlight w:val="yellow"/>
+              </w:rPr>
+              <w:t>SI</w:t>
             </w:r>
           </w:p>
         </w:tc>
@@ -3696,13 +4525,17 @@
           <w:p>
             <w:pPr>
               <w:jc w:val="center"/>
-            </w:pPr>
-            <w:r>
-              <w:rPr>
-                <w:sz w:val="18"/>
-                <w:szCs w:val="18"/>
-              </w:rPr>
-              <w:t>NO</w:t>
+              <w:rPr>
+                <w:highlight w:val="yellow"/>
+              </w:rPr>
+            </w:pPr>
+            <w:r>
+              <w:rPr>
+                <w:sz w:val="18"/>
+                <w:szCs w:val="18"/>
+                <w:highlight w:val="yellow"/>
+              </w:rPr>
+              <w:t>SI</w:t>
             </w:r>
           </w:p>
         </w:tc>
@@ -3719,13 +4552,17 @@
           <w:p>
             <w:pPr>
               <w:jc w:val="center"/>
-            </w:pPr>
-            <w:r>
-              <w:rPr>
-                <w:sz w:val="18"/>
-                <w:szCs w:val="18"/>
-              </w:rPr>
-              <w:t>NO</w:t>
+              <w:rPr>
+                <w:highlight w:val="yellow"/>
+              </w:rPr>
+            </w:pPr>
+            <w:r>
+              <w:rPr>
+                <w:sz w:val="18"/>
+                <w:szCs w:val="18"/>
+                <w:highlight w:val="yellow"/>
+              </w:rPr>
+              <w:t>SI</w:t>
             </w:r>
           </w:p>
         </w:tc>
@@ -3742,13 +4579,17 @@
           <w:p>
             <w:pPr>
               <w:jc w:val="center"/>
-            </w:pPr>
-            <w:r>
-              <w:rPr>
-                <w:sz w:val="18"/>
-                <w:szCs w:val="18"/>
-              </w:rPr>
-              <w:t>NO</w:t>
+              <w:rPr>
+                <w:highlight w:val="yellow"/>
+              </w:rPr>
+            </w:pPr>
+            <w:r>
+              <w:rPr>
+                <w:sz w:val="18"/>
+                <w:szCs w:val="18"/>
+                <w:highlight w:val="yellow"/>
+              </w:rPr>
+              <w:t>SI</w:t>
             </w:r>
           </w:p>
         </w:tc>
@@ -3773,53 +4614,62 @@
                 <w:sz w:val="18"/>
                 <w:szCs w:val="18"/>
               </w:rPr>
-              <w:t>Salud: autorizar accesos menores</w:t>
+              <w:t>Ver Secciones</w:t>
             </w:r>
           </w:p>
         </w:tc>
         <w:tc>
           <w:tcPr>
             <w:tcW w:w="1240" w:type="dxa"/>
-            <w:shd w:val="clear" w:color="auto" w:fill="E7F4E4"/>
-            <w:tcMar>
-              <w:top w:w="40" w:type="dxa"/>
-              <w:left w:w="80" w:type="dxa"/>
-              <w:bottom w:w="40" w:type="dxa"/>
-              <w:right w:w="80" w:type="dxa"/>
-            </w:tcMar>
-          </w:tcPr>
-          <w:p>
-            <w:pPr>
-              <w:jc w:val="center"/>
-            </w:pPr>
-            <w:r>
-              <w:rPr>
-                <w:sz w:val="18"/>
-                <w:szCs w:val="18"/>
-              </w:rPr>
-              <w:t>SI</w:t>
+            <w:shd w:val="clear" w:color="auto" w:fill="EEF3FA"/>
+            <w:tcMar>
+              <w:top w:w="40" w:type="dxa"/>
+              <w:left w:w="80" w:type="dxa"/>
+              <w:bottom w:w="40" w:type="dxa"/>
+              <w:right w:w="80" w:type="dxa"/>
+            </w:tcMar>
+          </w:tcPr>
+          <w:p>
+            <w:pPr>
+              <w:jc w:val="center"/>
+            </w:pPr>
+            <w:r>
+              <w:rPr>
+                <w:sz w:val="18"/>
+                <w:szCs w:val="18"/>
+                <w:highlight w:val="yellow"/>
+              </w:rPr>
+              <w:t>SI</w:t>
+            </w:r>
+            <w:r>
+              <w:rPr>
+                <w:sz w:val="18"/>
+                <w:szCs w:val="18"/>
+              </w:rPr>
+              <w:t xml:space="preserve"> </w:t>
             </w:r>
           </w:p>
         </w:tc>
         <w:tc>
           <w:tcPr>
             <w:tcW w:w="1075" w:type="dxa"/>
-            <w:shd w:val="clear" w:color="auto" w:fill="E7F4E4"/>
-            <w:tcMar>
-              <w:top w:w="40" w:type="dxa"/>
-              <w:left w:w="80" w:type="dxa"/>
-              <w:bottom w:w="40" w:type="dxa"/>
-              <w:right w:w="80" w:type="dxa"/>
-            </w:tcMar>
-          </w:tcPr>
-          <w:p>
-            <w:pPr>
-              <w:jc w:val="center"/>
-            </w:pPr>
-            <w:r>
-              <w:rPr>
-                <w:sz w:val="18"/>
-                <w:szCs w:val="18"/>
+            <w:shd w:val="clear" w:color="auto" w:fill="EEF3FA"/>
+            <w:tcMar>
+              <w:top w:w="40" w:type="dxa"/>
+              <w:left w:w="80" w:type="dxa"/>
+              <w:bottom w:w="40" w:type="dxa"/>
+              <w:right w:w="80" w:type="dxa"/>
+            </w:tcMar>
+          </w:tcPr>
+          <w:p>
+            <w:pPr>
+              <w:jc w:val="center"/>
+            </w:pPr>
+            <w:r>
+              <w:rPr>
+                <w:sz w:val="18"/>
+                <w:szCs w:val="18"/>
+                <w:highlight w:val="yellow"/>
               </w:rPr>
               <w:t>SI</w:t>
             </w:r>
@@ -3844,8 +4694,9 @@
               <w:rPr>
                 <w:sz w:val="18"/>
                 <w:szCs w:val="18"/>
-              </w:rPr>
-              <w:t>NO</w:t>
+                <w:highlight w:val="yellow"/>
+              </w:rPr>
+              <w:t>SI</w:t>
             </w:r>
           </w:p>
         </w:tc>
@@ -3868,8 +4719,9 @@
               <w:rPr>
                 <w:sz w:val="18"/>
                 <w:szCs w:val="18"/>
-              </w:rPr>
-              <w:t>NO</w:t>
+                <w:highlight w:val="yellow"/>
+              </w:rPr>
+              <w:t>SI</w:t>
             </w:r>
           </w:p>
         </w:tc>
@@ -3887,13 +4739,17 @@
           <w:p>
             <w:pPr>
               <w:jc w:val="center"/>
-            </w:pPr>
-            <w:r>
-              <w:rPr>
-                <w:sz w:val="18"/>
-                <w:szCs w:val="18"/>
-              </w:rPr>
-              <w:t>NO</w:t>
+              <w:rPr>
+                <w:highlight w:val="yellow"/>
+              </w:rPr>
+            </w:pPr>
+            <w:r>
+              <w:rPr>
+                <w:sz w:val="18"/>
+                <w:szCs w:val="18"/>
+                <w:highlight w:val="yellow"/>
+              </w:rPr>
+              <w:t>SI</w:t>
             </w:r>
           </w:p>
         </w:tc>
@@ -3911,13 +4767,17 @@
           <w:p>
             <w:pPr>
               <w:jc w:val="center"/>
-            </w:pPr>
-            <w:r>
-              <w:rPr>
-                <w:sz w:val="18"/>
-                <w:szCs w:val="18"/>
-              </w:rPr>
-              <w:t>NO</w:t>
+              <w:rPr>
+                <w:highlight w:val="yellow"/>
+              </w:rPr>
+            </w:pPr>
+            <w:r>
+              <w:rPr>
+                <w:sz w:val="18"/>
+                <w:szCs w:val="18"/>
+                <w:highlight w:val="yellow"/>
+              </w:rPr>
+              <w:t>SI</w:t>
             </w:r>
           </w:p>
         </w:tc>
@@ -3935,805 +4795,15 @@
           <w:p>
             <w:pPr>
               <w:jc w:val="center"/>
-            </w:pPr>
-            <w:r>
-              <w:rPr>
-                <w:sz w:val="18"/>
-                <w:szCs w:val="18"/>
-              </w:rPr>
-              <w:t>NO</w:t>
-            </w:r>
-          </w:p>
-        </w:tc>
-      </w:tr>
-      <w:tr>
-        <w:tc>
-          <w:tcPr>
-            <w:tcW w:w="2305" w:type="dxa"/>
-            <w:tcMar>
-              <w:top w:w="40" w:type="dxa"/>
-              <w:left w:w="80" w:type="dxa"/>
-              <w:bottom w:w="40" w:type="dxa"/>
-              <w:right w:w="80" w:type="dxa"/>
-            </w:tcMar>
-          </w:tcPr>
-          <w:p>
-            <w:r>
-              <w:rPr>
-                <w:b/>
-                <w:bCs/>
-                <w:sz w:val="18"/>
-                <w:szCs w:val="18"/>
-              </w:rPr>
-              <w:t>Sistema de Ascenso: ver/editar</w:t>
-            </w:r>
-          </w:p>
-        </w:tc>
-        <w:tc>
-          <w:tcPr>
-            <w:tcW w:w="1240" w:type="dxa"/>
-            <w:tcMar>
-              <w:top w:w="40" w:type="dxa"/>
-              <w:left w:w="80" w:type="dxa"/>
-              <w:bottom w:w="40" w:type="dxa"/>
-              <w:right w:w="80" w:type="dxa"/>
-            </w:tcMar>
-          </w:tcPr>
-          <w:p>
-            <w:pPr>
-              <w:jc w:val="center"/>
-            </w:pPr>
-            <w:r>
-              <w:rPr>
-                <w:sz w:val="18"/>
-                <w:szCs w:val="18"/>
-                <w:highlight w:val="yellow"/>
-              </w:rPr>
-              <w:t>SI</w:t>
-            </w:r>
-          </w:p>
-        </w:tc>
-        <w:tc>
-          <w:tcPr>
-            <w:tcW w:w="1075" w:type="dxa"/>
-            <w:tcMar>
-              <w:top w:w="40" w:type="dxa"/>
-              <w:left w:w="80" w:type="dxa"/>
-              <w:bottom w:w="40" w:type="dxa"/>
-              <w:right w:w="80" w:type="dxa"/>
-            </w:tcMar>
-          </w:tcPr>
-          <w:p>
-            <w:pPr>
-              <w:jc w:val="center"/>
-            </w:pPr>
-            <w:r>
-              <w:rPr>
-                <w:sz w:val="18"/>
-                <w:szCs w:val="18"/>
-                <w:highlight w:val="yellow"/>
-              </w:rPr>
-              <w:t>SI</w:t>
-            </w:r>
-          </w:p>
-        </w:tc>
-        <w:tc>
-          <w:tcPr>
-            <w:tcW w:w="1011" w:type="dxa"/>
-            <w:tcMar>
-              <w:top w:w="40" w:type="dxa"/>
-              <w:left w:w="80" w:type="dxa"/>
-              <w:bottom w:w="40" w:type="dxa"/>
-              <w:right w:w="80" w:type="dxa"/>
-            </w:tcMar>
-          </w:tcPr>
-          <w:p>
-            <w:pPr>
-              <w:jc w:val="center"/>
-              <w:rPr>
-                <w:lang w:val="es-ES"/>
-              </w:rPr>
-            </w:pPr>
-            <w:r>
-              <w:rPr>
-                <w:sz w:val="18"/>
-                <w:szCs w:val="18"/>
-                <w:highlight w:val="yellow"/>
-              </w:rPr>
-              <w:t>SI (solo ver)</w:t>
-            </w:r>
-          </w:p>
-        </w:tc>
-        <w:tc>
-          <w:tcPr>
-            <w:tcW w:w="1081" w:type="dxa"/>
-            <w:tcMar>
-              <w:top w:w="40" w:type="dxa"/>
-              <w:left w:w="80" w:type="dxa"/>
-              <w:bottom w:w="40" w:type="dxa"/>
-              <w:right w:w="80" w:type="dxa"/>
-            </w:tcMar>
-          </w:tcPr>
-          <w:p>
-            <w:pPr>
-              <w:jc w:val="center"/>
-            </w:pPr>
-            <w:r>
-              <w:rPr>
-                <w:sz w:val="18"/>
-                <w:szCs w:val="18"/>
-                <w:highlight w:val="yellow"/>
-              </w:rPr>
-              <w:t>SI (solo ver)</w:t>
-            </w:r>
-          </w:p>
-        </w:tc>
-        <w:tc>
-          <w:tcPr>
-            <w:tcW w:w="890" w:type="dxa"/>
-            <w:tcMar>
-              <w:top w:w="40" w:type="dxa"/>
-              <w:left w:w="80" w:type="dxa"/>
-              <w:bottom w:w="40" w:type="dxa"/>
-              <w:right w:w="80" w:type="dxa"/>
-            </w:tcMar>
-          </w:tcPr>
-          <w:p>
-            <w:pPr>
-              <w:jc w:val="center"/>
-            </w:pPr>
-            <w:r>
-              <w:rPr>
-                <w:sz w:val="18"/>
-                <w:szCs w:val="18"/>
-              </w:rPr>
-              <w:t>SI</w:t>
-            </w:r>
-          </w:p>
-        </w:tc>
-        <w:tc>
-          <w:tcPr>
-            <w:tcW w:w="979" w:type="dxa"/>
-            <w:tcMar>
-              <w:top w:w="40" w:type="dxa"/>
-              <w:left w:w="80" w:type="dxa"/>
-              <w:bottom w:w="40" w:type="dxa"/>
-              <w:right w:w="80" w:type="dxa"/>
-            </w:tcMar>
-          </w:tcPr>
-          <w:p>
-            <w:pPr>
-              <w:jc w:val="center"/>
-            </w:pPr>
-            <w:r>
-              <w:rPr>
-                <w:sz w:val="18"/>
-                <w:szCs w:val="18"/>
-              </w:rPr>
-              <w:t>SI</w:t>
-            </w:r>
-          </w:p>
-        </w:tc>
-        <w:tc>
-          <w:tcPr>
-            <w:tcW w:w="979" w:type="dxa"/>
-            <w:tcMar>
-              <w:top w:w="40" w:type="dxa"/>
-              <w:left w:w="80" w:type="dxa"/>
-              <w:bottom w:w="40" w:type="dxa"/>
-              <w:right w:w="80" w:type="dxa"/>
-            </w:tcMar>
-          </w:tcPr>
-          <w:p>
-            <w:pPr>
-              <w:jc w:val="center"/>
-            </w:pPr>
-            <w:r>
-              <w:rPr>
-                <w:sz w:val="18"/>
-                <w:szCs w:val="18"/>
-              </w:rPr>
-              <w:t>SI</w:t>
-            </w:r>
-          </w:p>
-        </w:tc>
-      </w:tr>
-      <w:tr>
-        <w:tc>
-          <w:tcPr>
-            <w:tcW w:w="2305" w:type="dxa"/>
-            <w:shd w:val="clear" w:color="auto" w:fill="EEF3FA"/>
-            <w:tcMar>
-              <w:top w:w="40" w:type="dxa"/>
-              <w:left w:w="80" w:type="dxa"/>
-              <w:bottom w:w="40" w:type="dxa"/>
-              <w:right w:w="80" w:type="dxa"/>
-            </w:tcMar>
-          </w:tcPr>
-          <w:p>
-            <w:r>
-              <w:rPr>
-                <w:b/>
-                <w:bCs/>
-                <w:sz w:val="18"/>
-                <w:szCs w:val="18"/>
-              </w:rPr>
-              <w:t>Padres/tutores: ver/editar</w:t>
-            </w:r>
-          </w:p>
-        </w:tc>
-        <w:tc>
-          <w:tcPr>
-            <w:tcW w:w="1240" w:type="dxa"/>
-            <w:shd w:val="clear" w:color="auto" w:fill="EEF3FA"/>
-            <w:tcMar>
-              <w:top w:w="40" w:type="dxa"/>
-              <w:left w:w="80" w:type="dxa"/>
-              <w:bottom w:w="40" w:type="dxa"/>
-              <w:right w:w="80" w:type="dxa"/>
-            </w:tcMar>
-          </w:tcPr>
-          <w:p>
-            <w:pPr>
-              <w:jc w:val="center"/>
-            </w:pPr>
-            <w:r>
-              <w:rPr>
-                <w:sz w:val="18"/>
-                <w:szCs w:val="18"/>
-              </w:rPr>
-              <w:t>SI</w:t>
-            </w:r>
-          </w:p>
-        </w:tc>
-        <w:tc>
-          <w:tcPr>
-            <w:tcW w:w="1075" w:type="dxa"/>
-            <w:shd w:val="clear" w:color="auto" w:fill="EEF3FA"/>
-            <w:tcMar>
-              <w:top w:w="40" w:type="dxa"/>
-              <w:left w:w="80" w:type="dxa"/>
-              <w:bottom w:w="40" w:type="dxa"/>
-              <w:right w:w="80" w:type="dxa"/>
-            </w:tcMar>
-          </w:tcPr>
-          <w:p>
-            <w:pPr>
-              <w:jc w:val="center"/>
-            </w:pPr>
-            <w:r>
-              <w:rPr>
-                <w:sz w:val="18"/>
-                <w:szCs w:val="18"/>
-              </w:rPr>
-              <w:t>SI</w:t>
-            </w:r>
-          </w:p>
-        </w:tc>
-        <w:tc>
-          <w:tcPr>
-            <w:tcW w:w="1011" w:type="dxa"/>
-            <w:shd w:val="clear" w:color="auto" w:fill="EEF3FA"/>
-            <w:tcMar>
-              <w:top w:w="40" w:type="dxa"/>
-              <w:left w:w="80" w:type="dxa"/>
-              <w:bottom w:w="40" w:type="dxa"/>
-              <w:right w:w="80" w:type="dxa"/>
-            </w:tcMar>
-          </w:tcPr>
-          <w:p>
-            <w:pPr>
-              <w:jc w:val="center"/>
-            </w:pPr>
-            <w:r>
-              <w:rPr>
-                <w:sz w:val="18"/>
-                <w:szCs w:val="18"/>
-              </w:rPr>
-              <w:t>SI</w:t>
-            </w:r>
-          </w:p>
-        </w:tc>
-        <w:tc>
-          <w:tcPr>
-            <w:tcW w:w="1081" w:type="dxa"/>
-            <w:shd w:val="clear" w:color="auto" w:fill="EEF3FA"/>
-            <w:tcMar>
-              <w:top w:w="40" w:type="dxa"/>
-              <w:left w:w="80" w:type="dxa"/>
-              <w:bottom w:w="40" w:type="dxa"/>
-              <w:right w:w="80" w:type="dxa"/>
-            </w:tcMar>
-          </w:tcPr>
-          <w:p>
-            <w:pPr>
-              <w:jc w:val="center"/>
-            </w:pPr>
-            <w:r>
-              <w:rPr>
-                <w:sz w:val="18"/>
-                <w:szCs w:val="18"/>
-              </w:rPr>
-              <w:t>SI</w:t>
-            </w:r>
-          </w:p>
-        </w:tc>
-        <w:tc>
-          <w:tcPr>
-            <w:tcW w:w="890" w:type="dxa"/>
-            <w:shd w:val="clear" w:color="auto" w:fill="EEF3FA"/>
-            <w:tcMar>
-              <w:top w:w="40" w:type="dxa"/>
-              <w:left w:w="80" w:type="dxa"/>
-              <w:bottom w:w="40" w:type="dxa"/>
-              <w:right w:w="80" w:type="dxa"/>
-            </w:tcMar>
-          </w:tcPr>
-          <w:p>
-            <w:pPr>
-              <w:jc w:val="center"/>
-            </w:pPr>
-            <w:r>
-              <w:rPr>
-                <w:sz w:val="18"/>
-                <w:szCs w:val="18"/>
-              </w:rPr>
-              <w:t>SI</w:t>
-            </w:r>
-          </w:p>
-        </w:tc>
-        <w:tc>
-          <w:tcPr>
-            <w:tcW w:w="979" w:type="dxa"/>
-            <w:shd w:val="clear" w:color="auto" w:fill="EEF3FA"/>
-            <w:tcMar>
-              <w:top w:w="40" w:type="dxa"/>
-              <w:left w:w="80" w:type="dxa"/>
-              <w:bottom w:w="40" w:type="dxa"/>
-              <w:right w:w="80" w:type="dxa"/>
-            </w:tcMar>
-          </w:tcPr>
-          <w:p>
-            <w:pPr>
-              <w:jc w:val="center"/>
-            </w:pPr>
-            <w:r>
-              <w:rPr>
-                <w:sz w:val="18"/>
-                <w:szCs w:val="18"/>
-              </w:rPr>
-              <w:t>SI</w:t>
-            </w:r>
-          </w:p>
-        </w:tc>
-        <w:tc>
-          <w:tcPr>
-            <w:tcW w:w="979" w:type="dxa"/>
-            <w:shd w:val="clear" w:color="auto" w:fill="EEF3FA"/>
-            <w:tcMar>
-              <w:top w:w="40" w:type="dxa"/>
-              <w:left w:w="80" w:type="dxa"/>
-              <w:bottom w:w="40" w:type="dxa"/>
-              <w:right w:w="80" w:type="dxa"/>
-            </w:tcMar>
-          </w:tcPr>
-          <w:p>
-            <w:pPr>
-              <w:jc w:val="center"/>
-            </w:pPr>
-            <w:r>
-              <w:rPr>
-                <w:sz w:val="18"/>
-                <w:szCs w:val="18"/>
-              </w:rPr>
-              <w:t>SI</w:t>
-            </w:r>
-          </w:p>
-        </w:tc>
-      </w:tr>
-      <w:tr>
-        <w:tc>
-          <w:tcPr>
-            <w:tcW w:w="2305" w:type="dxa"/>
-            <w:tcMar>
-              <w:top w:w="40" w:type="dxa"/>
-              <w:left w:w="80" w:type="dxa"/>
-              <w:bottom w:w="40" w:type="dxa"/>
-              <w:right w:w="80" w:type="dxa"/>
-            </w:tcMar>
-          </w:tcPr>
-          <w:p>
-            <w:r>
-              <w:rPr>
-                <w:b/>
-                <w:bCs/>
-                <w:sz w:val="18"/>
-                <w:szCs w:val="18"/>
-              </w:rPr>
-              <w:t>Ver Regiones (menú)</w:t>
-            </w:r>
-          </w:p>
-        </w:tc>
-        <w:tc>
-          <w:tcPr>
-            <w:tcW w:w="1240" w:type="dxa"/>
-            <w:tcMar>
-              <w:top w:w="40" w:type="dxa"/>
-              <w:left w:w="80" w:type="dxa"/>
-              <w:bottom w:w="40" w:type="dxa"/>
-              <w:right w:w="80" w:type="dxa"/>
-            </w:tcMar>
-          </w:tcPr>
-          <w:p>
-            <w:pPr>
-              <w:jc w:val="center"/>
-            </w:pPr>
-            <w:r>
-              <w:rPr>
-                <w:sz w:val="18"/>
-                <w:szCs w:val="18"/>
-                <w:highlight w:val="yellow"/>
-              </w:rPr>
-              <w:t>SI</w:t>
-            </w:r>
-            <w:r>
-              <w:rPr>
-                <w:sz w:val="18"/>
-                <w:szCs w:val="18"/>
-              </w:rPr>
-              <w:t xml:space="preserve"> </w:t>
-            </w:r>
-            <w:r>
-              <w:rPr>
-                <w:color w:val="FF0000"/>
-                <w:sz w:val="18"/>
-                <w:szCs w:val="18"/>
-              </w:rPr>
-              <w:t>(líneas jerarquía directiva no se ven hasta que se mueve manualmente)</w:t>
-            </w:r>
-          </w:p>
-        </w:tc>
-        <w:tc>
-          <w:tcPr>
-            <w:tcW w:w="1075" w:type="dxa"/>
-            <w:tcMar>
-              <w:top w:w="40" w:type="dxa"/>
-              <w:left w:w="80" w:type="dxa"/>
-              <w:bottom w:w="40" w:type="dxa"/>
-              <w:right w:w="80" w:type="dxa"/>
-            </w:tcMar>
-          </w:tcPr>
-          <w:p>
-            <w:pPr>
-              <w:jc w:val="center"/>
-            </w:pPr>
-            <w:r>
-              <w:rPr>
-                <w:sz w:val="18"/>
-                <w:szCs w:val="18"/>
-                <w:highlight w:val="yellow"/>
-              </w:rPr>
-              <w:t>SI</w:t>
-            </w:r>
-          </w:p>
-        </w:tc>
-        <w:tc>
-          <w:tcPr>
-            <w:tcW w:w="1011" w:type="dxa"/>
-            <w:tcMar>
-              <w:top w:w="40" w:type="dxa"/>
-              <w:left w:w="80" w:type="dxa"/>
-              <w:bottom w:w="40" w:type="dxa"/>
-              <w:right w:w="80" w:type="dxa"/>
-            </w:tcMar>
-          </w:tcPr>
-          <w:p>
-            <w:pPr>
-              <w:jc w:val="center"/>
-            </w:pPr>
-            <w:r>
-              <w:rPr>
-                <w:sz w:val="18"/>
-                <w:szCs w:val="18"/>
-                <w:highlight w:val="yellow"/>
-              </w:rPr>
-              <w:t>SI</w:t>
-            </w:r>
-          </w:p>
-        </w:tc>
-        <w:tc>
-          <w:tcPr>
-            <w:tcW w:w="1081" w:type="dxa"/>
-            <w:shd w:val="clear" w:color="auto" w:fill="FBE7E7"/>
-            <w:tcMar>
-              <w:top w:w="40" w:type="dxa"/>
-              <w:left w:w="80" w:type="dxa"/>
-              <w:bottom w:w="40" w:type="dxa"/>
-              <w:right w:w="80" w:type="dxa"/>
-            </w:tcMar>
-          </w:tcPr>
-          <w:p>
-            <w:pPr>
-              <w:jc w:val="center"/>
-            </w:pPr>
-            <w:r>
-              <w:rPr>
-                <w:sz w:val="18"/>
-                <w:szCs w:val="18"/>
-                <w:highlight w:val="yellow"/>
-              </w:rPr>
-              <w:t>SI</w:t>
-            </w:r>
-          </w:p>
-        </w:tc>
-        <w:tc>
-          <w:tcPr>
-            <w:tcW w:w="890" w:type="dxa"/>
-            <w:tcMar>
-              <w:top w:w="40" w:type="dxa"/>
-              <w:left w:w="80" w:type="dxa"/>
-              <w:bottom w:w="40" w:type="dxa"/>
-              <w:right w:w="80" w:type="dxa"/>
-            </w:tcMar>
-          </w:tcPr>
-          <w:p>
-            <w:pPr>
-              <w:jc w:val="center"/>
-            </w:pPr>
-            <w:r>
-              <w:rPr>
-                <w:sz w:val="18"/>
-                <w:szCs w:val="18"/>
-              </w:rPr>
-              <w:t>SI</w:t>
-            </w:r>
-          </w:p>
-        </w:tc>
-        <w:tc>
-          <w:tcPr>
-            <w:tcW w:w="979" w:type="dxa"/>
-            <w:tcMar>
-              <w:top w:w="40" w:type="dxa"/>
-              <w:left w:w="80" w:type="dxa"/>
-              <w:bottom w:w="40" w:type="dxa"/>
-              <w:right w:w="80" w:type="dxa"/>
-            </w:tcMar>
-          </w:tcPr>
-          <w:p>
-            <w:pPr>
-              <w:jc w:val="center"/>
-            </w:pPr>
-            <w:r>
-              <w:rPr>
-                <w:sz w:val="18"/>
-                <w:szCs w:val="18"/>
-              </w:rPr>
-              <w:t>SI</w:t>
-            </w:r>
-          </w:p>
-        </w:tc>
-        <w:tc>
-          <w:tcPr>
-            <w:tcW w:w="979" w:type="dxa"/>
-            <w:tcMar>
-              <w:top w:w="40" w:type="dxa"/>
-              <w:left w:w="80" w:type="dxa"/>
-              <w:bottom w:w="40" w:type="dxa"/>
-              <w:right w:w="80" w:type="dxa"/>
-            </w:tcMar>
-          </w:tcPr>
-          <w:p>
-            <w:pPr>
-              <w:jc w:val="center"/>
-            </w:pPr>
-            <w:r>
-              <w:rPr>
-                <w:sz w:val="18"/>
-                <w:szCs w:val="18"/>
-              </w:rPr>
-              <w:t>SI</w:t>
-            </w:r>
-          </w:p>
-        </w:tc>
-      </w:tr>
-      <w:tr>
-        <w:tc>
-          <w:tcPr>
-            <w:tcW w:w="2305" w:type="dxa"/>
-            <w:shd w:val="clear" w:color="auto" w:fill="EEF3FA"/>
-            <w:tcMar>
-              <w:top w:w="40" w:type="dxa"/>
-              <w:left w:w="80" w:type="dxa"/>
-              <w:bottom w:w="40" w:type="dxa"/>
-              <w:right w:w="80" w:type="dxa"/>
-            </w:tcMar>
-          </w:tcPr>
-          <w:p>
-            <w:r>
-              <w:rPr>
-                <w:b/>
-                <w:bCs/>
-                <w:sz w:val="18"/>
-                <w:szCs w:val="18"/>
-              </w:rPr>
-              <w:t>Ver Secciones</w:t>
-            </w:r>
-          </w:p>
-        </w:tc>
-        <w:tc>
-          <w:tcPr>
-            <w:tcW w:w="1240" w:type="dxa"/>
-            <w:shd w:val="clear" w:color="auto" w:fill="EEF3FA"/>
-            <w:tcMar>
-              <w:top w:w="40" w:type="dxa"/>
-              <w:left w:w="80" w:type="dxa"/>
-              <w:bottom w:w="40" w:type="dxa"/>
-              <w:right w:w="80" w:type="dxa"/>
-            </w:tcMar>
-          </w:tcPr>
-          <w:p>
-            <w:pPr>
-              <w:jc w:val="center"/>
-            </w:pPr>
-            <w:r>
-              <w:rPr>
-                <w:sz w:val="18"/>
-                <w:szCs w:val="18"/>
-                <w:highlight w:val="yellow"/>
-              </w:rPr>
-              <w:t>SI</w:t>
-            </w:r>
-            <w:r>
-              <w:rPr>
-                <w:sz w:val="18"/>
-                <w:szCs w:val="18"/>
-              </w:rPr>
-              <w:t xml:space="preserve"> </w:t>
-            </w:r>
-          </w:p>
-        </w:tc>
-        <w:tc>
-          <w:tcPr>
-            <w:tcW w:w="1075" w:type="dxa"/>
-            <w:shd w:val="clear" w:color="auto" w:fill="EEF3FA"/>
-            <w:tcMar>
-              <w:top w:w="40" w:type="dxa"/>
-              <w:left w:w="80" w:type="dxa"/>
-              <w:bottom w:w="40" w:type="dxa"/>
-              <w:right w:w="80" w:type="dxa"/>
-            </w:tcMar>
-          </w:tcPr>
-          <w:p>
-            <w:pPr>
-              <w:jc w:val="center"/>
-            </w:pPr>
-            <w:r>
-              <w:rPr>
-                <w:sz w:val="18"/>
-                <w:szCs w:val="18"/>
-                <w:highlight w:val="yellow"/>
-              </w:rPr>
-              <w:t>SI</w:t>
-            </w:r>
-          </w:p>
-        </w:tc>
-        <w:tc>
-          <w:tcPr>
-            <w:tcW w:w="1011" w:type="dxa"/>
-            <w:shd w:val="clear" w:color="auto" w:fill="EEF3FA"/>
-            <w:tcMar>
-              <w:top w:w="40" w:type="dxa"/>
-              <w:left w:w="80" w:type="dxa"/>
-              <w:bottom w:w="40" w:type="dxa"/>
-              <w:right w:w="80" w:type="dxa"/>
-            </w:tcMar>
-          </w:tcPr>
-          <w:p>
-            <w:pPr>
-              <w:jc w:val="center"/>
-            </w:pPr>
-            <w:r>
-              <w:rPr>
-                <w:sz w:val="18"/>
-                <w:szCs w:val="18"/>
-                <w:highlight w:val="yellow"/>
-              </w:rPr>
-              <w:t>SI</w:t>
-            </w:r>
-          </w:p>
-        </w:tc>
-        <w:tc>
-          <w:tcPr>
-            <w:tcW w:w="1081" w:type="dxa"/>
-            <w:shd w:val="clear" w:color="auto" w:fill="EEF3FA"/>
-            <w:tcMar>
-              <w:top w:w="40" w:type="dxa"/>
-              <w:left w:w="80" w:type="dxa"/>
-              <w:bottom w:w="40" w:type="dxa"/>
-              <w:right w:w="80" w:type="dxa"/>
-            </w:tcMar>
-          </w:tcPr>
-          <w:p>
-            <w:pPr>
-              <w:jc w:val="center"/>
-            </w:pPr>
-            <w:r>
-              <w:rPr>
-                <w:sz w:val="18"/>
-                <w:szCs w:val="18"/>
-                <w:highlight w:val="yellow"/>
-              </w:rPr>
-              <w:t>SI</w:t>
-            </w:r>
-          </w:p>
-        </w:tc>
-        <w:tc>
-          <w:tcPr>
-            <w:tcW w:w="890" w:type="dxa"/>
-            <w:shd w:val="clear" w:color="auto" w:fill="EEF3FA"/>
-            <w:tcMar>
-              <w:top w:w="40" w:type="dxa"/>
-              <w:left w:w="80" w:type="dxa"/>
-              <w:bottom w:w="40" w:type="dxa"/>
-              <w:right w:w="80" w:type="dxa"/>
-            </w:tcMar>
-          </w:tcPr>
-          <w:p>
-            <w:pPr>
-              <w:jc w:val="center"/>
-            </w:pPr>
-            <w:r>
-              <w:rPr>
-                <w:sz w:val="18"/>
-                <w:szCs w:val="18"/>
-              </w:rPr>
-              <w:t>SI</w:t>
-            </w:r>
-          </w:p>
-        </w:tc>
-        <w:tc>
-          <w:tcPr>
-            <w:tcW w:w="979" w:type="dxa"/>
-            <w:shd w:val="clear" w:color="auto" w:fill="EEF3FA"/>
-            <w:tcMar>
-              <w:top w:w="40" w:type="dxa"/>
-              <w:left w:w="80" w:type="dxa"/>
-              <w:bottom w:w="40" w:type="dxa"/>
-              <w:right w:w="80" w:type="dxa"/>
-            </w:tcMar>
-          </w:tcPr>
-          <w:p>
-            <w:pPr>
-              <w:jc w:val="center"/>
-            </w:pPr>
-            <w:r>
-              <w:rPr>
-                <w:sz w:val="18"/>
-                <w:szCs w:val="18"/>
-              </w:rPr>
-              <w:t>SI</w:t>
-            </w:r>
-          </w:p>
-        </w:tc>
-        <w:tc>
-          <w:tcPr>
-            <w:tcW w:w="979" w:type="dxa"/>
-            <w:shd w:val="clear" w:color="auto" w:fill="EEF3FA"/>
-            <w:tcMar>
-              <w:top w:w="40" w:type="dxa"/>
-              <w:left w:w="80" w:type="dxa"/>
-              <w:bottom w:w="40" w:type="dxa"/>
-              <w:right w:w="80" w:type="dxa"/>
-            </w:tcMar>
-          </w:tcPr>
-          <w:p>
-            <w:pPr>
-              <w:jc w:val="center"/>
-            </w:pPr>
-            <w:r>
-              <w:rPr>
-                <w:sz w:val="18"/>
-                <w:szCs w:val="18"/>
+              <w:rPr>
+                <w:highlight w:val="yellow"/>
+              </w:rPr>
+            </w:pPr>
+            <w:r>
+              <w:rPr>
+                <w:sz w:val="18"/>
+                <w:szCs w:val="18"/>
+                <w:highlight w:val="yellow"/>
               </w:rPr>
               <w:t>SI</w:t>
             </w:r>
@@ -7066,6 +7136,7 @@
       <w:pPr>
         <w:spacing w:after="70"/>
       </w:pPr>
+      <w:proofErr w:type="gramStart"/>
       <w:r>
         <w:rPr>
           <w:sz w:val="24"/>
@@ -7074,13 +7145,18 @@
         <w:t xml:space="preserve">☐  </w:t>
       </w:r>
       <w:r>
-        <w:t>Esta asignado en la directiva -&gt; recibe las 7 notificaciones.</w:t>
+        <w:t>Esta</w:t>
+      </w:r>
+      <w:proofErr w:type="gramEnd"/>
+      <w:r>
+        <w:t xml:space="preserve"> asignado en la directiva -&gt; recibe las 7 notificaciones.</w:t>
       </w:r>
     </w:p>
     <w:p>
       <w:pPr>
         <w:spacing w:after="70"/>
       </w:pPr>
+      <w:proofErr w:type="gramStart"/>
       <w:r>
         <w:rPr>
           <w:sz w:val="24"/>
@@ -7089,7 +7165,11 @@
         <w:t xml:space="preserve">☐  </w:t>
       </w:r>
       <w:r>
-        <w:t xml:space="preserve">Edita miembros de su destacamento DIRECTO (sin </w:t>
+        <w:t>Edita</w:t>
+      </w:r>
+      <w:proofErr w:type="gramEnd"/>
+      <w:r>
+        <w:t xml:space="preserve"> miembros de su destacamento DIRECTO (sin </w:t>
       </w:r>
       <w:proofErr w:type="spellStart"/>
       <w:r>
@@ -7104,6 +7184,7 @@
       <w:pPr>
         <w:spacing w:after="70"/>
       </w:pPr>
+      <w:proofErr w:type="gramStart"/>
       <w:r>
         <w:rPr>
           <w:sz w:val="24"/>
@@ -7112,13 +7193,18 @@
         <w:t xml:space="preserve">☐  </w:t>
       </w:r>
       <w:r>
-        <w:t>Ve datos sensibles en texto plano (no enmascarados).</w:t>
+        <w:t>Ve</w:t>
+      </w:r>
+      <w:proofErr w:type="gramEnd"/>
+      <w:r>
+        <w:t xml:space="preserve"> datos sensibles en texto plano (no enmascarados).</w:t>
       </w:r>
     </w:p>
     <w:p>
       <w:pPr>
         <w:spacing w:after="70"/>
       </w:pPr>
+      <w:proofErr w:type="gramStart"/>
       <w:r>
         <w:rPr>
           <w:sz w:val="24"/>
@@ -7127,13 +7213,18 @@
         <w:t xml:space="preserve">☐  </w:t>
       </w:r>
       <w:r>
-        <w:t>Dispensa Medica COMPLETA: edita, sube y elimina documentos, autoriza acceso de menores.</w:t>
+        <w:t>Dispensa</w:t>
+      </w:r>
+      <w:proofErr w:type="gramEnd"/>
+      <w:r>
+        <w:t xml:space="preserve"> Medica COMPLETA: edita, sube y elimina documentos, autoriza acceso de menores.</w:t>
       </w:r>
     </w:p>
     <w:p>
       <w:pPr>
         <w:spacing w:after="70"/>
       </w:pPr>
+      <w:proofErr w:type="gramStart"/>
       <w:r>
         <w:rPr>
           <w:sz w:val="24"/>
@@ -7142,13 +7233,18 @@
         <w:t xml:space="preserve">☐  </w:t>
       </w:r>
       <w:r>
-        <w:t>Elimina documentos directo (sin solicitar).</w:t>
+        <w:t>Elimina</w:t>
+      </w:r>
+      <w:proofErr w:type="gramEnd"/>
+      <w:r>
+        <w:t xml:space="preserve"> documentos directo (sin solicitar).</w:t>
       </w:r>
     </w:p>
     <w:p>
       <w:pPr>
         <w:spacing w:after="70"/>
       </w:pPr>
+      <w:proofErr w:type="gramStart"/>
       <w:r>
         <w:rPr>
           <w:sz w:val="24"/>
@@ -7157,13 +7253,18 @@
         <w:t xml:space="preserve">☐  </w:t>
       </w:r>
       <w:r>
-        <w:t>Resuelve solicitudes (aprobar/parcial/rechazar) -&gt; el solicitante recibe el resultado.</w:t>
+        <w:t>Resuelve</w:t>
+      </w:r>
+      <w:proofErr w:type="gramEnd"/>
+      <w:r>
+        <w:t xml:space="preserve"> solicitudes (aprobar/parcial/rechazar) -&gt; el solicitante recibe el resultado.</w:t>
       </w:r>
     </w:p>
     <w:p>
       <w:pPr>
         <w:spacing w:after="70"/>
       </w:pPr>
+      <w:proofErr w:type="gramStart"/>
       <w:r>
         <w:rPr>
           <w:sz w:val="24"/>
@@ -7172,7 +7273,11 @@
         <w:t xml:space="preserve">☐  </w:t>
       </w:r>
       <w:r>
-        <w:t xml:space="preserve">Un cambio directo suyo notifica al asistente, no a </w:t>
+        <w:t>Un</w:t>
+      </w:r>
+      <w:proofErr w:type="gramEnd"/>
+      <w:r>
+        <w:t xml:space="preserve"> cambio directo suyo notifica al asistente, no a </w:t>
       </w:r>
       <w:proofErr w:type="spellStart"/>
       <w:r>
@@ -7187,6 +7292,7 @@
       <w:pPr>
         <w:spacing w:after="70"/>
       </w:pPr>
+      <w:proofErr w:type="gramStart"/>
       <w:r>
         <w:rPr>
           <w:sz w:val="24"/>
@@ -7195,13 +7301,18 @@
         <w:t xml:space="preserve">☐  </w:t>
       </w:r>
       <w:r>
-        <w:t>NO puede eliminar miembros.</w:t>
+        <w:t>NO</w:t>
+      </w:r>
+      <w:proofErr w:type="gramEnd"/>
+      <w:r>
+        <w:t xml:space="preserve"> puede eliminar miembros.</w:t>
       </w:r>
     </w:p>
     <w:p>
       <w:pPr>
         <w:spacing w:after="70"/>
       </w:pPr>
+      <w:proofErr w:type="gramStart"/>
       <w:r>
         <w:rPr>
           <w:sz w:val="24"/>
@@ -7210,7 +7321,11 @@
         <w:t xml:space="preserve">☐  </w:t>
       </w:r>
       <w:r>
-        <w:t>Solo ve su destacamento en la lista de miembros.</w:t>
+        <w:t>Solo</w:t>
+      </w:r>
+      <w:proofErr w:type="gramEnd"/>
+      <w:r>
+        <w:t xml:space="preserve"> ve su destacamento en la lista de miembros.</w:t>
       </w:r>
     </w:p>
     <w:p>
@@ -7232,6 +7347,7 @@
       <w:pPr>
         <w:spacing w:after="70"/>
       </w:pPr>
+      <w:proofErr w:type="gramStart"/>
       <w:r>
         <w:rPr>
           <w:sz w:val="24"/>
@@ -7244,6 +7360,7 @@
         <w:t>Identico</w:t>
       </w:r>
       <w:proofErr w:type="spellEnd"/>
+      <w:proofErr w:type="gramEnd"/>
       <w:r>
         <w:t xml:space="preserve"> al titular en todo (visibilidad, permisos, resolver solicitudes).</w:t>
       </w:r>
@@ -7252,6 +7369,7 @@
       <w:pPr>
         <w:spacing w:after="70"/>
       </w:pPr>
+      <w:proofErr w:type="gramStart"/>
       <w:r>
         <w:rPr>
           <w:sz w:val="24"/>
@@ -7260,13 +7378,18 @@
         <w:t xml:space="preserve">☐  </w:t>
       </w:r>
       <w:r>
-        <w:t>Sus cambios directos notifican al titular.</w:t>
+        <w:t>Sus</w:t>
+      </w:r>
+      <w:proofErr w:type="gramEnd"/>
+      <w:r>
+        <w:t xml:space="preserve"> cambios directos notifican al titular.</w:t>
       </w:r>
     </w:p>
     <w:p>
       <w:pPr>
         <w:spacing w:after="70"/>
       </w:pPr>
+      <w:proofErr w:type="gramStart"/>
       <w:r>
         <w:rPr>
           <w:sz w:val="24"/>
@@ -7275,7 +7398,11 @@
         <w:t xml:space="preserve">☐  </w:t>
       </w:r>
       <w:r>
-        <w:t xml:space="preserve">Se normaliza a titular (mismo acceso, sin </w:t>
+        <w:t>Se</w:t>
+      </w:r>
+      <w:proofErr w:type="gramEnd"/>
+      <w:r>
+        <w:t xml:space="preserve"> normaliza a titular (mismo acceso, sin </w:t>
       </w:r>
       <w:proofErr w:type="spellStart"/>
       <w:r>
@@ -7305,6 +7432,7 @@
       <w:pPr>
         <w:spacing w:after="70"/>
       </w:pPr>
+      <w:proofErr w:type="gramStart"/>
       <w:r>
         <w:rPr>
           <w:sz w:val="24"/>
@@ -7313,13 +7441,18 @@
         <w:t xml:space="preserve">☐  </w:t>
       </w:r>
       <w:r>
-        <w:t>Puede crear y editar miembros, pero sus ediciones van a APROBACION.</w:t>
+        <w:t>Puede</w:t>
+      </w:r>
+      <w:proofErr w:type="gramEnd"/>
+      <w:r>
+        <w:t xml:space="preserve"> crear y editar miembros, pero sus ediciones van a APROBACION.</w:t>
       </w:r>
     </w:p>
     <w:p>
       <w:pPr>
         <w:spacing w:after="70"/>
       </w:pPr>
+      <w:proofErr w:type="gramStart"/>
       <w:r>
         <w:rPr>
           <w:sz w:val="24"/>
@@ -7328,7 +7461,11 @@
         <w:t xml:space="preserve">☐  </w:t>
       </w:r>
       <w:r>
-        <w:t xml:space="preserve">Ve menores; NO ve datos sensibles en texto plano (enmascarados + </w:t>
+        <w:t>Ve</w:t>
+      </w:r>
+      <w:proofErr w:type="gramEnd"/>
+      <w:r>
+        <w:t xml:space="preserve"> menores; NO ve datos sensibles en texto plano (enmascarados + </w:t>
       </w:r>
       <w:proofErr w:type="spellStart"/>
       <w:r>
@@ -7343,6 +7480,7 @@
       <w:pPr>
         <w:spacing w:after="70"/>
       </w:pPr>
+      <w:proofErr w:type="gramStart"/>
       <w:r>
         <w:rPr>
           <w:sz w:val="24"/>
@@ -7351,13 +7489,18 @@
         <w:t xml:space="preserve">☐  </w:t>
       </w:r>
       <w:r>
-        <w:t>Salud: sube documentos pero NO elimina ni autoriza menores.</w:t>
+        <w:t>Salud</w:t>
+      </w:r>
+      <w:proofErr w:type="gramEnd"/>
+      <w:r>
+        <w:t>: sube documentos pero NO elimina ni autoriza menores.</w:t>
       </w:r>
     </w:p>
     <w:p>
       <w:pPr>
         <w:spacing w:after="70"/>
       </w:pPr>
+      <w:proofErr w:type="gramStart"/>
       <w:r>
         <w:rPr>
           <w:sz w:val="24"/>
@@ -7366,13 +7509,18 @@
         <w:t xml:space="preserve">☐  </w:t>
       </w:r>
       <w:r>
-        <w:t>Documentos: eliminar requiere solicitud.</w:t>
+        <w:t>Documentos</w:t>
+      </w:r>
+      <w:proofErr w:type="gramEnd"/>
+      <w:r>
+        <w:t>: eliminar requiere solicitud.</w:t>
       </w:r>
     </w:p>
     <w:p>
       <w:pPr>
         <w:spacing w:after="70"/>
       </w:pPr>
+      <w:proofErr w:type="gramStart"/>
       <w:r>
         <w:rPr>
           <w:sz w:val="24"/>
@@ -7385,6 +7533,7 @@
         <w:t>Envia</w:t>
       </w:r>
       <w:proofErr w:type="spellEnd"/>
+      <w:proofErr w:type="gramEnd"/>
       <w:r>
         <w:t xml:space="preserve"> correos, ve regiones y reportes seccionales.</w:t>
       </w:r>
@@ -7408,6 +7557,7 @@
       <w:pPr>
         <w:spacing w:after="70"/>
       </w:pPr>
+      <w:proofErr w:type="gramStart"/>
       <w:r>
         <w:rPr>
           <w:sz w:val="24"/>
@@ -7416,7 +7566,11 @@
         <w:t xml:space="preserve">☐  </w:t>
       </w:r>
       <w:r>
-        <w:t>NO puede crear miembros (diferencia grande vs Pastor/</w:t>
+        <w:t>NO</w:t>
+      </w:r>
+      <w:proofErr w:type="gramEnd"/>
+      <w:r>
+        <w:t xml:space="preserve"> puede crear miembros (diferencia grande vs Pastor/</w:t>
       </w:r>
       <w:proofErr w:type="spellStart"/>
       <w:r>
@@ -7431,6 +7585,7 @@
       <w:pPr>
         <w:spacing w:after="70"/>
       </w:pPr>
+      <w:proofErr w:type="gramStart"/>
       <w:r>
         <w:rPr>
           <w:sz w:val="24"/>
@@ -7439,7 +7594,11 @@
         <w:t xml:space="preserve">☐  </w:t>
       </w:r>
       <w:r>
-        <w:t xml:space="preserve">Edita -&gt; </w:t>
+        <w:t>Edita</w:t>
+      </w:r>
+      <w:proofErr w:type="gramEnd"/>
+      <w:r>
+        <w:t xml:space="preserve"> -&gt; </w:t>
       </w:r>
       <w:proofErr w:type="spellStart"/>
       <w:r>
@@ -7454,6 +7613,7 @@
       <w:pPr>
         <w:spacing w:after="70"/>
       </w:pPr>
+      <w:proofErr w:type="gramStart"/>
       <w:r>
         <w:rPr>
           <w:sz w:val="24"/>
@@ -7462,7 +7622,11 @@
         <w:t xml:space="preserve">☐  </w:t>
       </w:r>
       <w:r>
-        <w:t xml:space="preserve">NO ve Regiones en </w:t>
+        <w:t>NO</w:t>
+      </w:r>
+      <w:proofErr w:type="gramEnd"/>
+      <w:r>
+        <w:t xml:space="preserve"> ve Regiones en </w:t>
       </w:r>
       <w:proofErr w:type="spellStart"/>
       <w:r>
@@ -7485,6 +7649,7 @@
       <w:pPr>
         <w:spacing w:after="70"/>
       </w:pPr>
+      <w:proofErr w:type="gramStart"/>
       <w:r>
         <w:rPr>
           <w:sz w:val="24"/>
@@ -7493,7 +7658,11 @@
         <w:t xml:space="preserve">☐  </w:t>
       </w:r>
       <w:r>
-        <w:t xml:space="preserve">Ve todas las secciones de su </w:t>
+        <w:t>Ve</w:t>
+      </w:r>
+      <w:proofErr w:type="gramEnd"/>
+      <w:r>
+        <w:t xml:space="preserve"> todas las secciones de su </w:t>
       </w:r>
       <w:proofErr w:type="spellStart"/>
       <w:r>
@@ -7542,6 +7711,7 @@
       <w:pPr>
         <w:spacing w:after="70"/>
       </w:pPr>
+      <w:proofErr w:type="gramStart"/>
       <w:r>
         <w:rPr>
           <w:sz w:val="24"/>
@@ -7550,13 +7720,18 @@
         <w:t xml:space="preserve">☐  </w:t>
       </w:r>
       <w:r>
-        <w:t>Crea y edita miembros -&gt; ediciones van a APROBACION.</w:t>
+        <w:t>Crea</w:t>
+      </w:r>
+      <w:proofErr w:type="gramEnd"/>
+      <w:r>
+        <w:t xml:space="preserve"> y edita miembros -&gt; ediciones van a APROBACION.</w:t>
       </w:r>
     </w:p>
     <w:p>
       <w:pPr>
         <w:spacing w:after="70"/>
       </w:pPr>
+      <w:proofErr w:type="gramStart"/>
       <w:r>
         <w:rPr>
           <w:sz w:val="24"/>
@@ -7565,13 +7740,18 @@
         <w:t xml:space="preserve">☐  </w:t>
       </w:r>
       <w:r>
-        <w:t>NO ve datos sensibles en texto plano.</w:t>
+        <w:t>NO</w:t>
+      </w:r>
+      <w:proofErr w:type="gramEnd"/>
+      <w:r>
+        <w:t xml:space="preserve"> ve datos sensibles en texto plano.</w:t>
       </w:r>
     </w:p>
     <w:p>
       <w:pPr>
         <w:spacing w:after="70"/>
       </w:pPr>
+      <w:proofErr w:type="gramStart"/>
       <w:r>
         <w:rPr>
           <w:sz w:val="24"/>
@@ -7580,13 +7760,18 @@
         <w:t xml:space="preserve">☐  </w:t>
       </w:r>
       <w:r>
-        <w:t>Salud: sube documentos, NO elimina ni autoriza menores.</w:t>
+        <w:t>Salud</w:t>
+      </w:r>
+      <w:proofErr w:type="gramEnd"/>
+      <w:r>
+        <w:t>: sube documentos, NO elimina ni autoriza menores.</w:t>
       </w:r>
     </w:p>
     <w:p>
       <w:pPr>
         <w:spacing w:after="70"/>
       </w:pPr>
+      <w:proofErr w:type="gramStart"/>
       <w:r>
         <w:rPr>
           <w:sz w:val="24"/>
@@ -7595,7 +7780,11 @@
         <w:t xml:space="preserve">☐  </w:t>
       </w:r>
       <w:r>
-        <w:t>Verificar comportamiento con menores (ver discrepancia).</w:t>
+        <w:t>Verificar</w:t>
+      </w:r>
+      <w:proofErr w:type="gramEnd"/>
+      <w:r>
+        <w:t xml:space="preserve"> comportamiento con menores (ver discrepancia).</w:t>
       </w:r>
     </w:p>
     <w:p>
@@ -7637,6 +7826,7 @@
       <w:pPr>
         <w:spacing w:after="70"/>
       </w:pPr>
+      <w:proofErr w:type="gramStart"/>
       <w:r>
         <w:rPr>
           <w:sz w:val="24"/>
@@ -7645,13 +7835,18 @@
         <w:t xml:space="preserve">☐  </w:t>
       </w:r>
       <w:r>
-        <w:t>Crea/edita -&gt; APROBACION del Coordinador.</w:t>
+        <w:t>Crea</w:t>
+      </w:r>
+      <w:proofErr w:type="gramEnd"/>
+      <w:r>
+        <w:t>/edita -&gt; APROBACION del Coordinador.</w:t>
       </w:r>
     </w:p>
     <w:p>
       <w:pPr>
         <w:spacing w:after="70"/>
       </w:pPr>
+      <w:proofErr w:type="gramStart"/>
       <w:r>
         <w:rPr>
           <w:sz w:val="24"/>
@@ -7660,7 +7855,11 @@
         <w:t xml:space="preserve">☐  </w:t>
       </w:r>
       <w:r>
-        <w:t xml:space="preserve">Al editar, campos bloqueados: destacamento, </w:t>
+        <w:t>Al</w:t>
+      </w:r>
+      <w:proofErr w:type="gramEnd"/>
+      <w:r>
+        <w:t xml:space="preserve"> editar, campos bloqueados: destacamento, </w:t>
       </w:r>
       <w:proofErr w:type="spellStart"/>
       <w:r>
@@ -7675,6 +7874,7 @@
       <w:pPr>
         <w:spacing w:after="70"/>
       </w:pPr>
+      <w:proofErr w:type="gramStart"/>
       <w:r>
         <w:rPr>
           <w:sz w:val="24"/>
@@ -7684,7 +7884,11 @@
         <w:t xml:space="preserve">☐  </w:t>
       </w:r>
       <w:r>
-        <w:t xml:space="preserve">Ve todas las secciones de su </w:t>
+        <w:t>Ve</w:t>
+      </w:r>
+      <w:proofErr w:type="gramEnd"/>
+      <w:r>
+        <w:t xml:space="preserve"> todas las secciones de su </w:t>
       </w:r>
       <w:proofErr w:type="spellStart"/>
       <w:r>
@@ -7707,6 +7911,7 @@
       <w:pPr>
         <w:spacing w:after="70"/>
       </w:pPr>
+      <w:proofErr w:type="gramStart"/>
       <w:r>
         <w:rPr>
           <w:sz w:val="24"/>
@@ -7715,7 +7920,11 @@
         <w:t xml:space="preserve">☐  </w:t>
       </w:r>
       <w:r>
-        <w:t>NO ve datos sensibles en texto plano.</w:t>
+        <w:t>NO</w:t>
+      </w:r>
+      <w:proofErr w:type="gramEnd"/>
+      <w:r>
+        <w:t xml:space="preserve"> ve datos sensibles en texto plano.</w:t>
       </w:r>
     </w:p>
     <w:p>
@@ -7757,6 +7966,7 @@
       <w:pPr>
         <w:spacing w:after="70"/>
       </w:pPr>
+      <w:proofErr w:type="gramStart"/>
       <w:r>
         <w:rPr>
           <w:sz w:val="24"/>
@@ -7769,6 +7979,7 @@
         <w:t>Identico</w:t>
       </w:r>
       <w:proofErr w:type="spellEnd"/>
+      <w:proofErr w:type="gramEnd"/>
       <w:r>
         <w:t xml:space="preserve"> al </w:t>
       </w:r>
@@ -7931,12 +8142,21 @@
             <w:pPr>
               <w:spacing w:after="60"/>
             </w:pPr>
-            <w:r>
-              <w:rPr>
-                <w:sz w:val="18"/>
-                <w:szCs w:val="18"/>
-              </w:rPr>
-              <w:t xml:space="preserve">⚠  El comentario del </w:t>
+            <w:proofErr w:type="gramStart"/>
+            <w:r>
+              <w:rPr>
+                <w:sz w:val="18"/>
+                <w:szCs w:val="18"/>
+              </w:rPr>
+              <w:t>⚠  El</w:t>
+            </w:r>
+            <w:proofErr w:type="gramEnd"/>
+            <w:r>
+              <w:rPr>
+                <w:sz w:val="18"/>
+                <w:szCs w:val="18"/>
+              </w:rPr>
+              <w:t xml:space="preserve"> comentario del </w:t>
             </w:r>
             <w:proofErr w:type="spellStart"/>
             <w:r>
@@ -8007,12 +8227,21 @@
             <w:pPr>
               <w:spacing w:after="60"/>
             </w:pPr>
-            <w:r>
-              <w:rPr>
-                <w:sz w:val="18"/>
-                <w:szCs w:val="18"/>
-              </w:rPr>
-              <w:t xml:space="preserve">⚠  En la practica el </w:t>
+            <w:proofErr w:type="gramStart"/>
+            <w:r>
+              <w:rPr>
+                <w:sz w:val="18"/>
+                <w:szCs w:val="18"/>
+              </w:rPr>
+              <w:t>⚠  En</w:t>
+            </w:r>
+            <w:proofErr w:type="gramEnd"/>
+            <w:r>
+              <w:rPr>
+                <w:sz w:val="18"/>
+                <w:szCs w:val="18"/>
+              </w:rPr>
+              <w:t xml:space="preserve"> la practica el </w:t>
             </w:r>
             <w:proofErr w:type="spellStart"/>
             <w:r>
@@ -8117,12 +8346,21 @@
             <w:pPr>
               <w:spacing w:after="60"/>
             </w:pPr>
-            <w:r>
-              <w:rPr>
-                <w:sz w:val="18"/>
-                <w:szCs w:val="18"/>
-              </w:rPr>
-              <w:t>⚠  El bloqueo (destacamento/</w:t>
+            <w:proofErr w:type="gramStart"/>
+            <w:r>
+              <w:rPr>
+                <w:sz w:val="18"/>
+                <w:szCs w:val="18"/>
+              </w:rPr>
+              <w:t>⚠  El</w:t>
+            </w:r>
+            <w:proofErr w:type="gramEnd"/>
+            <w:r>
+              <w:rPr>
+                <w:sz w:val="18"/>
+                <w:szCs w:val="18"/>
+              </w:rPr>
+              <w:t xml:space="preserve"> bloqueo (destacamento/</w:t>
             </w:r>
             <w:proofErr w:type="spellStart"/>
             <w:r>
@@ -8177,12 +8415,21 @@
             <w:pPr>
               <w:spacing w:after="60"/>
             </w:pPr>
-            <w:r>
-              <w:rPr>
-                <w:sz w:val="18"/>
-                <w:szCs w:val="18"/>
-              </w:rPr>
-              <w:t xml:space="preserve">⚠  Pastor, Consejo y </w:t>
+            <w:proofErr w:type="gramStart"/>
+            <w:r>
+              <w:rPr>
+                <w:sz w:val="18"/>
+                <w:szCs w:val="18"/>
+              </w:rPr>
+              <w:t>⚠  Pastor</w:t>
+            </w:r>
+            <w:proofErr w:type="gramEnd"/>
+            <w:r>
+              <w:rPr>
+                <w:sz w:val="18"/>
+                <w:szCs w:val="18"/>
+              </w:rPr>
+              <w:t xml:space="preserve">, Consejo y </w:t>
             </w:r>
             <w:proofErr w:type="spellStart"/>
             <w:r>
@@ -8281,7 +8528,7 @@
 </file>
 
 <file path=word/numbering.xml><?xml version="1.0" encoding="utf-8"?>
-<w:numbering xmlns:wpc="http://schemas.microsoft.com/office/word/2010/wordprocessingCanvas" xmlns:cx="http://schemas.microsoft.com/office/drawing/2014/chartex" xmlns:cx1="http://schemas.microsoft.com/office/drawing/2015/9/8/chartex" xmlns:cx2="http://schemas.microsoft.com/office/drawing/2015/10/21/chartex" xmlns:cx3="http://schemas.microsoft.com/office/drawing/2016/5/9/chartex" xmlns:cx4="http://schemas.microsoft.com/office/drawing/2016/5/10/chartex" xmlns:cx5="http://schemas.microsoft.com/office/drawing/2016/5/11/chartex" xmlns:cx6="http://schemas.microsoft.com/office/drawing/2016/5/12/chartex" xmlns:cx7="http://schemas.microsoft.com/office/drawing/2016/5/13/chartex" xmlns:cx8="http://schemas.microsoft.com/office/drawing/2016/5/14/chartex" xmlns:mc="http://schemas.openxmlformats.org/markup-compatibility/2006" xmlns:aink="http://schemas.microsoft.com/office/drawing/2016/ink" xmlns:am3d="http://schemas.microsoft.com/office/drawing/2017/model3d" xmlns:o="urn:schemas-microsoft-com:office:office" xmlns:r="http://schemas.openxmlformats.org/officeDocument/2006/relationships" xmlns:m="http://schemas.openxmlformats.org/officeDocument/2006/math" xmlns:v="urn:schemas-microsoft-com:vml" xmlns:wp14="http://schemas.microsoft.com/office/word/2010/wordprocessingDrawing" xmlns:wp="http://schemas.openxmlformats.org/drawingml/2006/wordprocessingDrawing" xmlns:w10="urn:schemas-microsoft-com:office:word" xmlns:w="http://schemas.openxmlformats.org/wordprocessingml/2006/main" xmlns:w14="http://schemas.microsoft.com/office/word/2010/wordml" xmlns:w15="http://schemas.microsoft.com/office/word/2012/wordml" xmlns:w16cex="http://schemas.microsoft.com/office/word/2018/wordml/cex" xmlns:w16cid="http://schemas.microsoft.com/office/word/2016/wordml/cid" xmlns:w16="http://schemas.microsoft.com/office/word/2018/wordml" xmlns:w16sdtdh="http://schemas.microsoft.com/office/word/2020/wordml/sdtdatahash" xmlns:w16se="http://schemas.microsoft.com/office/word/2015/wordml/symex" xmlns:wpg="http://schemas.microsoft.com/office/word/2010/wordprocessingGroup" xmlns:wpi="http://schemas.microsoft.com/office/word/2010/wordprocessingInk" xmlns:wne="http://schemas.microsoft.com/office/word/2006/wordml" xmlns:wps="http://schemas.microsoft.com/office/word/2010/wordprocessingShape" mc:Ignorable="w14 w15 w16se w16cid w16 w16cex w16sdtdh wp14">
+<w:numbering xmlns:wpc="http://schemas.microsoft.com/office/word/2010/wordprocessingCanvas" xmlns:cx="http://schemas.microsoft.com/office/drawing/2014/chartex" xmlns:cx1="http://schemas.microsoft.com/office/drawing/2015/9/8/chartex" xmlns:cx2="http://schemas.microsoft.com/office/drawing/2015/10/21/chartex" xmlns:cx3="http://schemas.microsoft.com/office/drawing/2016/5/9/chartex" xmlns:cx4="http://schemas.microsoft.com/office/drawing/2016/5/10/chartex" xmlns:cx5="http://schemas.microsoft.com/office/drawing/2016/5/11/chartex" xmlns:cx6="http://schemas.microsoft.com/office/drawing/2016/5/12/chartex" xmlns:cx7="http://schemas.microsoft.com/office/drawing/2016/5/13/chartex" xmlns:cx8="http://schemas.microsoft.com/office/drawing/2016/5/14/chartex" xmlns:mc="http://schemas.openxmlformats.org/markup-compatibility/2006" xmlns:aink="http://schemas.microsoft.com/office/drawing/2016/ink" xmlns:am3d="http://schemas.microsoft.com/office/drawing/2017/model3d" xmlns:o="urn:schemas-microsoft-com:office:office" xmlns:oel="http://schemas.microsoft.com/office/2019/extlst" xmlns:r="http://schemas.openxmlformats.org/officeDocument/2006/relationships" xmlns:m="http://schemas.openxmlformats.org/officeDocument/2006/math" xmlns:v="urn:schemas-microsoft-com:vml" xmlns:wp14="http://schemas.microsoft.com/office/word/2010/wordprocessingDrawing" xmlns:wp="http://schemas.openxmlformats.org/drawingml/2006/wordprocessingDrawing" xmlns:w10="urn:schemas-microsoft-com:office:word" xmlns:w="http://schemas.openxmlformats.org/wordprocessingml/2006/main" xmlns:w14="http://schemas.microsoft.com/office/word/2010/wordml" xmlns:w15="http://schemas.microsoft.com/office/word/2012/wordml" xmlns:w16cex="http://schemas.microsoft.com/office/word/2018/wordml/cex" xmlns:w16cid="http://schemas.microsoft.com/office/word/2016/wordml/cid" xmlns:w16="http://schemas.microsoft.com/office/word/2018/wordml" xmlns:w16sdtdh="http://schemas.microsoft.com/office/word/2020/wordml/sdtdatahash" xmlns:w16se="http://schemas.microsoft.com/office/word/2015/wordml/symex" xmlns:wpg="http://schemas.microsoft.com/office/word/2010/wordprocessingGroup" xmlns:wpi="http://schemas.microsoft.com/office/word/2010/wordprocessingInk" xmlns:wne="http://schemas.microsoft.com/office/word/2006/wordml" xmlns:wps="http://schemas.microsoft.com/office/word/2010/wordprocessingShape" mc:Ignorable="w14 w15 w16se w16cid w16 w16cex w16sdtdh wp14">
   <w:abstractNum w:abstractNumId="0" w15:restartNumberingAfterBreak="0">
     <w:nsid w:val="42631B89"/>
     <w:multiLevelType w:val="hybridMultilevel"/>
@@ -8368,7 +8615,7 @@
       </w:pPr>
     </w:lvl>
   </w:abstractNum>
-  <w:num w:numId="1">
+  <w:num w:numId="1" w16cid:durableId="360132834">
     <w:abstractNumId w:val="0"/>
     <w:lvlOverride w:ilvl="0">
       <w:startOverride w:val="1"/>

</xml_diff>

<commit_message>
feat: reforzar red social y acceso por roles
</commit_message>
<xml_diff>
--- a/docs/qa-roles/QA-Roles-1-Destacamento.docx
+++ b/docs/qa-roles/QA-Roles-1-Destacamento.docx
@@ -923,11 +923,15 @@
           <w:p>
             <w:pPr>
               <w:jc w:val="center"/>
-            </w:pPr>
-            <w:r>
-              <w:rPr>
-                <w:sz w:val="18"/>
-                <w:szCs w:val="18"/>
+              <w:rPr>
+                <w:highlight w:val="yellow"/>
+              </w:rPr>
+            </w:pPr>
+            <w:r>
+              <w:rPr>
+                <w:sz w:val="18"/>
+                <w:szCs w:val="18"/>
+                <w:highlight w:val="yellow"/>
               </w:rPr>
               <w:t>SI</w:t>
             </w:r>
@@ -946,11 +950,15 @@
           <w:p>
             <w:pPr>
               <w:jc w:val="center"/>
-            </w:pPr>
-            <w:r>
-              <w:rPr>
-                <w:sz w:val="18"/>
-                <w:szCs w:val="18"/>
+              <w:rPr>
+                <w:highlight w:val="yellow"/>
+              </w:rPr>
+            </w:pPr>
+            <w:r>
+              <w:rPr>
+                <w:sz w:val="18"/>
+                <w:szCs w:val="18"/>
+                <w:highlight w:val="yellow"/>
               </w:rPr>
               <w:t>SI</w:t>
             </w:r>
@@ -969,11 +977,15 @@
           <w:p>
             <w:pPr>
               <w:jc w:val="center"/>
-            </w:pPr>
-            <w:r>
-              <w:rPr>
-                <w:sz w:val="18"/>
-                <w:szCs w:val="18"/>
+              <w:rPr>
+                <w:highlight w:val="yellow"/>
+              </w:rPr>
+            </w:pPr>
+            <w:r>
+              <w:rPr>
+                <w:sz w:val="18"/>
+                <w:szCs w:val="18"/>
+                <w:highlight w:val="yellow"/>
               </w:rPr>
               <w:t>SI</w:t>
             </w:r>
@@ -1130,11 +1142,15 @@
           <w:p>
             <w:pPr>
               <w:jc w:val="center"/>
-            </w:pPr>
-            <w:r>
-              <w:rPr>
-                <w:sz w:val="18"/>
-                <w:szCs w:val="18"/>
+              <w:rPr>
+                <w:highlight w:val="yellow"/>
+              </w:rPr>
+            </w:pPr>
+            <w:r>
+              <w:rPr>
+                <w:sz w:val="18"/>
+                <w:szCs w:val="18"/>
+                <w:highlight w:val="yellow"/>
               </w:rPr>
               <w:t>SI</w:t>
             </w:r>
@@ -1154,11 +1170,15 @@
           <w:p>
             <w:pPr>
               <w:jc w:val="center"/>
-            </w:pPr>
-            <w:r>
-              <w:rPr>
-                <w:sz w:val="18"/>
-                <w:szCs w:val="18"/>
+              <w:rPr>
+                <w:highlight w:val="yellow"/>
+              </w:rPr>
+            </w:pPr>
+            <w:r>
+              <w:rPr>
+                <w:sz w:val="18"/>
+                <w:szCs w:val="18"/>
+                <w:highlight w:val="yellow"/>
               </w:rPr>
               <w:t>SI</w:t>
             </w:r>
@@ -1178,11 +1198,15 @@
           <w:p>
             <w:pPr>
               <w:jc w:val="center"/>
-            </w:pPr>
-            <w:r>
-              <w:rPr>
-                <w:sz w:val="18"/>
-                <w:szCs w:val="18"/>
+              <w:rPr>
+                <w:highlight w:val="yellow"/>
+              </w:rPr>
+            </w:pPr>
+            <w:r>
+              <w:rPr>
+                <w:sz w:val="18"/>
+                <w:szCs w:val="18"/>
+                <w:highlight w:val="yellow"/>
               </w:rPr>
               <w:t>SI</w:t>
             </w:r>
@@ -1331,13 +1355,17 @@
           <w:p>
             <w:pPr>
               <w:jc w:val="center"/>
-            </w:pPr>
-            <w:r>
-              <w:rPr>
-                <w:sz w:val="18"/>
-                <w:szCs w:val="18"/>
-              </w:rPr>
-              <w:t>SI*</w:t>
+              <w:rPr>
+                <w:highlight w:val="yellow"/>
+              </w:rPr>
+            </w:pPr>
+            <w:r>
+              <w:rPr>
+                <w:sz w:val="18"/>
+                <w:szCs w:val="18"/>
+                <w:highlight w:val="yellow"/>
+              </w:rPr>
+              <w:t>SI</w:t>
             </w:r>
           </w:p>
         </w:tc>
@@ -1354,11 +1382,15 @@
           <w:p>
             <w:pPr>
               <w:jc w:val="center"/>
-            </w:pPr>
-            <w:r>
-              <w:rPr>
-                <w:sz w:val="18"/>
-                <w:szCs w:val="18"/>
+              <w:rPr>
+                <w:highlight w:val="yellow"/>
+              </w:rPr>
+            </w:pPr>
+            <w:r>
+              <w:rPr>
+                <w:sz w:val="18"/>
+                <w:szCs w:val="18"/>
+                <w:highlight w:val="yellow"/>
               </w:rPr>
               <w:t>SI</w:t>
             </w:r>
@@ -1377,11 +1409,15 @@
           <w:p>
             <w:pPr>
               <w:jc w:val="center"/>
-            </w:pPr>
-            <w:r>
-              <w:rPr>
-                <w:sz w:val="18"/>
-                <w:szCs w:val="18"/>
+              <w:rPr>
+                <w:highlight w:val="yellow"/>
+              </w:rPr>
+            </w:pPr>
+            <w:r>
+              <w:rPr>
+                <w:sz w:val="18"/>
+                <w:szCs w:val="18"/>
+                <w:highlight w:val="yellow"/>
               </w:rPr>
               <w:t>SI</w:t>
             </w:r>
@@ -2161,19 +2197,14 @@
               <w:rPr>
                 <w:sz w:val="18"/>
                 <w:szCs w:val="18"/>
-              </w:rPr>
-            </w:pPr>
-            <w:r>
-              <w:rPr>
-                <w:sz w:val="18"/>
-                <w:szCs w:val="18"/>
-              </w:rPr>
-              <w:t>X|</w:t>
-            </w:r>
-            <w:r>
-              <w:rPr>
-                <w:sz w:val="18"/>
-                <w:szCs w:val="18"/>
+                <w:highlight w:val="yellow"/>
+              </w:rPr>
+            </w:pPr>
+            <w:r>
+              <w:rPr>
+                <w:sz w:val="18"/>
+                <w:szCs w:val="18"/>
+                <w:highlight w:val="yellow"/>
               </w:rPr>
               <w:t>NO</w:t>
             </w:r>
@@ -2195,12 +2226,14 @@
               <w:rPr>
                 <w:sz w:val="18"/>
                 <w:szCs w:val="18"/>
-              </w:rPr>
-            </w:pPr>
-            <w:r>
-              <w:rPr>
-                <w:sz w:val="18"/>
-                <w:szCs w:val="18"/>
+                <w:highlight w:val="yellow"/>
+              </w:rPr>
+            </w:pPr>
+            <w:r>
+              <w:rPr>
+                <w:sz w:val="18"/>
+                <w:szCs w:val="18"/>
+                <w:highlight w:val="yellow"/>
               </w:rPr>
               <w:t>NO</w:t>
             </w:r>
@@ -2222,12 +2255,14 @@
               <w:rPr>
                 <w:sz w:val="18"/>
                 <w:szCs w:val="18"/>
-              </w:rPr>
-            </w:pPr>
-            <w:r>
-              <w:rPr>
-                <w:sz w:val="18"/>
-                <w:szCs w:val="18"/>
+                <w:highlight w:val="yellow"/>
+              </w:rPr>
+            </w:pPr>
+            <w:r>
+              <w:rPr>
+                <w:sz w:val="18"/>
+                <w:szCs w:val="18"/>
+                <w:highlight w:val="yellow"/>
               </w:rPr>
               <w:t>NO</w:t>
             </w:r>
@@ -2559,11 +2594,15 @@
           <w:p>
             <w:pPr>
               <w:jc w:val="center"/>
-            </w:pPr>
-            <w:r>
-              <w:rPr>
-                <w:sz w:val="18"/>
-                <w:szCs w:val="18"/>
+              <w:rPr>
+                <w:highlight w:val="yellow"/>
+              </w:rPr>
+            </w:pPr>
+            <w:r>
+              <w:rPr>
+                <w:sz w:val="18"/>
+                <w:szCs w:val="18"/>
+                <w:highlight w:val="yellow"/>
               </w:rPr>
               <w:t>SI</w:t>
             </w:r>
@@ -2582,11 +2621,15 @@
           <w:p>
             <w:pPr>
               <w:jc w:val="center"/>
-            </w:pPr>
-            <w:r>
-              <w:rPr>
-                <w:sz w:val="18"/>
-                <w:szCs w:val="18"/>
+              <w:rPr>
+                <w:highlight w:val="yellow"/>
+              </w:rPr>
+            </w:pPr>
+            <w:r>
+              <w:rPr>
+                <w:sz w:val="18"/>
+                <w:szCs w:val="18"/>
+                <w:highlight w:val="yellow"/>
               </w:rPr>
               <w:t>SI</w:t>
             </w:r>
@@ -2605,11 +2648,15 @@
           <w:p>
             <w:pPr>
               <w:jc w:val="center"/>
-            </w:pPr>
-            <w:r>
-              <w:rPr>
-                <w:sz w:val="18"/>
-                <w:szCs w:val="18"/>
+              <w:rPr>
+                <w:highlight w:val="yellow"/>
+              </w:rPr>
+            </w:pPr>
+            <w:r>
+              <w:rPr>
+                <w:sz w:val="18"/>
+                <w:szCs w:val="18"/>
+                <w:highlight w:val="yellow"/>
               </w:rPr>
               <w:t>SI</w:t>
             </w:r>
@@ -2766,8 +2813,32 @@
               <w:rPr>
                 <w:sz w:val="18"/>
                 <w:szCs w:val="18"/>
-              </w:rPr>
-              <w:t>SI</w:t>
+                <w:highlight w:val="yellow"/>
+              </w:rPr>
+              <w:t>SI</w:t>
+            </w:r>
+            <w:r>
+              <w:rPr>
+                <w:sz w:val="18"/>
+                <w:szCs w:val="18"/>
+              </w:rPr>
+              <w:t xml:space="preserve"> (debería </w:t>
+            </w:r>
+            <w:proofErr w:type="gramStart"/>
+            <w:r>
+              <w:rPr>
+                <w:sz w:val="18"/>
+                <w:szCs w:val="18"/>
+              </w:rPr>
+              <w:t>subir</w:t>
+            </w:r>
+            <w:proofErr w:type="gramEnd"/>
+            <w:r>
+              <w:rPr>
+                <w:sz w:val="18"/>
+                <w:szCs w:val="18"/>
+              </w:rPr>
+              <w:t xml:space="preserve"> pero no ver)</w:t>
             </w:r>
           </w:p>
         </w:tc>
@@ -2793,8 +2864,32 @@
               <w:rPr>
                 <w:sz w:val="18"/>
                 <w:szCs w:val="18"/>
-              </w:rPr>
-              <w:t>SI</w:t>
+                <w:highlight w:val="yellow"/>
+              </w:rPr>
+              <w:t>SI</w:t>
+            </w:r>
+            <w:r>
+              <w:rPr>
+                <w:sz w:val="18"/>
+                <w:szCs w:val="18"/>
+              </w:rPr>
+              <w:t xml:space="preserve"> (debería </w:t>
+            </w:r>
+            <w:proofErr w:type="gramStart"/>
+            <w:r>
+              <w:rPr>
+                <w:sz w:val="18"/>
+                <w:szCs w:val="18"/>
+              </w:rPr>
+              <w:t>subir</w:t>
+            </w:r>
+            <w:proofErr w:type="gramEnd"/>
+            <w:r>
+              <w:rPr>
+                <w:sz w:val="18"/>
+                <w:szCs w:val="18"/>
+              </w:rPr>
+              <w:t xml:space="preserve"> pero no ver)</w:t>
             </w:r>
           </w:p>
         </w:tc>
@@ -2817,8 +2912,32 @@
               <w:rPr>
                 <w:sz w:val="18"/>
                 <w:szCs w:val="18"/>
-              </w:rPr>
-              <w:t>SI</w:t>
+                <w:highlight w:val="yellow"/>
+              </w:rPr>
+              <w:t>SI</w:t>
+            </w:r>
+            <w:r>
+              <w:rPr>
+                <w:sz w:val="18"/>
+                <w:szCs w:val="18"/>
+              </w:rPr>
+              <w:t xml:space="preserve"> (debería </w:t>
+            </w:r>
+            <w:proofErr w:type="gramStart"/>
+            <w:r>
+              <w:rPr>
+                <w:sz w:val="18"/>
+                <w:szCs w:val="18"/>
+              </w:rPr>
+              <w:t>subir</w:t>
+            </w:r>
+            <w:proofErr w:type="gramEnd"/>
+            <w:r>
+              <w:rPr>
+                <w:sz w:val="18"/>
+                <w:szCs w:val="18"/>
+              </w:rPr>
+              <w:t xml:space="preserve"> pero no ver) </w:t>
             </w:r>
           </w:p>
         </w:tc>
@@ -3128,11 +3247,15 @@
           <w:p>
             <w:pPr>
               <w:jc w:val="center"/>
-            </w:pPr>
-            <w:r>
-              <w:rPr>
-                <w:sz w:val="18"/>
-                <w:szCs w:val="18"/>
+              <w:rPr>
+                <w:highlight w:val="yellow"/>
+              </w:rPr>
+            </w:pPr>
+            <w:r>
+              <w:rPr>
+                <w:sz w:val="18"/>
+                <w:szCs w:val="18"/>
+                <w:highlight w:val="yellow"/>
               </w:rPr>
               <w:t>SI</w:t>
             </w:r>
@@ -3152,11 +3275,15 @@
           <w:p>
             <w:pPr>
               <w:jc w:val="center"/>
-            </w:pPr>
-            <w:r>
-              <w:rPr>
-                <w:sz w:val="18"/>
-                <w:szCs w:val="18"/>
+              <w:rPr>
+                <w:highlight w:val="yellow"/>
+              </w:rPr>
+            </w:pPr>
+            <w:r>
+              <w:rPr>
+                <w:sz w:val="18"/>
+                <w:szCs w:val="18"/>
+                <w:highlight w:val="yellow"/>
               </w:rPr>
               <w:t>SI</w:t>
             </w:r>
@@ -3176,11 +3303,15 @@
           <w:p>
             <w:pPr>
               <w:jc w:val="center"/>
-            </w:pPr>
-            <w:r>
-              <w:rPr>
-                <w:sz w:val="18"/>
-                <w:szCs w:val="18"/>
+              <w:rPr>
+                <w:highlight w:val="yellow"/>
+              </w:rPr>
+            </w:pPr>
+            <w:r>
+              <w:rPr>
+                <w:sz w:val="18"/>
+                <w:szCs w:val="18"/>
+                <w:highlight w:val="yellow"/>
               </w:rPr>
               <w:t>SI</w:t>
             </w:r>
@@ -3200,11 +3331,15 @@
           <w:p>
             <w:pPr>
               <w:jc w:val="center"/>
-            </w:pPr>
-            <w:r>
-              <w:rPr>
-                <w:sz w:val="18"/>
-                <w:szCs w:val="18"/>
+              <w:rPr>
+                <w:highlight w:val="yellow"/>
+              </w:rPr>
+            </w:pPr>
+            <w:r>
+              <w:rPr>
+                <w:sz w:val="18"/>
+                <w:szCs w:val="18"/>
+                <w:highlight w:val="yellow"/>
               </w:rPr>
               <w:t>SI</w:t>
             </w:r>
@@ -3551,11 +3686,7 @@
               <w:jc w:val="center"/>
             </w:pPr>
             <w:r>
-              <w:rPr>
-                <w:sz w:val="18"/>
-                <w:szCs w:val="18"/>
-              </w:rPr>
-              <w:t>SI</w:t>
+              <w:t>NO</w:t>
             </w:r>
           </w:p>
         </w:tc>
@@ -3578,6 +3709,7 @@
               <w:rPr>
                 <w:sz w:val="18"/>
                 <w:szCs w:val="18"/>
+                <w:highlight w:val="yellow"/>
               </w:rPr>
               <w:t>SI</w:t>
             </w:r>
@@ -3603,7 +3735,7 @@
                 <w:sz w:val="18"/>
                 <w:szCs w:val="18"/>
               </w:rPr>
-              <w:t>SI</w:t>
+              <w:t>NO</w:t>
             </w:r>
           </w:p>
         </w:tc>
@@ -4132,8 +4264,9 @@
               <w:rPr>
                 <w:sz w:val="18"/>
                 <w:szCs w:val="18"/>
-              </w:rPr>
-              <w:t>SI</w:t>
+                <w:highlight w:val="yellow"/>
+              </w:rPr>
+              <w:t>SI (solo ver)</w:t>
             </w:r>
           </w:p>
         </w:tc>
@@ -4150,11 +4283,15 @@
           <w:p>
             <w:pPr>
               <w:jc w:val="center"/>
-            </w:pPr>
-            <w:r>
-              <w:rPr>
-                <w:sz w:val="18"/>
-                <w:szCs w:val="18"/>
+              <w:rPr>
+                <w:highlight w:val="yellow"/>
+              </w:rPr>
+            </w:pPr>
+            <w:r>
+              <w:rPr>
+                <w:sz w:val="18"/>
+                <w:szCs w:val="18"/>
+                <w:highlight w:val="yellow"/>
               </w:rPr>
               <w:t>SI</w:t>
             </w:r>
@@ -4173,11 +4310,15 @@
           <w:p>
             <w:pPr>
               <w:jc w:val="center"/>
-            </w:pPr>
-            <w:r>
-              <w:rPr>
-                <w:sz w:val="18"/>
-                <w:szCs w:val="18"/>
+              <w:rPr>
+                <w:highlight w:val="yellow"/>
+              </w:rPr>
+            </w:pPr>
+            <w:r>
+              <w:rPr>
+                <w:sz w:val="18"/>
+                <w:szCs w:val="18"/>
+                <w:highlight w:val="yellow"/>
               </w:rPr>
               <w:t>SI</w:t>
             </w:r>
@@ -5894,11 +6035,15 @@
           <w:p>
             <w:pPr>
               <w:jc w:val="center"/>
-            </w:pPr>
-            <w:r>
-              <w:rPr>
-                <w:sz w:val="18"/>
-                <w:szCs w:val="18"/>
+              <w:rPr>
+                <w:highlight w:val="yellow"/>
+              </w:rPr>
+            </w:pPr>
+            <w:r>
+              <w:rPr>
+                <w:sz w:val="18"/>
+                <w:szCs w:val="18"/>
+                <w:highlight w:val="yellow"/>
               </w:rPr>
               <w:t>SI</w:t>
             </w:r>
@@ -5918,11 +6063,15 @@
           <w:p>
             <w:pPr>
               <w:jc w:val="center"/>
-            </w:pPr>
-            <w:r>
-              <w:rPr>
-                <w:sz w:val="18"/>
-                <w:szCs w:val="18"/>
+              <w:rPr>
+                <w:highlight w:val="yellow"/>
+              </w:rPr>
+            </w:pPr>
+            <w:r>
+              <w:rPr>
+                <w:sz w:val="18"/>
+                <w:szCs w:val="18"/>
+                <w:highlight w:val="yellow"/>
               </w:rPr>
               <w:t>SI</w:t>
             </w:r>
@@ -5942,11 +6091,15 @@
           <w:p>
             <w:pPr>
               <w:jc w:val="center"/>
-            </w:pPr>
-            <w:r>
-              <w:rPr>
-                <w:sz w:val="18"/>
-                <w:szCs w:val="18"/>
+              <w:rPr>
+                <w:highlight w:val="yellow"/>
+              </w:rPr>
+            </w:pPr>
+            <w:r>
+              <w:rPr>
+                <w:sz w:val="18"/>
+                <w:szCs w:val="18"/>
+                <w:highlight w:val="yellow"/>
               </w:rPr>
               <w:t>SI</w:t>
             </w:r>

</xml_diff>